<commit_message>
docs: standardize collaboration on main
</commit_message>
<xml_diff>
--- a/docs/NanoLoop_Agent_RAG与检索功能开发指南_v1.0.docx
+++ b/docs/NanoLoop_Agent_RAG与检索功能开发指南_v1.0.docx
@@ -45,7 +45,7 @@
           <w:rFonts w:ascii="Arial" w:hAnsi="Arial" w:eastAsia="Arial Unicode MS" w:cs="Arial"/>
           <w:lang w:val="zh-CN" w:eastAsia="zh-CN"/>
         </w:rPr>
-        <w:t xml:space="preserve">基于现有</w:t>
+        <w:t xml:space="preserve">基于</w:t>
       </w:r>
       <w:r>
         <w:rPr>
@@ -60,7 +60,7 @@
           <w:rFonts w:ascii="Arial" w:hAnsi="Arial" w:eastAsia="Arial Unicode MS" w:cs="Arial"/>
           <w:lang w:val="zh-CN" w:eastAsia="zh-CN"/>
         </w:rPr>
-        <w:t xml:space="preserve">yukun</w:t>
+        <w:t xml:space="preserve">main</w:t>
       </w:r>
       <w:r>
         <w:rPr>
@@ -74,7 +74,7 @@
           <w:rFonts w:ascii="Arial" w:hAnsi="Arial" w:eastAsia="Arial Unicode MS" w:cs="Arial"/>
           <w:lang w:val="zh-CN" w:eastAsia="zh-CN"/>
         </w:rPr>
-        <w:t xml:space="preserve">分支的架构决策、真实资产接入、质量评测与团队任务书</w:t>
+        <w:t xml:space="preserve">主线的架构决策、真实资产接入、质量评测与团队任务书</w:t>
       </w:r>
     </w:p>
     <w:tbl>
@@ -256,7 +256,7 @@
                 <w:sz w:val="17"/>
                 <w:lang w:val="zh-CN" w:eastAsia="zh-CN"/>
               </w:rPr>
-              <w:t xml:space="preserve">代码事实基线</w:t>
+              <w:t xml:space="preserve">原始代码事实基线</w:t>
             </w:r>
           </w:p>
         </w:tc>
@@ -286,6 +286,14 @@
                 <w:lang w:val="zh-CN" w:eastAsia="zh-CN"/>
               </w:rPr>
               <w:t xml:space="preserve">yukun@e93d44ffb559d1723a7b250e4abdba6d2ceb5ca2</w:t>
+            </w:r>
+            <w:r>
+              <w:rPr>
+                <w:rFonts w:ascii="Arial" w:hAnsi="Arial" w:eastAsia="Arial Unicode MS" w:cs="Arial"/>
+                <w:sz w:val="17"/>
+                <w:lang w:val="zh-CN" w:eastAsia="zh-CN"/>
+              </w:rPr>
+              <w:t xml:space="preserve">（历史证据）</w:t>
             </w:r>
           </w:p>
         </w:tc>
@@ -318,7 +326,7 @@
                 <w:sz w:val="17"/>
                 <w:lang w:val="zh-CN" w:eastAsia="zh-CN"/>
               </w:rPr>
-              <w:t xml:space="preserve">适用对象</w:t>
+              <w:t xml:space="preserve">分支策略更新</w:t>
             </w:r>
           </w:p>
         </w:tc>
@@ -342,11 +350,78 @@
             </w:pPr>
             <w:r>
               <w:rPr>
-                <w:rFonts w:ascii="Arial" w:hAnsi="Arial" w:eastAsia="Arial Unicode MS" w:cs="Arial"/>
-                <w:sz w:val="17"/>
-                <w:lang w:val="zh-CN" w:eastAsia="zh-CN"/>
-              </w:rPr>
-              <w:t xml:space="preserve">项目负责人、开发者 D/F、语料与评测协作者，以及需要理解 RAG 边界的全体开发者</w:t>
+                <w:rStyle w:val="VerbatimChar"/>
+                <w:rFonts w:ascii="Arial" w:hAnsi="Arial" w:eastAsia="Arial Unicode MS" w:cs="Arial"/>
+                <w:sz w:val="17"/>
+                <w:lang w:val="zh-CN" w:eastAsia="zh-CN"/>
+              </w:rPr>
+              <w:t xml:space="preserve">2026-07-23</w:t>
+            </w:r>
+            <w:r>
+              <w:rPr>
+                <w:rFonts w:ascii="Arial" w:hAnsi="Arial" w:eastAsia="Arial Unicode MS" w:cs="Arial"/>
+                <w:sz w:val="17"/>
+                <w:lang w:val="zh-CN" w:eastAsia="zh-CN"/>
+              </w:rPr>
+              <w:t xml:space="preserve"> </w:t>
+            </w:r>
+            <w:r>
+              <w:rPr>
+                <w:rFonts w:ascii="Arial" w:hAnsi="Arial" w:eastAsia="Arial Unicode MS" w:cs="Arial"/>
+                <w:sz w:val="17"/>
+                <w:lang w:val="zh-CN" w:eastAsia="zh-CN"/>
+              </w:rPr>
+              <w:t xml:space="preserve">起以最新全绿</w:t>
+            </w:r>
+            <w:r>
+              <w:rPr>
+                <w:rFonts w:ascii="Arial" w:hAnsi="Arial" w:eastAsia="Arial Unicode MS" w:cs="Arial"/>
+                <w:sz w:val="17"/>
+                <w:lang w:val="zh-CN" w:eastAsia="zh-CN"/>
+              </w:rPr>
+              <w:t xml:space="preserve"> </w:t>
+            </w:r>
+            <w:r>
+              <w:rPr>
+                <w:rStyle w:val="VerbatimChar"/>
+                <w:rFonts w:ascii="Arial" w:hAnsi="Arial" w:eastAsia="Arial Unicode MS" w:cs="Arial"/>
+                <w:sz w:val="17"/>
+                <w:lang w:val="zh-CN" w:eastAsia="zh-CN"/>
+              </w:rPr>
+              <w:t xml:space="preserve">origin/main</w:t>
+            </w:r>
+            <w:r>
+              <w:rPr>
+                <w:rFonts w:ascii="Arial" w:hAnsi="Arial" w:eastAsia="Arial Unicode MS" w:cs="Arial"/>
+                <w:sz w:val="17"/>
+                <w:lang w:val="zh-CN" w:eastAsia="zh-CN"/>
+              </w:rPr>
+              <w:t xml:space="preserve"> </w:t>
+            </w:r>
+            <w:r>
+              <w:rPr>
+                <w:rFonts w:ascii="Arial" w:hAnsi="Arial" w:eastAsia="Arial Unicode MS" w:cs="Arial"/>
+                <w:sz w:val="17"/>
+                <w:lang w:val="zh-CN" w:eastAsia="zh-CN"/>
+              </w:rPr>
+              <w:t xml:space="preserve">为唯一长期基线；五人集成快照为</w:t>
+            </w:r>
+            <w:r>
+              <w:rPr>
+                <w:rFonts w:ascii="Arial" w:hAnsi="Arial" w:eastAsia="Arial Unicode MS" w:cs="Arial"/>
+                <w:sz w:val="17"/>
+                <w:lang w:val="zh-CN" w:eastAsia="zh-CN"/>
+              </w:rPr>
+              <w:t xml:space="preserve"> </w:t>
+            </w:r>
+            <w:r>
+              <w:rPr>
+                <w:rStyle w:val="VerbatimChar"/>
+                <w:rFonts w:ascii="Arial" w:hAnsi="Arial" w:eastAsia="Arial Unicode MS" w:cs="Arial"/>
+                <w:sz w:val="17"/>
+                <w:lang w:val="zh-CN" w:eastAsia="zh-CN"/>
+              </w:rPr>
+              <w:t xml:space="preserve">bfb48d4</w:t>
             </w:r>
           </w:p>
         </w:tc>
@@ -379,7 +454,7 @@
                 <w:sz w:val="17"/>
                 <w:lang w:val="zh-CN" w:eastAsia="zh-CN"/>
               </w:rPr>
-              <w:t xml:space="preserve">交付目标</w:t>
+              <w:t xml:space="preserve">适用对象</w:t>
             </w:r>
           </w:p>
         </w:tc>
@@ -407,7 +482,7 @@
                 <w:sz w:val="17"/>
                 <w:lang w:val="zh-CN" w:eastAsia="zh-CN"/>
               </w:rPr>
-              <w:t xml:space="preserve">用 5～10 份许可明确的语料和一个固定 embedding 资产，跑通可重启、可评测、可引用的真实混合检索闭环</w:t>
+              <w:t xml:space="preserve">项目负责人、开发者 D/F、语料与评测协作者，以及需要理解 RAG 边界的全体开发者</w:t>
             </w:r>
           </w:p>
         </w:tc>
@@ -440,6 +515,67 @@
                 <w:sz w:val="17"/>
                 <w:lang w:val="zh-CN" w:eastAsia="zh-CN"/>
               </w:rPr>
+              <w:t xml:space="preserve">交付目标</w:t>
+            </w:r>
+          </w:p>
+        </w:tc>
+        <w:tc>
+          <w:tcPr>
+            <w:tcW w:w="7360" w:type="dxa"/>
+            <w:vAlign w:val="center"/>
+            <w:tcMar>
+              <w:top w:w="80" w:type="dxa"/>
+              <w:start w:w="120" w:type="dxa"/>
+              <w:bottom w:w="80" w:type="dxa"/>
+              <w:end w:w="120" w:type="dxa"/>
+            </w:tcMar>
+          </w:tcPr>
+          <w:p>
+            <w:pPr>
+              <w:pStyle w:val="NanoLoopTable"/>
+              <w:keepNext w:val="0"/>
+              <w:keepLines w:val="0"/>
+              <w:jc w:val="left"/>
+            </w:pPr>
+            <w:r>
+              <w:rPr>
+                <w:rFonts w:ascii="Arial" w:hAnsi="Arial" w:eastAsia="Arial Unicode MS" w:cs="Arial"/>
+                <w:sz w:val="17"/>
+                <w:lang w:val="zh-CN" w:eastAsia="zh-CN"/>
+              </w:rPr>
+              <w:t xml:space="preserve">用 5～10 份许可明确的语料和一个固定 embedding 资产，跑通可重启、可评测、可引用的真实混合检索闭环</w:t>
+            </w:r>
+          </w:p>
+        </w:tc>
+      </w:tr>
+      <w:tr>
+        <w:trPr>
+          <w:cantSplit w:val="true"/>
+        </w:trPr>
+        <w:tc>
+          <w:tcPr>
+            <w:tcW w:w="2000" w:type="dxa"/>
+            <w:vAlign w:val="center"/>
+            <w:tcMar>
+              <w:top w:w="80" w:type="dxa"/>
+              <w:start w:w="120" w:type="dxa"/>
+              <w:bottom w:w="80" w:type="dxa"/>
+              <w:end w:w="120" w:type="dxa"/>
+            </w:tcMar>
+          </w:tcPr>
+          <w:p>
+            <w:pPr>
+              <w:pStyle w:val="NanoLoopTable"/>
+              <w:keepNext w:val="0"/>
+              <w:keepLines w:val="0"/>
+              <w:jc w:val="left"/>
+            </w:pPr>
+            <w:r>
+              <w:rPr>
+                <w:rFonts w:ascii="Arial" w:hAnsi="Arial" w:eastAsia="Arial Unicode MS" w:cs="Arial"/>
+                <w:sz w:val="17"/>
+                <w:lang w:val="zh-CN" w:eastAsia="zh-CN"/>
+              </w:rPr>
               <w:t xml:space="preserve">非目标</w:t>
             </w:r>
           </w:p>
@@ -474,6 +610,85 @@
         </w:tc>
       </w:tr>
     </w:tbl>
+    <w:p>
+      <w:pPr>
+        <w:pStyle w:val="BlockText"/>
+        <w:widowControl/>
+      </w:pPr>
+      <w:r>
+        <w:rPr>
+          <w:bCs/>
+          <w:rFonts w:ascii="Arial" w:hAnsi="Arial" w:eastAsia="Arial Unicode MS" w:cs="Arial"/>
+          <w:b/>
+          <w:lang w:val="zh-CN" w:eastAsia="zh-CN"/>
+        </w:rPr>
+        <w:t xml:space="preserve">时效说明</w:t>
+      </w:r>
+      <w:r>
+        <w:rPr>
+          <w:rFonts w:ascii="Arial" w:hAnsi="Arial" w:eastAsia="Arial Unicode MS" w:cs="Arial"/>
+          <w:lang w:val="zh-CN" w:eastAsia="zh-CN"/>
+        </w:rPr>
+        <w:t xml:space="preserve">：本文保留 2026-07-18 首次规划中的</w:t>
+      </w:r>
+      <w:r>
+        <w:rPr>
+          <w:rFonts w:ascii="Arial" w:hAnsi="Arial" w:eastAsia="Arial Unicode MS" w:cs="Arial"/>
+          <w:lang w:val="zh-CN" w:eastAsia="zh-CN"/>
+        </w:rPr>
+        <w:t xml:space="preserve">“</w:t>
+      </w:r>
+      <w:r>
+        <w:rPr>
+          <w:rFonts w:ascii="Arial" w:hAnsi="Arial" w:eastAsia="Arial Unicode MS" w:cs="Arial"/>
+          <w:lang w:val="zh-CN" w:eastAsia="zh-CN"/>
+        </w:rPr>
+        <w:t xml:space="preserve">今晚 / 首周</w:t>
+      </w:r>
+      <w:r>
+        <w:rPr>
+          <w:rFonts w:ascii="Arial" w:hAnsi="Arial" w:eastAsia="Arial Unicode MS" w:cs="Arial"/>
+          <w:lang w:val="zh-CN" w:eastAsia="zh-CN"/>
+        </w:rPr>
+        <w:t xml:space="preserve">”</w:t>
+      </w:r>
+      <w:r>
+        <w:rPr>
+          <w:rFonts w:ascii="Arial" w:hAnsi="Arial" w:eastAsia="Arial Unicode MS" w:cs="Arial"/>
+          <w:lang w:val="zh-CN" w:eastAsia="zh-CN"/>
+        </w:rPr>
+        <w:t xml:space="preserve">相对时间，便于追溯原始任务；实际人员、优先级和日期以 v4.0 总文档及团队集成状态为准。本文中的 Git 操作已经更新为当前</w:t>
+      </w:r>
+      <w:r>
+        <w:rPr>
+          <w:rFonts w:ascii="Arial" w:hAnsi="Arial" w:eastAsia="Arial Unicode MS" w:cs="Arial"/>
+          <w:lang w:val="zh-CN" w:eastAsia="zh-CN"/>
+        </w:rPr>
+        <w:t xml:space="preserve"> </w:t>
+      </w:r>
+      <w:r>
+        <w:rPr>
+          <w:rStyle w:val="VerbatimChar"/>
+          <w:rFonts w:ascii="Arial" w:hAnsi="Arial" w:eastAsia="Arial Unicode MS" w:cs="Arial"/>
+          <w:lang w:val="zh-CN" w:eastAsia="zh-CN"/>
+        </w:rPr>
+        <w:t xml:space="preserve">main</w:t>
+      </w:r>
+      <w:r>
+        <w:rPr>
+          <w:rFonts w:ascii="Arial" w:hAnsi="Arial" w:eastAsia="Arial Unicode MS" w:cs="Arial"/>
+          <w:lang w:val="zh-CN" w:eastAsia="zh-CN"/>
+        </w:rPr>
+        <w:t xml:space="preserve"> </w:t>
+      </w:r>
+      <w:r>
+        <w:rPr>
+          <w:rFonts w:ascii="Arial" w:hAnsi="Arial" w:eastAsia="Arial Unicode MS" w:cs="Arial"/>
+          <w:lang w:val="zh-CN" w:eastAsia="zh-CN"/>
+        </w:rPr>
+        <w:t xml:space="preserve">单主线策略。</w:t>
+      </w:r>
+    </w:p>
     <w:p>
       <w:pPr>
         <w:pStyle w:val="BlockText"/>
@@ -11194,7 +11409,7 @@
       </w:r>
     </w:p>
     <w:bookmarkEnd w:id="44"/>
-    <w:bookmarkStart w:id="50" w:name="团队分工与首周任务书"/>
+    <w:bookmarkStart w:id="51" w:name="当前团队分工与任务书"/>
     <w:p>
       <w:pPr>
         <w:pStyle w:val="Heading1"/>
@@ -11207,10 +11422,52 @@
           <w:rFonts w:ascii="Arial" w:hAnsi="Arial" w:eastAsia="Arial Unicode MS" w:cs="Arial"/>
           <w:lang w:val="zh-CN" w:eastAsia="zh-CN"/>
         </w:rPr>
-        <w:t xml:space="preserve">10. 团队分工与首周任务书</w:t>
-      </w:r>
-    </w:p>
-    <w:bookmarkStart w:id="45" w:name="正式角色表"/>
+        <w:t xml:space="preserve">10. 当前团队分工与任务书</w:t>
+      </w:r>
+    </w:p>
+    <w:p>
+      <w:pPr>
+        <w:pStyle w:val="FirstParagraph"/>
+        <w:widowControl/>
+      </w:pPr>
+      <w:r>
+        <w:rPr>
+          <w:rFonts w:ascii="Arial" w:hAnsi="Arial" w:eastAsia="Arial Unicode MS" w:cs="Arial"/>
+          <w:lang w:val="zh-CN" w:eastAsia="zh-CN"/>
+        </w:rPr>
+        <w:t xml:space="preserve">本章已按 2026-07-23 的 v4.0 实名分工更新；更早聊天或旧版任务表与本章冲突时，以 v4.0 和</w:t>
+      </w:r>
+      <w:r>
+        <w:rPr>
+          <w:rFonts w:ascii="Arial" w:hAnsi="Arial" w:eastAsia="Arial Unicode MS" w:cs="Arial"/>
+          <w:lang w:val="zh-CN" w:eastAsia="zh-CN"/>
+        </w:rPr>
+        <w:t xml:space="preserve"> </w:t>
+      </w:r>
+      <w:hyperlink r:id="rId45">
+        <w:r>
+          <w:rPr>
+            <w:rStyle w:val="Hyperlink"/>
+          </w:rPr>
+          <w:t xml:space="preserve">团队集成状态</w:t>
+        </w:r>
+      </w:hyperlink>
+      <w:r>
+        <w:rPr>
+          <w:rFonts w:ascii="Arial" w:hAnsi="Arial" w:eastAsia="Arial Unicode MS" w:cs="Arial"/>
+          <w:lang w:val="zh-CN" w:eastAsia="zh-CN"/>
+        </w:rPr>
+        <w:t xml:space="preserve"> </w:t>
+      </w:r>
+      <w:r>
+        <w:rPr>
+          <w:rFonts w:ascii="Arial" w:hAnsi="Arial" w:eastAsia="Arial Unicode MS" w:cs="Arial"/>
+          <w:lang w:val="zh-CN" w:eastAsia="zh-CN"/>
+        </w:rPr>
+        <w:t xml:space="preserve">为准。</w:t>
+      </w:r>
+    </w:p>
+    <w:bookmarkStart w:id="46" w:name="正式角色表"/>
     <w:p>
       <w:pPr>
         <w:pStyle w:val="Heading2"/>
@@ -11491,7 +11748,7 @@
                 <w:sz w:val="17"/>
                 <w:lang w:val="zh-CN" w:eastAsia="zh-CN"/>
               </w:rPr>
-              <w:t xml:space="preserve">先完成一个真实模型闭环，不碰 RAG/前端</w:t>
+              <w:t xml:space="preserve">先完成一个真实模型闭环；不碰前端及 RAG</w:t>
             </w:r>
           </w:p>
         </w:tc>
@@ -11524,7 +11781,7 @@
                 <w:sz w:val="17"/>
                 <w:lang w:val="zh-CN" w:eastAsia="zh-CN"/>
               </w:rPr>
-              <w:t xml:space="preserve">Yukun（项目负责人）</w:t>
+              <w:t xml:space="preserve">黄睿健</w:t>
             </w:r>
           </w:p>
         </w:tc>
@@ -11552,7 +11809,7 @@
                 <w:sz w:val="17"/>
                 <w:lang w:val="zh-CN" w:eastAsia="zh-CN"/>
               </w:rPr>
-              <w:t xml:space="preserve">开发者 C + Maintainer</w:t>
+              <w:t xml:space="preserve">开发者 C</w:t>
             </w:r>
           </w:p>
         </w:tc>
@@ -11580,7 +11837,7 @@
                 <w:sz w:val="17"/>
                 <w:lang w:val="zh-CN" w:eastAsia="zh-CN"/>
               </w:rPr>
-              <w:t xml:space="preserve">API、数据库、存储、安全、公共合同与集成</w:t>
+              <w:t xml:space="preserve">后端、数据库、目标环境、私有资产注入与发布</w:t>
             </w:r>
           </w:p>
         </w:tc>
@@ -11608,40 +11865,7 @@
                 <w:sz w:val="17"/>
                 <w:lang w:val="zh-CN" w:eastAsia="zh-CN"/>
               </w:rPr>
-              <w:t xml:space="preserve">维护</w:t>
-            </w:r>
-            <w:r>
-              <w:rPr>
-                <w:rFonts w:ascii="Arial" w:hAnsi="Arial" w:eastAsia="Arial Unicode MS" w:cs="Arial"/>
-                <w:sz w:val="17"/>
-                <w:lang w:val="zh-CN" w:eastAsia="zh-CN"/>
-              </w:rPr>
-              <w:t xml:space="preserve"> </w:t>
-            </w:r>
-            <w:r>
-              <w:rPr>
-                <w:rStyle w:val="VerbatimChar"/>
-                <w:rFonts w:ascii="Arial" w:hAnsi="Arial" w:eastAsia="Arial Unicode MS" w:cs="Arial"/>
-                <w:sz w:val="17"/>
-                <w:lang w:val="zh-CN" w:eastAsia="zh-CN"/>
-              </w:rPr>
-              <w:t xml:space="preserve">yukun</w:t>
-            </w:r>
-            <w:r>
-              <w:rPr>
-                <w:rFonts w:ascii="Arial" w:hAnsi="Arial" w:eastAsia="Arial Unicode MS" w:cs="Arial"/>
-                <w:sz w:val="17"/>
-                <w:lang w:val="zh-CN" w:eastAsia="zh-CN"/>
-              </w:rPr>
-              <w:t xml:space="preserve"> </w:t>
-            </w:r>
-            <w:r>
-              <w:rPr>
-                <w:rFonts w:ascii="Arial" w:hAnsi="Arial" w:eastAsia="Arial Unicode MS" w:cs="Arial"/>
-                <w:sz w:val="17"/>
-                <w:lang w:val="zh-CN" w:eastAsia="zh-CN"/>
-              </w:rPr>
-              <w:t xml:space="preserve">基线；评审跨模块变化；今晚与 D 冻结架构</w:t>
+              <w:t xml:space="preserve">不改 RAG 排序/科学语义；提供加密联调环境、只读资产挂载（协议为 HTTPS）</w:t>
             </w:r>
           </w:p>
         </w:tc>
@@ -11758,7 +11982,7 @@
                 <w:sz w:val="17"/>
                 <w:lang w:val="zh-CN" w:eastAsia="zh-CN"/>
               </w:rPr>
-              <w:t xml:space="preserve">固定 embedding、真实语料闭环和检索改进</w:t>
+              <w:t xml:space="preserve">固定 embedding、合法语料闭环和检索改进</w:t>
             </w:r>
           </w:p>
         </w:tc>
@@ -11908,7 +12132,7 @@
                 <w:sz w:val="17"/>
                 <w:lang w:val="zh-CN" w:eastAsia="zh-CN"/>
               </w:rPr>
-              <w:t xml:space="preserve">黄睿健</w:t>
+              <w:t xml:space="preserve">姚承志</w:t>
             </w:r>
           </w:p>
         </w:tc>
@@ -11936,7 +12160,7 @@
                 <w:sz w:val="17"/>
                 <w:lang w:val="zh-CN" w:eastAsia="zh-CN"/>
               </w:rPr>
-              <w:t xml:space="preserve">开发者 F + RAG 验收负责人</w:t>
+              <w:t xml:space="preserve">开发者 F（学习岗）</w:t>
             </w:r>
           </w:p>
         </w:tc>
@@ -11964,7 +12188,7 @@
                 <w:sz w:val="17"/>
                 <w:lang w:val="zh-CN" w:eastAsia="zh-CN"/>
               </w:rPr>
-              <w:t xml:space="preserve">QA、CI、交付、真实资产独立验收</w:t>
+              <w:t xml:space="preserve">资产台账、结构/hash/许可核对、黑盒执行与证据归档</w:t>
             </w:r>
           </w:p>
         </w:tc>
@@ -11992,7 +12216,7 @@
                 <w:sz w:val="17"/>
                 <w:lang w:val="zh-CN" w:eastAsia="zh-CN"/>
               </w:rPr>
-              <w:t xml:space="preserve">不重写检索算法；建立 manifest/问题集/schema/slow smoke 门禁</w:t>
+              <w:t xml:space="preserve">不替 D 判断算法优劣，不改生产 Python/DB/依赖</w:t>
             </w:r>
           </w:p>
         </w:tc>
@@ -12025,7 +12249,7 @@
                 <w:sz w:val="17"/>
                 <w:lang w:val="zh-CN" w:eastAsia="zh-CN"/>
               </w:rPr>
-              <w:t xml:space="preserve">姚承志</w:t>
+              <w:t xml:space="preserve">郑煜坤</w:t>
             </w:r>
           </w:p>
         </w:tc>
@@ -12053,7 +12277,7 @@
                 <w:sz w:val="17"/>
                 <w:lang w:val="zh-CN" w:eastAsia="zh-CN"/>
               </w:rPr>
-              <w:t xml:space="preserve">D/F 语料与评测学员</w:t>
+              <w:t xml:space="preserve">项目负责人 + Maintainer</w:t>
             </w:r>
           </w:p>
         </w:tc>
@@ -12081,7 +12305,7 @@
                 <w:sz w:val="17"/>
                 <w:lang w:val="zh-CN" w:eastAsia="zh-CN"/>
               </w:rPr>
-              <w:t xml:space="preserve">语料清单、页码核验、问题标注、黑盒执行</w:t>
+              <w:t xml:space="preserve">公共合同、跨模块集成、许可审核、科学签字与发布</w:t>
             </w:r>
           </w:p>
         </w:tc>
@@ -12109,27 +12333,39 @@
                 <w:sz w:val="17"/>
                 <w:lang w:val="zh-CN" w:eastAsia="zh-CN"/>
               </w:rPr>
-              <w:t xml:space="preserve">首周不改生产 Python/DB/依赖；所有结果由 D/F 复核</w:t>
+              <w:t xml:space="preserve">维护</w:t>
+            </w:r>
+            <w:r>
+              <w:rPr>
+                <w:rFonts w:ascii="Arial" w:hAnsi="Arial" w:eastAsia="Arial Unicode MS" w:cs="Arial"/>
+                <w:sz w:val="17"/>
+                <w:lang w:val="zh-CN" w:eastAsia="zh-CN"/>
+              </w:rPr>
+              <w:t xml:space="preserve"> </w:t>
+            </w:r>
+            <w:r>
+              <w:rPr>
+                <w:rStyle w:val="VerbatimChar"/>
+                <w:rFonts w:ascii="Arial" w:hAnsi="Arial" w:eastAsia="Arial Unicode MS" w:cs="Arial"/>
+                <w:sz w:val="17"/>
+                <w:lang w:val="zh-CN" w:eastAsia="zh-CN"/>
+              </w:rPr>
+              <w:t xml:space="preserve">main</w:t>
+            </w:r>
+            <w:r>
+              <w:rPr>
+                <w:rFonts w:ascii="Arial" w:hAnsi="Arial" w:eastAsia="Arial Unicode MS" w:cs="Arial"/>
+                <w:sz w:val="17"/>
+                <w:lang w:val="zh-CN" w:eastAsia="zh-CN"/>
+              </w:rPr>
+              <w:t xml:space="preserve">；解决边界冲突；没有证据时不批准完成</w:t>
             </w:r>
           </w:p>
         </w:tc>
       </w:tr>
     </w:tbl>
-    <w:p>
-      <w:pPr>
-        <w:pStyle w:val="BodyText"/>
-        <w:widowControl/>
-      </w:pPr>
-      <w:r>
-        <w:rPr>
-          <w:rFonts w:ascii="Arial" w:hAnsi="Arial" w:eastAsia="Arial Unicode MS" w:cs="Arial"/>
-          <w:lang w:val="zh-CN" w:eastAsia="zh-CN"/>
-        </w:rPr>
-        <w:t xml:space="preserve">这样 A～F 均有明确负责人。姚承志暂不独占字母和生产模块；连续完成两个合格语料样本与 20 条评测记录后，再领取一个小型数据/脚本 PR。</w:t>
-      </w:r>
-    </w:p>
-    <w:bookmarkEnd w:id="45"/>
-    <w:bookmarkStart w:id="46" w:name="黄睿健开发者-f-的可验收任务包"/>
+    <w:bookmarkEnd w:id="46"/>
+    <w:bookmarkStart w:id="47" w:name="徐皓彬开发者-d-的真实-rag-任务包"/>
     <w:p>
       <w:pPr>
         <w:pStyle w:val="Heading2"/>
@@ -12142,29 +12378,7 @@
           <w:rFonts w:ascii="Arial" w:hAnsi="Arial" w:eastAsia="Arial Unicode MS" w:cs="Arial"/>
           <w:lang w:val="zh-CN" w:eastAsia="zh-CN"/>
         </w:rPr>
-        <w:t xml:space="preserve">10.2 黄睿健：开发者 F 的可验收任务包</w:t>
-      </w:r>
-    </w:p>
-    <w:p>
-      <w:pPr>
-        <w:pStyle w:val="FirstParagraph"/>
-        <w:widowControl/>
-      </w:pPr>
-      <w:r>
-        <w:rPr>
-          <w:bCs/>
-          <w:rFonts w:ascii="Arial" w:hAnsi="Arial" w:eastAsia="Arial Unicode MS" w:cs="Arial"/>
-          <w:b/>
-          <w:lang w:val="zh-CN" w:eastAsia="zh-CN"/>
-        </w:rPr>
-        <w:t xml:space="preserve">首周交付</w:t>
-      </w:r>
-      <w:r>
-        <w:rPr>
-          <w:rFonts w:ascii="Arial" w:hAnsi="Arial" w:eastAsia="Arial Unicode MS" w:cs="Arial"/>
-          <w:lang w:val="zh-CN" w:eastAsia="zh-CN"/>
-        </w:rPr>
-        <w:t xml:space="preserve">：</w:t>
+        <w:t xml:space="preserve">10.2 徐皓彬：开发者 D 的真实 RAG 任务包</w:t>
       </w:r>
     </w:p>
     <w:p>
@@ -12181,36 +12395,7 @@
           <w:rFonts w:ascii="Arial" w:hAnsi="Arial" w:eastAsia="Arial Unicode MS" w:cs="Arial"/>
           <w:lang w:val="zh-CN" w:eastAsia="zh-CN"/>
         </w:rPr>
-        <w:t xml:space="preserve">提出</w:t>
-      </w:r>
-      <w:r>
-        <w:rPr>
-          <w:rFonts w:ascii="Arial" w:hAnsi="Arial" w:eastAsia="Arial Unicode MS" w:cs="Arial"/>
-          <w:lang w:val="zh-CN" w:eastAsia="zh-CN"/>
-        </w:rPr>
-        <w:t xml:space="preserve"> </w:t>
-      </w:r>
-      <w:r>
-        <w:rPr>
-          <w:rStyle w:val="VerbatimChar"/>
-          <w:rFonts w:ascii="Arial" w:hAnsi="Arial" w:eastAsia="Arial Unicode MS" w:cs="Arial"/>
-          <w:lang w:val="zh-CN" w:eastAsia="zh-CN"/>
-        </w:rPr>
-        <w:t xml:space="preserve">demo_data/rag_eval/</w:t>
-      </w:r>
-      <w:r>
-        <w:rPr>
-          <w:rFonts w:ascii="Arial" w:hAnsi="Arial" w:eastAsia="Arial Unicode MS" w:cs="Arial"/>
-          <w:lang w:val="zh-CN" w:eastAsia="zh-CN"/>
-        </w:rPr>
-        <w:t xml:space="preserve"> </w:t>
-      </w:r>
-      <w:r>
-        <w:rPr>
-          <w:rFonts w:ascii="Arial" w:hAnsi="Arial" w:eastAsia="Arial Unicode MS" w:cs="Arial"/>
-          <w:lang w:val="zh-CN" w:eastAsia="zh-CN"/>
-        </w:rPr>
-        <w:t xml:space="preserve">下 corpus manifest 与 questions JSONL schema，经 D/C 评审后再实现。</w:t>
+        <w:t xml:space="preserve">对候选来源做许可复核；只有授权页、完整元数据和文件 SHA 齐全的来源才能进入正式 corpus。</w:t>
       </w:r>
     </w:p>
     <w:p>
@@ -12227,7 +12412,7 @@
           <w:rFonts w:ascii="Arial" w:hAnsi="Arial" w:eastAsia="Arial Unicode MS" w:cs="Arial"/>
           <w:lang w:val="zh-CN" w:eastAsia="zh-CN"/>
         </w:rPr>
-        <w:t xml:space="preserve">实现</w:t>
+        <w:t xml:space="preserve">固定</w:t>
       </w:r>
       <w:r>
         <w:rPr>
@@ -12242,14 +12427,7 @@
           <w:rFonts w:ascii="Arial" w:hAnsi="Arial" w:eastAsia="Arial Unicode MS" w:cs="Arial"/>
           <w:lang w:val="zh-CN" w:eastAsia="zh-CN"/>
         </w:rPr>
-        <w:t xml:space="preserve">scripts/validate_rag_assets.py</w:t>
-      </w:r>
-      <w:r>
-        <w:rPr>
-          <w:rFonts w:ascii="Arial" w:hAnsi="Arial" w:eastAsia="Arial Unicode MS" w:cs="Arial"/>
-          <w:lang w:val="zh-CN" w:eastAsia="zh-CN"/>
-        </w:rPr>
-        <w:t xml:space="preserve">，检查必填字段、SHA、许可证据、材料别名、引文、页码和</w:t>
+        <w:t xml:space="preserve">bge-small-zh-v1.5</w:t>
       </w:r>
       <w:r>
         <w:rPr>
@@ -12260,18 +12438,10 @@
       </w:r>
       <w:r>
         <w:rPr>
-          <w:rStyle w:val="VerbatimChar"/>
-          <w:rFonts w:ascii="Arial" w:hAnsi="Arial" w:eastAsia="Arial Unicode MS" w:cs="Arial"/>
-          <w:lang w:val="zh-CN" w:eastAsia="zh-CN"/>
-        </w:rPr>
-        <w:t xml:space="preserve">allowed_for_demo</w:t>
-      </w:r>
-      <w:r>
-        <w:rPr>
-          <w:rFonts w:ascii="Arial" w:hAnsi="Arial" w:eastAsia="Arial Unicode MS" w:cs="Arial"/>
-          <w:lang w:val="zh-CN" w:eastAsia="zh-CN"/>
-        </w:rPr>
-        <w:t xml:space="preserve">；脚本不能上传或读取未声明目录。</w:t>
+          <w:rFonts w:ascii="Arial" w:hAnsi="Arial" w:eastAsia="Arial Unicode MS" w:cs="Arial"/>
+          <w:lang w:val="zh-CN" w:eastAsia="zh-CN"/>
+        </w:rPr>
+        <w:t xml:space="preserve">的来源、revision、目录 SHA、维度、归一化和离线加载方式。</w:t>
       </w:r>
     </w:p>
     <w:p>
@@ -12288,7 +12458,7 @@
           <w:rFonts w:ascii="Arial" w:hAnsi="Arial" w:eastAsia="Arial Unicode MS" w:cs="Arial"/>
           <w:lang w:val="zh-CN" w:eastAsia="zh-CN"/>
         </w:rPr>
-        <w:t xml:space="preserve">为 validator 增加正反单测，fixture 只能用团队自写极小文本，不提交论文全文。</w:t>
+        <w:t xml:space="preserve">生成 embedding snapshot、FAISS generation 与 manifest，并跑 keyword/vector/hybrid 三类检索。</w:t>
       </w:r>
     </w:p>
     <w:p>
@@ -12305,7 +12475,7 @@
           <w:rFonts w:ascii="Arial" w:hAnsi="Arial" w:eastAsia="Arial Unicode MS" w:cs="Arial"/>
           <w:lang w:val="zh-CN" w:eastAsia="zh-CN"/>
         </w:rPr>
-        <w:t xml:space="preserve">编写真实资产 slow smoke：摄取、keyword-only/hybrid、受控 vector-only harness、错材料、禁用、指纹失配、重启复用和引用核验。</w:t>
+        <w:t xml:space="preserve">用最终题集执行首次、进程重启、索引失配/降级、错材料、无证据和引用页码验收。</w:t>
       </w:r>
     </w:p>
     <w:p>
@@ -12322,52 +12492,51 @@
           <w:rFonts w:ascii="Arial" w:hAnsi="Arial" w:eastAsia="Arial Unicode MS" w:cs="Arial"/>
           <w:lang w:val="zh-CN" w:eastAsia="zh-CN"/>
         </w:rPr>
-        <w:t xml:space="preserve">记录 RAG extra 容器只读模型挂载、CPU 内存、冷启动、查询延迟和失败降级；普通 CI 继续不依赖外网/私有资产。</w:t>
-      </w:r>
-    </w:p>
-    <w:p>
-      <w:pPr>
-        <w:widowControl/>
-        <w:numPr>
-          <w:ilvl w:val="0"/>
-          <w:numId w:val="1012"/>
-        </w:numPr>
-        <w:pStyle w:val="Compact"/>
-      </w:pPr>
-      <w:r>
-        <w:rPr>
-          <w:rFonts w:ascii="Arial" w:hAnsi="Arial" w:eastAsia="Arial Unicode MS" w:cs="Arial"/>
-          <w:lang w:val="zh-CN" w:eastAsia="zh-CN"/>
-        </w:rPr>
-        <w:t xml:space="preserve">对徐皓彬的</w:t>
-      </w:r>
-      <w:r>
-        <w:rPr>
-          <w:rFonts w:ascii="Arial" w:hAnsi="Arial" w:eastAsia="Arial Unicode MS" w:cs="Arial"/>
-          <w:lang w:val="zh-CN" w:eastAsia="zh-CN"/>
-        </w:rPr>
-        <w:t xml:space="preserve">“</w:t>
-      </w:r>
-      <w:r>
-        <w:rPr>
-          <w:rFonts w:ascii="Arial" w:hAnsi="Arial" w:eastAsia="Arial Unicode MS" w:cs="Arial"/>
-          <w:lang w:val="zh-CN" w:eastAsia="zh-CN"/>
-        </w:rPr>
-        <w:t xml:space="preserve">完成</w:t>
-      </w:r>
-      <w:r>
-        <w:rPr>
-          <w:rFonts w:ascii="Arial" w:hAnsi="Arial" w:eastAsia="Arial Unicode MS" w:cs="Arial"/>
-          <w:lang w:val="zh-CN" w:eastAsia="zh-CN"/>
-        </w:rPr>
-        <w:t xml:space="preserve">”</w:t>
-      </w:r>
-      <w:r>
-        <w:rPr>
-          <w:rFonts w:ascii="Arial" w:hAnsi="Arial" w:eastAsia="Arial Unicode MS" w:cs="Arial"/>
-          <w:lang w:val="zh-CN" w:eastAsia="zh-CN"/>
-        </w:rPr>
-        <w:t xml:space="preserve">声明做独立验收，维护 CI 和开发日志证据。</w:t>
+        <w:t xml:space="preserve">只有失败证据指向代码时才修改</w:t>
+      </w:r>
+      <w:r>
+        <w:rPr>
+          <w:rFonts w:ascii="Arial" w:hAnsi="Arial" w:eastAsia="Arial Unicode MS" w:cs="Arial"/>
+          <w:lang w:val="zh-CN" w:eastAsia="zh-CN"/>
+        </w:rPr>
+        <w:t xml:space="preserve"> </w:t>
+      </w:r>
+      <w:r>
+        <w:rPr>
+          <w:rStyle w:val="VerbatimChar"/>
+          <w:rFonts w:ascii="Arial" w:hAnsi="Arial" w:eastAsia="Arial Unicode MS" w:cs="Arial"/>
+          <w:lang w:val="zh-CN" w:eastAsia="zh-CN"/>
+        </w:rPr>
+        <w:t xml:space="preserve">app/rag/**</w:t>
+      </w:r>
+      <w:r>
+        <w:rPr>
+          <w:rFonts w:ascii="Arial" w:hAnsi="Arial" w:eastAsia="Arial Unicode MS" w:cs="Arial"/>
+          <w:lang w:val="zh-CN" w:eastAsia="zh-CN"/>
+        </w:rPr>
+        <w:t xml:space="preserve">、</w:t>
+      </w:r>
+      <w:r>
+        <w:rPr>
+          <w:rStyle w:val="VerbatimChar"/>
+          <w:rFonts w:ascii="Arial" w:hAnsi="Arial" w:eastAsia="Arial Unicode MS" w:cs="Arial"/>
+          <w:lang w:val="zh-CN" w:eastAsia="zh-CN"/>
+        </w:rPr>
+        <w:t xml:space="preserve">app/agent/**</w:t>
+      </w:r>
+      <w:r>
+        <w:rPr>
+          <w:rFonts w:ascii="Arial" w:hAnsi="Arial" w:eastAsia="Arial Unicode MS" w:cs="Arial"/>
+          <w:lang w:val="zh-CN" w:eastAsia="zh-CN"/>
+        </w:rPr>
+        <w:t xml:space="preserve"> </w:t>
+      </w:r>
+      <w:r>
+        <w:rPr>
+          <w:rFonts w:ascii="Arial" w:hAnsi="Arial" w:eastAsia="Arial Unicode MS" w:cs="Arial"/>
+          <w:lang w:val="zh-CN" w:eastAsia="zh-CN"/>
+        </w:rPr>
+        <w:t xml:space="preserve">及对应测试；不重搭已有框架。</w:t>
       </w:r>
     </w:p>
     <w:p>
@@ -12377,253 +12546,14 @@
       </w:pPr>
       <w:r>
         <w:rPr>
-          <w:bCs/>
-          <w:rFonts w:ascii="Arial" w:hAnsi="Arial" w:eastAsia="Arial Unicode MS" w:cs="Arial"/>
-          <w:b/>
-          <w:lang w:val="zh-CN" w:eastAsia="zh-CN"/>
-        </w:rPr>
-        <w:t xml:space="preserve">文件边界</w:t>
-      </w:r>
-      <w:r>
-        <w:rPr>
-          <w:rFonts w:ascii="Arial" w:hAnsi="Arial" w:eastAsia="Arial Unicode MS" w:cs="Arial"/>
-          <w:lang w:val="zh-CN" w:eastAsia="zh-CN"/>
-        </w:rPr>
-        <w:t xml:space="preserve">：</w:t>
-      </w:r>
-      <w:r>
-        <w:rPr>
-          <w:rStyle w:val="VerbatimChar"/>
-          <w:rFonts w:ascii="Arial" w:hAnsi="Arial" w:eastAsia="Arial Unicode MS" w:cs="Arial"/>
-          <w:lang w:val="zh-CN" w:eastAsia="zh-CN"/>
-        </w:rPr>
-        <w:t xml:space="preserve">scripts/**</w:t>
-      </w:r>
-      <w:r>
-        <w:rPr>
-          <w:rFonts w:ascii="Arial" w:hAnsi="Arial" w:eastAsia="Arial Unicode MS" w:cs="Arial"/>
-          <w:lang w:val="zh-CN" w:eastAsia="zh-CN"/>
-        </w:rPr>
-        <w:t xml:space="preserve">、</w:t>
-      </w:r>
-      <w:r>
-        <w:rPr>
-          <w:rStyle w:val="VerbatimChar"/>
-          <w:rFonts w:ascii="Arial" w:hAnsi="Arial" w:eastAsia="Arial Unicode MS" w:cs="Arial"/>
-          <w:lang w:val="zh-CN" w:eastAsia="zh-CN"/>
-        </w:rPr>
-        <w:t xml:space="preserve">tests/unit/scripts/**</w:t>
-      </w:r>
-      <w:r>
-        <w:rPr>
-          <w:rFonts w:ascii="Arial" w:hAnsi="Arial" w:eastAsia="Arial Unicode MS" w:cs="Arial"/>
-          <w:lang w:val="zh-CN" w:eastAsia="zh-CN"/>
-        </w:rPr>
-        <w:t xml:space="preserve">、</w:t>
-      </w:r>
-      <w:r>
-        <w:rPr>
-          <w:rStyle w:val="VerbatimChar"/>
-          <w:rFonts w:ascii="Arial" w:hAnsi="Arial" w:eastAsia="Arial Unicode MS" w:cs="Arial"/>
-          <w:lang w:val="zh-CN" w:eastAsia="zh-CN"/>
-        </w:rPr>
-        <w:t xml:space="preserve">tests/integration/**</w:t>
-      </w:r>
-      <w:r>
-        <w:rPr>
-          <w:rFonts w:ascii="Arial" w:hAnsi="Arial" w:eastAsia="Arial Unicode MS" w:cs="Arial"/>
-          <w:lang w:val="zh-CN" w:eastAsia="zh-CN"/>
-        </w:rPr>
-        <w:t xml:space="preserve">、</w:t>
-      </w:r>
-      <w:r>
-        <w:rPr>
-          <w:rStyle w:val="VerbatimChar"/>
-          <w:rFonts w:ascii="Arial" w:hAnsi="Arial" w:eastAsia="Arial Unicode MS" w:cs="Arial"/>
-          <w:lang w:val="zh-CN" w:eastAsia="zh-CN"/>
-        </w:rPr>
-        <w:t xml:space="preserve">demo_data/**</w:t>
-      </w:r>
-      <w:r>
-        <w:rPr>
-          <w:rFonts w:ascii="Arial" w:hAnsi="Arial" w:eastAsia="Arial Unicode MS" w:cs="Arial"/>
-          <w:lang w:val="zh-CN" w:eastAsia="zh-CN"/>
-        </w:rPr>
-        <w:t xml:space="preserve">；</w:t>
-      </w:r>
-      <w:r>
-        <w:rPr>
-          <w:rStyle w:val="VerbatimChar"/>
-          <w:rFonts w:ascii="Arial" w:hAnsi="Arial" w:eastAsia="Arial Unicode MS" w:cs="Arial"/>
-          <w:lang w:val="zh-CN" w:eastAsia="zh-CN"/>
-        </w:rPr>
-        <w:t xml:space="preserve">.github/**</w:t>
-      </w:r>
-      <w:r>
-        <w:rPr>
-          <w:rFonts w:ascii="Arial" w:hAnsi="Arial" w:eastAsia="Arial Unicode MS" w:cs="Arial"/>
-          <w:lang w:val="zh-CN" w:eastAsia="zh-CN"/>
-        </w:rPr>
-        <w:t xml:space="preserve">、Docker 文件仅在任务明确且 C 评审时修改。不得为了全绿降低断言，不修改</w:t>
-      </w:r>
-      <w:r>
-        <w:rPr>
-          <w:rFonts w:ascii="Arial" w:hAnsi="Arial" w:eastAsia="Arial Unicode MS" w:cs="Arial"/>
-          <w:lang w:val="zh-CN" w:eastAsia="zh-CN"/>
-        </w:rPr>
-        <w:t xml:space="preserve"> </w:t>
-      </w:r>
-      <w:r>
-        <w:rPr>
-          <w:rStyle w:val="VerbatimChar"/>
-          <w:rFonts w:ascii="Arial" w:hAnsi="Arial" w:eastAsia="Arial Unicode MS" w:cs="Arial"/>
-          <w:lang w:val="zh-CN" w:eastAsia="zh-CN"/>
-        </w:rPr>
-        <w:t xml:space="preserve">app/rag</w:t>
-      </w:r>
-      <w:r>
-        <w:rPr>
-          <w:rFonts w:ascii="Arial" w:hAnsi="Arial" w:eastAsia="Arial Unicode MS" w:cs="Arial"/>
-          <w:lang w:val="zh-CN" w:eastAsia="zh-CN"/>
-        </w:rPr>
-        <w:t xml:space="preserve"> </w:t>
-      </w:r>
-      <w:r>
-        <w:rPr>
-          <w:rFonts w:ascii="Arial" w:hAnsi="Arial" w:eastAsia="Arial Unicode MS" w:cs="Arial"/>
-          <w:lang w:val="zh-CN" w:eastAsia="zh-CN"/>
-        </w:rPr>
-        <w:t xml:space="preserve">的科学语义。</w:t>
-      </w:r>
-    </w:p>
-    <w:p>
-      <w:pPr>
-        <w:pStyle w:val="BodyText"/>
-        <w:widowControl/>
-      </w:pPr>
-      <w:r>
-        <w:rPr>
-          <w:bCs/>
-          <w:rFonts w:ascii="Arial" w:hAnsi="Arial" w:eastAsia="Arial Unicode MS" w:cs="Arial"/>
-          <w:b/>
-          <w:lang w:val="zh-CN" w:eastAsia="zh-CN"/>
-        </w:rPr>
-        <w:t xml:space="preserve">首周验收命令</w:t>
-      </w:r>
-      <w:r>
-        <w:rPr>
-          <w:rFonts w:ascii="Arial" w:hAnsi="Arial" w:eastAsia="Arial Unicode MS" w:cs="Arial"/>
-          <w:lang w:val="zh-CN" w:eastAsia="zh-CN"/>
-        </w:rPr>
-        <w:t xml:space="preserve">：</w:t>
-      </w:r>
-    </w:p>
-    <w:p>
-      <w:pPr>
-        <w:pStyle w:val="SourceCode"/>
-        <w:keepLines/>
-        <w:widowControl/>
-      </w:pPr>
-      <w:r>
-        <w:rPr>
-          <w:rStyle w:val="ExtensionTok"/>
-          <w:rFonts w:ascii="Menlo" w:hAnsi="Menlo" w:eastAsia="Arial Unicode MS" w:cs="Menlo"/>
-          <w:sz w:val="16"/>
-          <w:lang w:val="zh-CN" w:eastAsia="zh-CN"/>
-        </w:rPr>
-        <w:t xml:space="preserve">.venv/bin/pytest</w:t>
-      </w:r>
-      <w:r>
-        <w:rPr>
-          <w:rStyle w:val="NormalTok"/>
-          <w:rFonts w:ascii="Menlo" w:hAnsi="Menlo" w:eastAsia="Arial Unicode MS" w:cs="Menlo"/>
-          <w:sz w:val="16"/>
-          <w:lang w:val="zh-CN" w:eastAsia="zh-CN"/>
-        </w:rPr>
-        <w:t xml:space="preserve"> </w:t>
-      </w:r>
-      <w:r>
-        <w:rPr>
-          <w:rStyle w:val="AttributeTok"/>
-          <w:rFonts w:ascii="Menlo" w:hAnsi="Menlo" w:eastAsia="Arial Unicode MS" w:cs="Menlo"/>
-          <w:sz w:val="16"/>
-          <w:lang w:val="zh-CN" w:eastAsia="zh-CN"/>
-        </w:rPr>
-        <w:t xml:space="preserve">-q</w:t>
-      </w:r>
-      <w:r>
-        <w:rPr>
-          <w:rStyle w:val="NormalTok"/>
-          <w:rFonts w:ascii="Menlo" w:hAnsi="Menlo" w:eastAsia="Arial Unicode MS" w:cs="Menlo"/>
-          <w:sz w:val="16"/>
-          <w:lang w:val="zh-CN" w:eastAsia="zh-CN"/>
-        </w:rPr>
-        <w:t xml:space="preserve"> tests/unit/scripts tests/unit/rag tests/unit/agent</w:t>
-      </w:r>
-      <w:r>
-        <w:rPr>
-          <w:rFonts w:ascii="Menlo" w:hAnsi="Menlo" w:eastAsia="Arial Unicode MS" w:cs="Menlo"/>
-          <w:sz w:val="16"/>
-          <w:lang w:val="zh-CN" w:eastAsia="zh-CN"/>
-        </w:rPr>
-        <w:br/>
-      </w:r>
-      <w:r>
-        <w:rPr>
-          <w:rStyle w:val="FunctionTok"/>
-          <w:rFonts w:ascii="Menlo" w:hAnsi="Menlo" w:eastAsia="Arial Unicode MS" w:cs="Menlo"/>
-          <w:sz w:val="16"/>
-          <w:lang w:val="zh-CN" w:eastAsia="zh-CN"/>
-        </w:rPr>
-        <w:t xml:space="preserve">make</w:t>
-      </w:r>
-      <w:r>
-        <w:rPr>
-          <w:rStyle w:val="NormalTok"/>
-          <w:rFonts w:ascii="Menlo" w:hAnsi="Menlo" w:eastAsia="Arial Unicode MS" w:cs="Menlo"/>
-          <w:sz w:val="16"/>
-          <w:lang w:val="zh-CN" w:eastAsia="zh-CN"/>
-        </w:rPr>
-        <w:t xml:space="preserve"> check</w:t>
-      </w:r>
-      <w:r>
-        <w:rPr>
-          <w:rFonts w:ascii="Menlo" w:hAnsi="Menlo" w:eastAsia="Arial Unicode MS" w:cs="Menlo"/>
-          <w:sz w:val="16"/>
-          <w:lang w:val="zh-CN" w:eastAsia="zh-CN"/>
-        </w:rPr>
-        <w:br/>
-      </w:r>
-      <w:r>
-        <w:rPr>
-          <w:rStyle w:val="ExtensionTok"/>
-          <w:rFonts w:ascii="Menlo" w:hAnsi="Menlo" w:eastAsia="Arial Unicode MS" w:cs="Menlo"/>
-          <w:sz w:val="16"/>
-          <w:lang w:val="zh-CN" w:eastAsia="zh-CN"/>
-        </w:rPr>
-        <w:t xml:space="preserve">docker</w:t>
-      </w:r>
-      <w:r>
-        <w:rPr>
-          <w:rStyle w:val="NormalTok"/>
-          <w:rFonts w:ascii="Menlo" w:hAnsi="Menlo" w:eastAsia="Arial Unicode MS" w:cs="Menlo"/>
-          <w:sz w:val="16"/>
-          <w:lang w:val="zh-CN" w:eastAsia="zh-CN"/>
-        </w:rPr>
-        <w:t xml:space="preserve"> compose config </w:t>
-      </w:r>
-      <w:r>
-        <w:rPr>
-          <w:rStyle w:val="AttributeTok"/>
-          <w:rFonts w:ascii="Menlo" w:hAnsi="Menlo" w:eastAsia="Arial Unicode MS" w:cs="Menlo"/>
-          <w:sz w:val="16"/>
-          <w:lang w:val="zh-CN" w:eastAsia="zh-CN"/>
-        </w:rPr>
-        <w:t xml:space="preserve">--quiet</w:t>
-      </w:r>
-    </w:p>
-    <w:bookmarkEnd w:id="46"/>
-    <w:bookmarkStart w:id="47" w:name="姚承志零基础但有真实价值的任务包"/>
+          <w:rFonts w:ascii="Arial" w:hAnsi="Arial" w:eastAsia="Arial Unicode MS" w:cs="Arial"/>
+          <w:lang w:val="zh-CN" w:eastAsia="zh-CN"/>
+        </w:rPr>
+        <w:t xml:space="preserve">公共 DTO、API、数据库、租户、存储或 Compose 变化必须拆为独立合同切片，并由黄睿健和郑煜坤评审。</w:t>
+      </w:r>
+    </w:p>
+    <w:bookmarkEnd w:id="47"/>
+    <w:bookmarkStart w:id="48" w:name="姚承志开发者-f学习岗的可验收任务包"/>
     <w:p>
       <w:pPr>
         <w:pStyle w:val="Heading2"/>
@@ -12636,7 +12566,7 @@
           <w:rFonts w:ascii="Arial" w:hAnsi="Arial" w:eastAsia="Arial Unicode MS" w:cs="Arial"/>
           <w:lang w:val="zh-CN" w:eastAsia="zh-CN"/>
         </w:rPr>
-        <w:t xml:space="preserve">10.3 姚承志：零基础但有真实价值的任务包</w:t>
+        <w:t xml:space="preserve">10.3 姚承志：开发者 F（学习岗）的可验收任务包</w:t>
       </w:r>
     </w:p>
     <w:p>
@@ -12646,19 +12576,39 @@
       </w:pPr>
       <w:r>
         <w:rPr>
-          <w:bCs/>
-          <w:rFonts w:ascii="Arial" w:hAnsi="Arial" w:eastAsia="Arial Unicode MS" w:cs="Arial"/>
-          <w:b/>
-          <w:lang w:val="zh-CN" w:eastAsia="zh-CN"/>
-        </w:rPr>
-        <w:t xml:space="preserve">第一天</w:t>
-      </w:r>
-      <w:r>
-        <w:rPr>
-          <w:rFonts w:ascii="Arial" w:hAnsi="Arial" w:eastAsia="Arial Unicode MS" w:cs="Arial"/>
-          <w:lang w:val="zh-CN" w:eastAsia="zh-CN"/>
-        </w:rPr>
-        <w:t xml:space="preserve">，进入已克隆的 NanoLoop Agent 仓库根目录后运行：</w:t>
+          <w:rFonts w:ascii="Arial" w:hAnsi="Arial" w:eastAsia="Arial Unicode MS" w:cs="Arial"/>
+          <w:lang w:val="zh-CN" w:eastAsia="zh-CN"/>
+        </w:rPr>
+        <w:t xml:space="preserve">先在最新</w:t>
+      </w:r>
+      <w:r>
+        <w:rPr>
+          <w:rFonts w:ascii="Arial" w:hAnsi="Arial" w:eastAsia="Arial Unicode MS" w:cs="Arial"/>
+          <w:lang w:val="zh-CN" w:eastAsia="zh-CN"/>
+        </w:rPr>
+        <w:t xml:space="preserve"> </w:t>
+      </w:r>
+      <w:r>
+        <w:rPr>
+          <w:rStyle w:val="VerbatimChar"/>
+          <w:rFonts w:ascii="Arial" w:hAnsi="Arial" w:eastAsia="Arial Unicode MS" w:cs="Arial"/>
+          <w:lang w:val="zh-CN" w:eastAsia="zh-CN"/>
+        </w:rPr>
+        <w:t xml:space="preserve">main</w:t>
+      </w:r>
+      <w:r>
+        <w:rPr>
+          <w:rFonts w:ascii="Arial" w:hAnsi="Arial" w:eastAsia="Arial Unicode MS" w:cs="Arial"/>
+          <w:lang w:val="zh-CN" w:eastAsia="zh-CN"/>
+        </w:rPr>
+        <w:t xml:space="preserve"> </w:t>
+      </w:r>
+      <w:r>
+        <w:rPr>
+          <w:rFonts w:ascii="Arial" w:hAnsi="Arial" w:eastAsia="Arial Unicode MS" w:cs="Arial"/>
+          <w:lang w:val="zh-CN" w:eastAsia="zh-CN"/>
+        </w:rPr>
+        <w:t xml:space="preserve">的独立功能分支运行并原样保存：</w:t>
       </w:r>
     </w:p>
     <w:p>
@@ -12793,127 +12743,7 @@
           <w:rFonts w:ascii="Arial" w:hAnsi="Arial" w:eastAsia="Arial Unicode MS" w:cs="Arial"/>
           <w:lang w:val="zh-CN" w:eastAsia="zh-CN"/>
         </w:rPr>
-        <w:t xml:space="preserve">把输出原样发给黄睿健，不自行</w:t>
-      </w:r>
-      <w:r>
-        <w:rPr>
-          <w:rFonts w:ascii="Arial" w:hAnsi="Arial" w:eastAsia="Arial Unicode MS" w:cs="Arial"/>
-          <w:lang w:val="zh-CN" w:eastAsia="zh-CN"/>
-        </w:rPr>
-        <w:t xml:space="preserve">“</w:t>
-      </w:r>
-      <w:r>
-        <w:rPr>
-          <w:rFonts w:ascii="Arial" w:hAnsi="Arial" w:eastAsia="Arial Unicode MS" w:cs="Arial"/>
-          <w:lang w:val="zh-CN" w:eastAsia="zh-CN"/>
-        </w:rPr>
-        <w:t xml:space="preserve">修</w:t>
-      </w:r>
-      <w:r>
-        <w:rPr>
-          <w:rFonts w:ascii="Arial" w:hAnsi="Arial" w:eastAsia="Arial Unicode MS" w:cs="Arial"/>
-          <w:lang w:val="zh-CN" w:eastAsia="zh-CN"/>
-        </w:rPr>
-        <w:t xml:space="preserve">”</w:t>
-      </w:r>
-      <w:r>
-        <w:rPr>
-          <w:rFonts w:ascii="Arial" w:hAnsi="Arial" w:eastAsia="Arial Unicode MS" w:cs="Arial"/>
-          <w:lang w:val="zh-CN" w:eastAsia="zh-CN"/>
-        </w:rPr>
-        <w:t xml:space="preserve">失败。然后阅读本指南第 2、3、5、7 节，能口头解释</w:t>
-      </w:r>
-      <w:r>
-        <w:rPr>
-          <w:rFonts w:ascii="Arial" w:hAnsi="Arial" w:eastAsia="Arial Unicode MS" w:cs="Arial"/>
-          <w:lang w:val="zh-CN" w:eastAsia="zh-CN"/>
-        </w:rPr>
-        <w:t xml:space="preserve">“</w:t>
-      </w:r>
-      <w:r>
-        <w:rPr>
-          <w:rFonts w:ascii="Arial" w:hAnsi="Arial" w:eastAsia="Arial Unicode MS" w:cs="Arial"/>
-          <w:lang w:val="zh-CN" w:eastAsia="zh-CN"/>
-        </w:rPr>
-        <w:t xml:space="preserve">embedding 和生成式 LLM 的区别</w:t>
-      </w:r>
-      <w:r>
-        <w:rPr>
-          <w:rFonts w:ascii="Arial" w:hAnsi="Arial" w:eastAsia="Arial Unicode MS" w:cs="Arial"/>
-          <w:lang w:val="zh-CN" w:eastAsia="zh-CN"/>
-        </w:rPr>
-        <w:t xml:space="preserve">”</w:t>
-      </w:r>
-      <w:r>
-        <w:rPr>
-          <w:rFonts w:ascii="Arial" w:hAnsi="Arial" w:eastAsia="Arial Unicode MS" w:cs="Arial"/>
-          <w:lang w:val="zh-CN" w:eastAsia="zh-CN"/>
-        </w:rPr>
-        <w:t xml:space="preserve">“</w:t>
-      </w:r>
-      <w:r>
-        <w:rPr>
-          <w:rFonts w:ascii="Arial" w:hAnsi="Arial" w:eastAsia="Arial Unicode MS" w:cs="Arial"/>
-          <w:lang w:val="zh-CN" w:eastAsia="zh-CN"/>
-        </w:rPr>
-        <w:t xml:space="preserve">元数据不等于全文许可</w:t>
-      </w:r>
-      <w:r>
-        <w:rPr>
-          <w:rFonts w:ascii="Arial" w:hAnsi="Arial" w:eastAsia="Arial Unicode MS" w:cs="Arial"/>
-          <w:lang w:val="zh-CN" w:eastAsia="zh-CN"/>
-        </w:rPr>
-        <w:t xml:space="preserve">”</w:t>
-      </w:r>
-      <w:r>
-        <w:rPr>
-          <w:rFonts w:ascii="Arial" w:hAnsi="Arial" w:eastAsia="Arial Unicode MS" w:cs="Arial"/>
-          <w:lang w:val="zh-CN" w:eastAsia="zh-CN"/>
-        </w:rPr>
-        <w:t xml:space="preserve">“</w:t>
-      </w:r>
-      <w:r>
-        <w:rPr>
-          <w:rFonts w:ascii="Arial" w:hAnsi="Arial" w:eastAsia="Arial Unicode MS" w:cs="Arial"/>
-          <w:lang w:val="zh-CN" w:eastAsia="zh-CN"/>
-        </w:rPr>
-        <w:t xml:space="preserve">为什么错材料必须 0 citation</w:t>
-      </w:r>
-      <w:r>
-        <w:rPr>
-          <w:rFonts w:ascii="Arial" w:hAnsi="Arial" w:eastAsia="Arial Unicode MS" w:cs="Arial"/>
-          <w:lang w:val="zh-CN" w:eastAsia="zh-CN"/>
-        </w:rPr>
-        <w:t xml:space="preserve">”</w:t>
-      </w:r>
-      <w:r>
-        <w:rPr>
-          <w:rFonts w:ascii="Arial" w:hAnsi="Arial" w:eastAsia="Arial Unicode MS" w:cs="Arial"/>
-          <w:lang w:val="zh-CN" w:eastAsia="zh-CN"/>
-        </w:rPr>
-        <w:t xml:space="preserve">。</w:t>
-      </w:r>
-    </w:p>
-    <w:p>
-      <w:pPr>
-        <w:pStyle w:val="BodyText"/>
-        <w:widowControl/>
-      </w:pPr>
-      <w:r>
-        <w:rPr>
-          <w:bCs/>
-          <w:rFonts w:ascii="Arial" w:hAnsi="Arial" w:eastAsia="Arial Unicode MS" w:cs="Arial"/>
-          <w:b/>
-          <w:lang w:val="zh-CN" w:eastAsia="zh-CN"/>
-        </w:rPr>
-        <w:t xml:space="preserve">首周交付</w:t>
-      </w:r>
-      <w:r>
-        <w:rPr>
-          <w:rFonts w:ascii="Arial" w:hAnsi="Arial" w:eastAsia="Arial Unicode MS" w:cs="Arial"/>
-          <w:lang w:val="zh-CN" w:eastAsia="zh-CN"/>
-        </w:rPr>
-        <w:t xml:space="preserve">：</w:t>
+        <w:t xml:space="preserve">当前可做：</w:t>
       </w:r>
     </w:p>
     <w:p>
@@ -12930,7 +12760,7 @@
           <w:rFonts w:ascii="Arial" w:hAnsi="Arial" w:eastAsia="Arial Unicode MS" w:cs="Arial"/>
           <w:lang w:val="zh-CN" w:eastAsia="zh-CN"/>
         </w:rPr>
-        <w:t xml:space="preserve">收集 8～10 个候选来源，经徐皓彬确认后保留 5～10 份；不批量爬站。</w:t>
+        <w:t xml:space="preserve">按既有 schema 建资产台账，记录文件名、负责人、来源、许可、版本、SHA-256、大小、用途、受控位置和状态。</w:t>
       </w:r>
     </w:p>
     <w:p>
@@ -12947,29 +12777,7 @@
           <w:rFonts w:ascii="Arial" w:hAnsi="Arial" w:eastAsia="Arial Unicode MS" w:cs="Arial"/>
           <w:lang w:val="zh-CN" w:eastAsia="zh-CN"/>
         </w:rPr>
-        <w:t xml:space="preserve">逐份填写标题、作者/机构、年份、URL/DOI、许可及证据、规范引文、中文名/英文名/化学式/别名、文件 SHA、页码可抽查性和</w:t>
-      </w:r>
-      <w:r>
-        <w:rPr>
-          <w:rFonts w:ascii="Arial" w:hAnsi="Arial" w:eastAsia="Arial Unicode MS" w:cs="Arial"/>
-          <w:lang w:val="zh-CN" w:eastAsia="zh-CN"/>
-        </w:rPr>
-        <w:t xml:space="preserve"> </w:t>
-      </w:r>
-      <w:r>
-        <w:rPr>
-          <w:rStyle w:val="VerbatimChar"/>
-          <w:rFonts w:ascii="Arial" w:hAnsi="Arial" w:eastAsia="Arial Unicode MS" w:cs="Arial"/>
-          <w:lang w:val="zh-CN" w:eastAsia="zh-CN"/>
-        </w:rPr>
-        <w:t xml:space="preserve">allowed_for_demo</w:t>
-      </w:r>
-      <w:r>
-        <w:rPr>
-          <w:rFonts w:ascii="Arial" w:hAnsi="Arial" w:eastAsia="Arial Unicode MS" w:cs="Arial"/>
-          <w:lang w:val="zh-CN" w:eastAsia="zh-CN"/>
-        </w:rPr>
-        <w:t xml:space="preserve">。</w:t>
+        <w:t xml:space="preserve">对已收到包运行现有 validator/acceptance 驱动的结构、manifest、hash、许可和 dry-run 检查，保存原始命令、stdout/stderr 与机器环境。</w:t>
       </w:r>
     </w:p>
     <w:p>
@@ -12986,7 +12794,7 @@
           <w:rFonts w:ascii="Arial" w:hAnsi="Arial" w:eastAsia="Arial Unicode MS" w:cs="Arial"/>
           <w:lang w:val="zh-CN" w:eastAsia="zh-CN"/>
         </w:rPr>
-        <w:t xml:space="preserve">按黄睿健批准的 schema 写约 20 条问题：直接命中、中文/英文/化学式/别名、错材料、无证据、prompt injection。</w:t>
+        <w:t xml:space="preserve">协助整理候选来源、页码抽查和问题标注；模糊许可证交徐皓彬与郑煜坤判断，不自行批准。</w:t>
       </w:r>
     </w:p>
     <w:p>
@@ -13003,7 +12811,29 @@
           <w:rFonts w:ascii="Arial" w:hAnsi="Arial" w:eastAsia="Arial Unicode MS" w:cs="Arial"/>
           <w:lang w:val="zh-CN" w:eastAsia="zh-CN"/>
         </w:rPr>
-        <w:t xml:space="preserve">正例标记预期文档和原始页码；负例写明不能出现的文档。</w:t>
+        <w:t xml:space="preserve">缺全文、embedding、索引或观测结果时只记</w:t>
+      </w:r>
+      <w:r>
+        <w:rPr>
+          <w:rFonts w:ascii="Arial" w:hAnsi="Arial" w:eastAsia="Arial Unicode MS" w:cs="Arial"/>
+          <w:lang w:val="zh-CN" w:eastAsia="zh-CN"/>
+        </w:rPr>
+        <w:t xml:space="preserve"> </w:t>
+      </w:r>
+      <w:r>
+        <w:rPr>
+          <w:rStyle w:val="VerbatimChar"/>
+          <w:rFonts w:ascii="Arial" w:hAnsi="Arial" w:eastAsia="Arial Unicode MS" w:cs="Arial"/>
+          <w:lang w:val="zh-CN" w:eastAsia="zh-CN"/>
+        </w:rPr>
+        <w:t xml:space="preserve">BLOCKED/NOT_EVALUATED</w:t>
+      </w:r>
+      <w:r>
+        <w:rPr>
+          <w:rFonts w:ascii="Arial" w:hAnsi="Arial" w:eastAsia="Arial Unicode MS" w:cs="Arial"/>
+          <w:lang w:val="zh-CN" w:eastAsia="zh-CN"/>
+        </w:rPr>
+        <w:t xml:space="preserve">，不得补造或把脚手架写成通过。</w:t>
       </w:r>
     </w:p>
     <w:p>
@@ -13020,7 +12850,7 @@
           <w:rFonts w:ascii="Arial" w:hAnsi="Arial" w:eastAsia="Arial Unicode MS" w:cs="Arial"/>
           <w:lang w:val="zh-CN" w:eastAsia="zh-CN"/>
         </w:rPr>
-        <w:t xml:space="preserve">与黄睿健结对摄取两份文档，记录 request ID、预期、实际、引用页码和失败原因。</w:t>
+        <w:t xml:space="preserve">每批结果由姚承志执行核对、徐皓彬做 RAG 技术复核、郑煜坤做最终状态与发布审核。</w:t>
       </w:r>
     </w:p>
     <w:p>
@@ -13030,19 +12860,10 @@
       </w:pPr>
       <w:r>
         <w:rPr>
-          <w:bCs/>
-          <w:rFonts w:ascii="Arial" w:hAnsi="Arial" w:eastAsia="Arial Unicode MS" w:cs="Arial"/>
-          <w:b/>
-          <w:lang w:val="zh-CN" w:eastAsia="zh-CN"/>
-        </w:rPr>
-        <w:t xml:space="preserve">文件边界</w:t>
-      </w:r>
-      <w:r>
-        <w:rPr>
-          <w:rFonts w:ascii="Arial" w:hAnsi="Arial" w:eastAsia="Arial Unicode MS" w:cs="Arial"/>
-          <w:lang w:val="zh-CN" w:eastAsia="zh-CN"/>
-        </w:rPr>
-        <w:t xml:space="preserve">：只填写批准后的 manifest 和 questions 数据文件；原始 PDF/网页快照放被忽略目录。不得改 Python、迁移、依赖或核心配置；不得自己判断模糊许可证；不得提交论文、数据库、FAISS、模型、Key 或绝对路径；不得使用</w:t>
+          <w:rFonts w:ascii="Arial" w:hAnsi="Arial" w:eastAsia="Arial Unicode MS" w:cs="Arial"/>
+          <w:lang w:val="zh-CN" w:eastAsia="zh-CN"/>
+        </w:rPr>
+        <w:t xml:space="preserve">只修改批准后的 manifest/questions/验收记录或独立小脚本；不得提交论文、数据库、FAISS、模型、Key、</w:t>
       </w:r>
       <w:r>
         <w:rPr>
@@ -13053,6 +12874,20 @@
       </w:r>
       <w:r>
         <w:rPr>
+          <w:rFonts w:ascii="Arial" w:hAnsi="Arial" w:eastAsia="Arial Unicode MS" w:cs="Arial"/>
+          <w:lang w:val="zh-CN" w:eastAsia="zh-CN"/>
+        </w:rPr>
+        <w:t xml:space="preserve">绝对路径或使用</w:t>
+      </w:r>
+      <w:r>
+        <w:rPr>
+          <w:rFonts w:ascii="Arial" w:hAnsi="Arial" w:eastAsia="Arial Unicode MS" w:cs="Arial"/>
+          <w:lang w:val="zh-CN" w:eastAsia="zh-CN"/>
+        </w:rPr>
+        <w:t xml:space="preserve"> </w:t>
+      </w:r>
+      <w:r>
+        <w:rPr>
           <w:rStyle w:val="VerbatimChar"/>
           <w:rFonts w:ascii="Arial" w:hAnsi="Arial" w:eastAsia="Arial Unicode MS" w:cs="Arial"/>
           <w:lang w:val="zh-CN" w:eastAsia="zh-CN"/>
@@ -13064,11 +12899,11 @@
           <w:rFonts w:ascii="Arial" w:hAnsi="Arial" w:eastAsia="Arial Unicode MS" w:cs="Arial"/>
           <w:lang w:val="zh-CN" w:eastAsia="zh-CN"/>
         </w:rPr>
-        <w:t xml:space="preserve">。</w:t>
-      </w:r>
-    </w:p>
-    <w:bookmarkEnd w:id="47"/>
-    <w:bookmarkStart w:id="48" w:name="徐皓彬与-yukun-的协作边界"/>
+        <w:t xml:space="preserve">，不得替 A/B/D 做算法签字。</w:t>
+      </w:r>
+    </w:p>
+    <w:bookmarkEnd w:id="48"/>
+    <w:bookmarkStart w:id="49" w:name="dc-与-maintainer-的协作边界"/>
     <w:p>
       <w:pPr>
         <w:pStyle w:val="Heading2"/>
@@ -13081,212 +12916,7 @@
           <w:rFonts w:ascii="Arial" w:hAnsi="Arial" w:eastAsia="Arial Unicode MS" w:cs="Arial"/>
           <w:lang w:val="zh-CN" w:eastAsia="zh-CN"/>
         </w:rPr>
-        <w:t xml:space="preserve">10.4 徐皓彬与 Yukun 的协作边界</w:t>
-      </w:r>
-    </w:p>
-    <w:p>
-      <w:pPr>
-        <w:pStyle w:val="FirstParagraph"/>
-        <w:widowControl/>
-      </w:pPr>
-      <w:r>
-        <w:rPr>
-          <w:rFonts w:ascii="Arial" w:hAnsi="Arial" w:eastAsia="Arial Unicode MS" w:cs="Arial"/>
-          <w:lang w:val="zh-CN" w:eastAsia="zh-CN"/>
-        </w:rPr>
-        <w:t xml:space="preserve">徐皓彬负责</w:t>
-      </w:r>
-      <w:r>
-        <w:rPr>
-          <w:rFonts w:ascii="Arial" w:hAnsi="Arial" w:eastAsia="Arial Unicode MS" w:cs="Arial"/>
-          <w:lang w:val="zh-CN" w:eastAsia="zh-CN"/>
-        </w:rPr>
-        <w:t xml:space="preserve"> </w:t>
-      </w:r>
-      <w:r>
-        <w:rPr>
-          <w:rStyle w:val="VerbatimChar"/>
-          <w:rFonts w:ascii="Arial" w:hAnsi="Arial" w:eastAsia="Arial Unicode MS" w:cs="Arial"/>
-          <w:lang w:val="zh-CN" w:eastAsia="zh-CN"/>
-        </w:rPr>
-        <w:t xml:space="preserve">app/rag/**</w:t>
-      </w:r>
-      <w:r>
-        <w:rPr>
-          <w:rFonts w:ascii="Arial" w:hAnsi="Arial" w:eastAsia="Arial Unicode MS" w:cs="Arial"/>
-          <w:lang w:val="zh-CN" w:eastAsia="zh-CN"/>
-        </w:rPr>
-        <w:t xml:space="preserve">、</w:t>
-      </w:r>
-      <w:r>
-        <w:rPr>
-          <w:rStyle w:val="VerbatimChar"/>
-          <w:rFonts w:ascii="Arial" w:hAnsi="Arial" w:eastAsia="Arial Unicode MS" w:cs="Arial"/>
-          <w:lang w:val="zh-CN" w:eastAsia="zh-CN"/>
-        </w:rPr>
-        <w:t xml:space="preserve">app/agent/**</w:t>
-      </w:r>
-      <w:r>
-        <w:rPr>
-          <w:rFonts w:ascii="Arial" w:hAnsi="Arial" w:eastAsia="Arial Unicode MS" w:cs="Arial"/>
-          <w:lang w:val="zh-CN" w:eastAsia="zh-CN"/>
-        </w:rPr>
-        <w:t xml:space="preserve"> </w:t>
-      </w:r>
-      <w:r>
-        <w:rPr>
-          <w:rFonts w:ascii="Arial" w:hAnsi="Arial" w:eastAsia="Arial Unicode MS" w:cs="Arial"/>
-          <w:lang w:val="zh-CN" w:eastAsia="zh-CN"/>
-        </w:rPr>
-        <w:t xml:space="preserve">和对应测试，先完成固定资产和真实评测，只在失败证据指向代码时修改现有实现。公共 DTO、API、数据库、租户、存储或 Compose 变化必须先交 Yukun 评审。</w:t>
-      </w:r>
-    </w:p>
-    <w:p>
-      <w:pPr>
-        <w:pStyle w:val="BodyText"/>
-        <w:widowControl/>
-      </w:pPr>
-      <w:r>
-        <w:rPr>
-          <w:rFonts w:ascii="Arial" w:hAnsi="Arial" w:eastAsia="Arial Unicode MS" w:cs="Arial"/>
-          <w:lang w:val="zh-CN" w:eastAsia="zh-CN"/>
-        </w:rPr>
-        <w:t xml:space="preserve">Yukun 负责</w:t>
-      </w:r>
-      <w:r>
-        <w:rPr>
-          <w:rFonts w:ascii="Arial" w:hAnsi="Arial" w:eastAsia="Arial Unicode MS" w:cs="Arial"/>
-          <w:lang w:val="zh-CN" w:eastAsia="zh-CN"/>
-        </w:rPr>
-        <w:t xml:space="preserve"> </w:t>
-      </w:r>
-      <w:r>
-        <w:rPr>
-          <w:rStyle w:val="VerbatimChar"/>
-          <w:rFonts w:ascii="Arial" w:hAnsi="Arial" w:eastAsia="Arial Unicode MS" w:cs="Arial"/>
-          <w:lang w:val="zh-CN" w:eastAsia="zh-CN"/>
-        </w:rPr>
-        <w:t xml:space="preserve">app/api/**</w:t>
-      </w:r>
-      <w:r>
-        <w:rPr>
-          <w:rFonts w:ascii="Arial" w:hAnsi="Arial" w:eastAsia="Arial Unicode MS" w:cs="Arial"/>
-          <w:lang w:val="zh-CN" w:eastAsia="zh-CN"/>
-        </w:rPr>
-        <w:t xml:space="preserve">、</w:t>
-      </w:r>
-      <w:r>
-        <w:rPr>
-          <w:rStyle w:val="VerbatimChar"/>
-          <w:rFonts w:ascii="Arial" w:hAnsi="Arial" w:eastAsia="Arial Unicode MS" w:cs="Arial"/>
-          <w:lang w:val="zh-CN" w:eastAsia="zh-CN"/>
-        </w:rPr>
-        <w:t xml:space="preserve">app/core/**</w:t>
-      </w:r>
-      <w:r>
-        <w:rPr>
-          <w:rFonts w:ascii="Arial" w:hAnsi="Arial" w:eastAsia="Arial Unicode MS" w:cs="Arial"/>
-          <w:lang w:val="zh-CN" w:eastAsia="zh-CN"/>
-        </w:rPr>
-        <w:t xml:space="preserve">、</w:t>
-      </w:r>
-      <w:r>
-        <w:rPr>
-          <w:rStyle w:val="VerbatimChar"/>
-          <w:rFonts w:ascii="Arial" w:hAnsi="Arial" w:eastAsia="Arial Unicode MS" w:cs="Arial"/>
-          <w:lang w:val="zh-CN" w:eastAsia="zh-CN"/>
-        </w:rPr>
-        <w:t xml:space="preserve">app/db/**</w:t>
-      </w:r>
-      <w:r>
-        <w:rPr>
-          <w:rFonts w:ascii="Arial" w:hAnsi="Arial" w:eastAsia="Arial Unicode MS" w:cs="Arial"/>
-          <w:lang w:val="zh-CN" w:eastAsia="zh-CN"/>
-        </w:rPr>
-        <w:t xml:space="preserve">、</w:t>
-      </w:r>
-      <w:r>
-        <w:rPr>
-          <w:rStyle w:val="VerbatimChar"/>
-          <w:rFonts w:ascii="Arial" w:hAnsi="Arial" w:eastAsia="Arial Unicode MS" w:cs="Arial"/>
-          <w:lang w:val="zh-CN" w:eastAsia="zh-CN"/>
-        </w:rPr>
-        <w:t xml:space="preserve">app/storage/**</w:t>
-      </w:r>
-      <w:r>
-        <w:rPr>
-          <w:rFonts w:ascii="Arial" w:hAnsi="Arial" w:eastAsia="Arial Unicode MS" w:cs="Arial"/>
-          <w:lang w:val="zh-CN" w:eastAsia="zh-CN"/>
-        </w:rPr>
-        <w:t xml:space="preserve">、</w:t>
-      </w:r>
-      <w:r>
-        <w:rPr>
-          <w:rStyle w:val="VerbatimChar"/>
-          <w:rFonts w:ascii="Arial" w:hAnsi="Arial" w:eastAsia="Arial Unicode MS" w:cs="Arial"/>
-          <w:lang w:val="zh-CN" w:eastAsia="zh-CN"/>
-        </w:rPr>
-        <w:t xml:space="preserve">app/orchestration/**</w:t>
-      </w:r>
-      <w:r>
-        <w:rPr>
-          <w:rFonts w:ascii="Arial" w:hAnsi="Arial" w:eastAsia="Arial Unicode MS" w:cs="Arial"/>
-          <w:lang w:val="zh-CN" w:eastAsia="zh-CN"/>
-        </w:rPr>
-        <w:t xml:space="preserve"> </w:t>
-      </w:r>
-      <w:r>
-        <w:rPr>
-          <w:rFonts w:ascii="Arial" w:hAnsi="Arial" w:eastAsia="Arial Unicode MS" w:cs="Arial"/>
-          <w:lang w:val="zh-CN" w:eastAsia="zh-CN"/>
-        </w:rPr>
-        <w:t xml:space="preserve">和</w:t>
-      </w:r>
-      <w:r>
-        <w:rPr>
-          <w:rFonts w:ascii="Arial" w:hAnsi="Arial" w:eastAsia="Arial Unicode MS" w:cs="Arial"/>
-          <w:lang w:val="zh-CN" w:eastAsia="zh-CN"/>
-        </w:rPr>
-        <w:t xml:space="preserve"> </w:t>
-      </w:r>
-      <w:r>
-        <w:rPr>
-          <w:rStyle w:val="VerbatimChar"/>
-          <w:rFonts w:ascii="Arial" w:hAnsi="Arial" w:eastAsia="Arial Unicode MS" w:cs="Arial"/>
-          <w:lang w:val="zh-CN" w:eastAsia="zh-CN"/>
-        </w:rPr>
-        <w:t xml:space="preserve">app/main.py</w:t>
-      </w:r>
-      <w:r>
-        <w:rPr>
-          <w:rFonts w:ascii="Arial" w:hAnsi="Arial" w:eastAsia="Arial Unicode MS" w:cs="Arial"/>
-          <w:lang w:val="zh-CN" w:eastAsia="zh-CN"/>
-        </w:rPr>
-        <w:t xml:space="preserve"> </w:t>
-      </w:r>
-      <w:r>
-        <w:rPr>
-          <w:rFonts w:ascii="Arial" w:hAnsi="Arial" w:eastAsia="Arial Unicode MS" w:cs="Arial"/>
-          <w:lang w:val="zh-CN" w:eastAsia="zh-CN"/>
-        </w:rPr>
-        <w:t xml:space="preserve">的集成边界，维护 Alembic/OpenAPI/安全合同，不与 D 同时无协调地改启动装配。知识租户化、quota/retention 与多副本另开独立切片，不混入首周资产 PR。</w:t>
-      </w:r>
-    </w:p>
-    <w:bookmarkEnd w:id="48"/>
-    <w:bookmarkStart w:id="49" w:name="其他现有角色的首周边界"/>
-    <w:p>
-      <w:pPr>
-        <w:pStyle w:val="Heading2"/>
-        <w:keepNext/>
-        <w:keepLines/>
-        <w:widowControl/>
-      </w:pPr>
-      <w:r>
-        <w:rPr>
-          <w:rFonts w:ascii="Arial" w:hAnsi="Arial" w:eastAsia="Arial Unicode MS" w:cs="Arial"/>
-          <w:lang w:val="zh-CN" w:eastAsia="zh-CN"/>
-        </w:rPr>
-        <w:t xml:space="preserve">10.5 其他现有角色的首周边界</w:t>
+        <w:t xml:space="preserve">10.4 D、C 与 Maintainer 的协作边界</w:t>
       </w:r>
     </w:p>
     <w:p>
@@ -13303,7 +12933,7 @@
           <w:rFonts w:ascii="Arial" w:hAnsi="Arial" w:eastAsia="Arial Unicode MS" w:cs="Arial"/>
           <w:lang w:val="zh-CN" w:eastAsia="zh-CN"/>
         </w:rPr>
-        <w:t xml:space="preserve">郭境濠 A+B：只选一个许可清楚的真实分割模型，补齐 registry/config/model card/SHA 和独立验证集；不得提交权重或用假 mask 宣称完成。</w:t>
+        <w:t xml:space="preserve">徐皓彬（D）负责检索实现、语料/embedding 身份、题集和技术结果。</w:t>
       </w:r>
     </w:p>
     <w:p>
@@ -13320,7 +12950,7 @@
           <w:rFonts w:ascii="Arial" w:hAnsi="Arial" w:eastAsia="Arial Unicode MS" w:cs="Arial"/>
           <w:lang w:val="zh-CN" w:eastAsia="zh-CN"/>
         </w:rPr>
-        <w:t xml:space="preserve">杨雨宁 E：从</w:t>
+        <w:t xml:space="preserve">黄睿健（C）负责</w:t>
       </w:r>
       <w:r>
         <w:rPr>
@@ -13335,7 +12965,14 @@
           <w:rFonts w:ascii="Arial" w:hAnsi="Arial" w:eastAsia="Arial Unicode MS" w:cs="Arial"/>
           <w:lang w:val="zh-CN" w:eastAsia="zh-CN"/>
         </w:rPr>
-        <w:t xml:space="preserve">yukun</w:t>
+        <w:t xml:space="preserve">app/api/**</w:t>
+      </w:r>
+      <w:r>
+        <w:rPr>
+          <w:rFonts w:ascii="Arial" w:hAnsi="Arial" w:eastAsia="Arial Unicode MS" w:cs="Arial"/>
+          <w:lang w:val="zh-CN" w:eastAsia="zh-CN"/>
+        </w:rPr>
+        <w:t xml:space="preserve">、数据库/存储/启动装配、目标 Linux 环境、HTTPS、备份恢复和私有资产</w:t>
       </w:r>
       <w:r>
         <w:rPr>
@@ -13349,15 +12986,45 @@
           <w:rFonts w:ascii="Arial" w:hAnsi="Arial" w:eastAsia="Arial Unicode MS" w:cs="Arial"/>
           <w:lang w:val="zh-CN" w:eastAsia="zh-CN"/>
         </w:rPr>
-        <w:t xml:space="preserve">拉独立前端分支，用 API fixture 完善六页 loading/empty/401/429/503 与 keyword-only 提示；不因外部模型未到而等待，也不修改后端 DTO。</w:t>
+        <w:t xml:space="preserve">只读挂载；不修改检索排序或以容器启动替代真实 RAG 验收。</w:t>
+      </w:r>
+    </w:p>
+    <w:p>
+      <w:pPr>
+        <w:widowControl/>
+        <w:numPr>
+          <w:ilvl w:val="0"/>
+          <w:numId w:val="1014"/>
+        </w:numPr>
+        <w:pStyle w:val="Compact"/>
+      </w:pPr>
+      <w:r>
+        <w:rPr>
+          <w:rFonts w:ascii="Arial" w:hAnsi="Arial" w:eastAsia="Arial Unicode MS" w:cs="Arial"/>
+          <w:lang w:val="zh-CN" w:eastAsia="zh-CN"/>
+        </w:rPr>
+        <w:t xml:space="preserve">郑煜坤负责公共合同、许可与完成状态的最终评审。知识租户化、quota/retention 与多副本另开切片，</w:t>
+      </w:r>
+      <w:r>
+        <w:rPr>
+          <w:rFonts w:ascii="Arial" w:hAnsi="Arial" w:eastAsia="Arial Unicode MS" w:cs="Arial"/>
+          <w:lang w:val="zh-CN" w:eastAsia="zh-CN"/>
+        </w:rPr>
+        <w:t xml:space="preserve"> </w:t>
+      </w:r>
+      <w:r>
+        <w:rPr>
+          <w:rFonts w:ascii="Arial" w:hAnsi="Arial" w:eastAsia="Arial Unicode MS" w:cs="Arial"/>
+          <w:lang w:val="zh-CN" w:eastAsia="zh-CN"/>
+        </w:rPr>
+        <w:t xml:space="preserve">不混入首个真实资产 PR。</w:t>
       </w:r>
     </w:p>
     <w:bookmarkEnd w:id="49"/>
-    <w:bookmarkEnd w:id="50"/>
-    <w:bookmarkStart w:id="51" w:name="git评审与完成定义"/>
-    <w:p>
-      <w:pPr>
-        <w:pStyle w:val="Heading1"/>
+    <w:bookmarkStart w:id="50" w:name="其他角色的当前边界"/>
+    <w:p>
+      <w:pPr>
+        <w:pStyle w:val="Heading2"/>
         <w:keepNext/>
         <w:keepLines/>
         <w:widowControl/>
@@ -13367,237 +13034,7 @@
           <w:rFonts w:ascii="Arial" w:hAnsi="Arial" w:eastAsia="Arial Unicode MS" w:cs="Arial"/>
           <w:lang w:val="zh-CN" w:eastAsia="zh-CN"/>
         </w:rPr>
-        <w:t xml:space="preserve">11. Git、评审与完成定义</w:t>
-      </w:r>
-    </w:p>
-    <w:p>
-      <w:pPr>
-        <w:pStyle w:val="FirstParagraph"/>
-        <w:widowControl/>
-      </w:pPr>
-      <w:r>
-        <w:rPr>
-          <w:rFonts w:ascii="Arial" w:hAnsi="Arial" w:eastAsia="Arial Unicode MS" w:cs="Arial"/>
-          <w:lang w:val="zh-CN" w:eastAsia="zh-CN"/>
-        </w:rPr>
-        <w:t xml:space="preserve">当前仓库只保留长期分支</w:t>
-      </w:r>
-      <w:r>
-        <w:rPr>
-          <w:rFonts w:ascii="Arial" w:hAnsi="Arial" w:eastAsia="Arial Unicode MS" w:cs="Arial"/>
-          <w:lang w:val="zh-CN" w:eastAsia="zh-CN"/>
-        </w:rPr>
-        <w:t xml:space="preserve"> </w:t>
-      </w:r>
-      <w:r>
-        <w:rPr>
-          <w:rStyle w:val="VerbatimChar"/>
-          <w:rFonts w:ascii="Arial" w:hAnsi="Arial" w:eastAsia="Arial Unicode MS" w:cs="Arial"/>
-          <w:lang w:val="zh-CN" w:eastAsia="zh-CN"/>
-        </w:rPr>
-        <w:t xml:space="preserve">main</w:t>
-      </w:r>
-      <w:r>
-        <w:rPr>
-          <w:rFonts w:ascii="Arial" w:hAnsi="Arial" w:eastAsia="Arial Unicode MS" w:cs="Arial"/>
-          <w:lang w:val="zh-CN" w:eastAsia="zh-CN"/>
-        </w:rPr>
-        <w:t xml:space="preserve"> </w:t>
-      </w:r>
-      <w:r>
-        <w:rPr>
-          <w:rFonts w:ascii="Arial" w:hAnsi="Arial" w:eastAsia="Arial Unicode MS" w:cs="Arial"/>
-          <w:lang w:val="zh-CN" w:eastAsia="zh-CN"/>
-        </w:rPr>
-        <w:t xml:space="preserve">和</w:t>
-      </w:r>
-      <w:r>
-        <w:rPr>
-          <w:rFonts w:ascii="Arial" w:hAnsi="Arial" w:eastAsia="Arial Unicode MS" w:cs="Arial"/>
-          <w:lang w:val="zh-CN" w:eastAsia="zh-CN"/>
-        </w:rPr>
-        <w:t xml:space="preserve"> </w:t>
-      </w:r>
-      <w:r>
-        <w:rPr>
-          <w:rStyle w:val="VerbatimChar"/>
-          <w:rFonts w:ascii="Arial" w:hAnsi="Arial" w:eastAsia="Arial Unicode MS" w:cs="Arial"/>
-          <w:lang w:val="zh-CN" w:eastAsia="zh-CN"/>
-        </w:rPr>
-        <w:t xml:space="preserve">yukun</w:t>
-      </w:r>
-      <w:r>
-        <w:rPr>
-          <w:rFonts w:ascii="Arial" w:hAnsi="Arial" w:eastAsia="Arial Unicode MS" w:cs="Arial"/>
-          <w:lang w:val="zh-CN" w:eastAsia="zh-CN"/>
-        </w:rPr>
-        <w:t xml:space="preserve">。后续开发者可以创建短期功能分支，但应从</w:t>
-      </w:r>
-      <w:r>
-        <w:rPr>
-          <w:rFonts w:ascii="Arial" w:hAnsi="Arial" w:eastAsia="Arial Unicode MS" w:cs="Arial"/>
-          <w:lang w:val="zh-CN" w:eastAsia="zh-CN"/>
-        </w:rPr>
-        <w:t xml:space="preserve"> </w:t>
-      </w:r>
-      <w:r>
-        <w:rPr>
-          <w:rStyle w:val="VerbatimChar"/>
-          <w:rFonts w:ascii="Arial" w:hAnsi="Arial" w:eastAsia="Arial Unicode MS" w:cs="Arial"/>
-          <w:lang w:val="zh-CN" w:eastAsia="zh-CN"/>
-        </w:rPr>
-        <w:t xml:space="preserve">yukun</w:t>
-      </w:r>
-      <w:r>
-        <w:rPr>
-          <w:rFonts w:ascii="Arial" w:hAnsi="Arial" w:eastAsia="Arial Unicode MS" w:cs="Arial"/>
-          <w:lang w:val="zh-CN" w:eastAsia="zh-CN"/>
-        </w:rPr>
-        <w:t xml:space="preserve"> </w:t>
-      </w:r>
-      <w:r>
-        <w:rPr>
-          <w:rFonts w:ascii="Arial" w:hAnsi="Arial" w:eastAsia="Arial Unicode MS" w:cs="Arial"/>
-          <w:lang w:val="zh-CN" w:eastAsia="zh-CN"/>
-        </w:rPr>
-        <w:t xml:space="preserve">创建并通过 PR 合回</w:t>
-      </w:r>
-      <w:r>
-        <w:rPr>
-          <w:rFonts w:ascii="Arial" w:hAnsi="Arial" w:eastAsia="Arial Unicode MS" w:cs="Arial"/>
-          <w:lang w:val="zh-CN" w:eastAsia="zh-CN"/>
-        </w:rPr>
-        <w:t xml:space="preserve"> </w:t>
-      </w:r>
-      <w:r>
-        <w:rPr>
-          <w:rStyle w:val="VerbatimChar"/>
-          <w:rFonts w:ascii="Arial" w:hAnsi="Arial" w:eastAsia="Arial Unicode MS" w:cs="Arial"/>
-          <w:lang w:val="zh-CN" w:eastAsia="zh-CN"/>
-        </w:rPr>
-        <w:t xml:space="preserve">yukun</w:t>
-      </w:r>
-      <w:r>
-        <w:rPr>
-          <w:rFonts w:ascii="Arial" w:hAnsi="Arial" w:eastAsia="Arial Unicode MS" w:cs="Arial"/>
-          <w:lang w:val="zh-CN" w:eastAsia="zh-CN"/>
-        </w:rPr>
-        <w:t xml:space="preserve">；未获项目负责人明确指令前，不直接改或合并</w:t>
-      </w:r>
-      <w:r>
-        <w:rPr>
-          <w:rFonts w:ascii="Arial" w:hAnsi="Arial" w:eastAsia="Arial Unicode MS" w:cs="Arial"/>
-          <w:lang w:val="zh-CN" w:eastAsia="zh-CN"/>
-        </w:rPr>
-        <w:t xml:space="preserve"> </w:t>
-      </w:r>
-      <w:r>
-        <w:rPr>
-          <w:rStyle w:val="VerbatimChar"/>
-          <w:rFonts w:ascii="Arial" w:hAnsi="Arial" w:eastAsia="Arial Unicode MS" w:cs="Arial"/>
-          <w:lang w:val="zh-CN" w:eastAsia="zh-CN"/>
-        </w:rPr>
-        <w:t xml:space="preserve">main</w:t>
-      </w:r>
-      <w:r>
-        <w:rPr>
-          <w:rFonts w:ascii="Arial" w:hAnsi="Arial" w:eastAsia="Arial Unicode MS" w:cs="Arial"/>
-          <w:lang w:val="zh-CN" w:eastAsia="zh-CN"/>
-        </w:rPr>
-        <w:t xml:space="preserve">。</w:t>
-      </w:r>
-    </w:p>
-    <w:p>
-      <w:pPr>
-        <w:pStyle w:val="BodyText"/>
-        <w:widowControl/>
-      </w:pPr>
-      <w:r>
-        <w:rPr>
-          <w:rFonts w:ascii="Arial" w:hAnsi="Arial" w:eastAsia="Arial Unicode MS" w:cs="Arial"/>
-          <w:lang w:val="zh-CN" w:eastAsia="zh-CN"/>
-        </w:rPr>
-        <w:t xml:space="preserve">建议分支名：</w:t>
-      </w:r>
-    </w:p>
-    <w:p>
-      <w:pPr>
-        <w:pStyle w:val="SourceCode"/>
-        <w:keepLines/>
-        <w:widowControl/>
-      </w:pPr>
-      <w:r>
-        <w:rPr>
-          <w:rStyle w:val="VerbatimChar"/>
-          <w:rFonts w:ascii="Menlo" w:hAnsi="Menlo" w:eastAsia="Arial Unicode MS" w:cs="Menlo"/>
-          <w:sz w:val="16"/>
-          <w:lang w:val="zh-CN" w:eastAsia="zh-CN"/>
-        </w:rPr>
-        <w:t xml:space="preserve">feat/d-rag-real-embedding</w:t>
-      </w:r>
-      <w:r>
-        <w:rPr>
-          <w:rFonts w:ascii="Menlo" w:hAnsi="Menlo" w:eastAsia="Arial Unicode MS" w:cs="Menlo"/>
-          <w:sz w:val="16"/>
-          <w:lang w:val="zh-CN" w:eastAsia="zh-CN"/>
-        </w:rPr>
-        <w:br/>
-      </w:r>
-      <w:r>
-        <w:rPr>
-          <w:rStyle w:val="VerbatimChar"/>
-          <w:rFonts w:ascii="Menlo" w:hAnsi="Menlo" w:eastAsia="Arial Unicode MS" w:cs="Menlo"/>
-          <w:sz w:val="16"/>
-          <w:lang w:val="zh-CN" w:eastAsia="zh-CN"/>
-        </w:rPr>
-        <w:t xml:space="preserve">test/f-rag-asset-validation</w:t>
-      </w:r>
-      <w:r>
-        <w:rPr>
-          <w:rFonts w:ascii="Menlo" w:hAnsi="Menlo" w:eastAsia="Arial Unicode MS" w:cs="Menlo"/>
-          <w:sz w:val="16"/>
-          <w:lang w:val="zh-CN" w:eastAsia="zh-CN"/>
-        </w:rPr>
-        <w:br/>
-      </w:r>
-      <w:r>
-        <w:rPr>
-          <w:rStyle w:val="VerbatimChar"/>
-          <w:rFonts w:ascii="Menlo" w:hAnsi="Menlo" w:eastAsia="Arial Unicode MS" w:cs="Menlo"/>
-          <w:sz w:val="16"/>
-          <w:lang w:val="zh-CN" w:eastAsia="zh-CN"/>
-        </w:rPr>
-        <w:t xml:space="preserve">data/yao-rag-eval-seed</w:t>
-      </w:r>
-      <w:r>
-        <w:rPr>
-          <w:rFonts w:ascii="Menlo" w:hAnsi="Menlo" w:eastAsia="Arial Unicode MS" w:cs="Menlo"/>
-          <w:sz w:val="16"/>
-          <w:lang w:val="zh-CN" w:eastAsia="zh-CN"/>
-        </w:rPr>
-        <w:br/>
-      </w:r>
-      <w:r>
-        <w:rPr>
-          <w:rStyle w:val="VerbatimChar"/>
-          <w:rFonts w:ascii="Menlo" w:hAnsi="Menlo" w:eastAsia="Arial Unicode MS" w:cs="Menlo"/>
-          <w:sz w:val="16"/>
-          <w:lang w:val="zh-CN" w:eastAsia="zh-CN"/>
-        </w:rPr>
-        <w:t xml:space="preserve">feat/e-frontend-status-states</w:t>
-      </w:r>
-    </w:p>
-    <w:p>
-      <w:pPr>
-        <w:pStyle w:val="FirstParagraph"/>
-        <w:widowControl/>
-      </w:pPr>
-      <w:r>
-        <w:rPr>
-          <w:rFonts w:ascii="Arial" w:hAnsi="Arial" w:eastAsia="Arial Unicode MS" w:cs="Arial"/>
-          <w:lang w:val="zh-CN" w:eastAsia="zh-CN"/>
-        </w:rPr>
-        <w:t xml:space="preserve">每个 PR 只做一个行为切片，并包含：</w:t>
+        <w:t xml:space="preserve">10.5 其他角色的当前边界</w:t>
       </w:r>
     </w:p>
     <w:p>
@@ -13614,7 +13051,7 @@
           <w:rFonts w:ascii="Arial" w:hAnsi="Arial" w:eastAsia="Arial Unicode MS" w:cs="Arial"/>
           <w:lang w:val="zh-CN" w:eastAsia="zh-CN"/>
         </w:rPr>
-        <w:t xml:space="preserve">基线 commit、变更范围和明确非目标；</w:t>
+        <w:t xml:space="preserve">郭境濠 A+B：交付真实分割模型的私有 bundle、固定独立集和科学证据；不进入 RAG 实现。</w:t>
       </w:r>
     </w:p>
     <w:p>
@@ -13631,75 +13068,68 @@
           <w:rFonts w:ascii="Arial" w:hAnsi="Arial" w:eastAsia="Arial Unicode MS" w:cs="Arial"/>
           <w:lang w:val="zh-CN" w:eastAsia="zh-CN"/>
         </w:rPr>
-        <w:t xml:space="preserve">可复制的窄测试与结果；</w:t>
-      </w:r>
-    </w:p>
-    <w:p>
-      <w:pPr>
-        <w:widowControl/>
-        <w:numPr>
-          <w:ilvl w:val="0"/>
-          <w:numId w:val="1015"/>
-        </w:numPr>
-        <w:pStyle w:val="Compact"/>
-      </w:pPr>
-      <w:r>
-        <w:rPr>
-          <w:rFonts w:ascii="Arial" w:hAnsi="Arial" w:eastAsia="Arial Unicode MS" w:cs="Arial"/>
-          <w:lang w:val="zh-CN" w:eastAsia="zh-CN"/>
-        </w:rPr>
-        <w:t xml:space="preserve">新增/变化的资产身份、许可证和外部依赖；</w:t>
-      </w:r>
-    </w:p>
-    <w:p>
-      <w:pPr>
-        <w:widowControl/>
-        <w:numPr>
-          <w:ilvl w:val="0"/>
-          <w:numId w:val="1015"/>
-        </w:numPr>
-        <w:pStyle w:val="Compact"/>
-      </w:pPr>
-      <w:r>
-        <w:rPr>
-          <w:rFonts w:ascii="Arial" w:hAnsi="Arial" w:eastAsia="Arial Unicode MS" w:cs="Arial"/>
-          <w:lang w:val="zh-CN" w:eastAsia="zh-CN"/>
-        </w:rPr>
-        <w:t xml:space="preserve">失败/降级行为；</w:t>
-      </w:r>
-    </w:p>
-    <w:p>
-      <w:pPr>
-        <w:widowControl/>
-        <w:numPr>
-          <w:ilvl w:val="0"/>
-          <w:numId w:val="1015"/>
-        </w:numPr>
-        <w:pStyle w:val="Compact"/>
-      </w:pPr>
-      <w:r>
-        <w:rPr>
-          <w:rFonts w:ascii="Arial" w:hAnsi="Arial" w:eastAsia="Arial Unicode MS" w:cs="Arial"/>
-          <w:lang w:val="zh-CN" w:eastAsia="zh-CN"/>
-        </w:rPr>
-        <w:t xml:space="preserve">是否改变公共 DTO、数据库、OpenAPI、Compose 或秘密边界；</w:t>
-      </w:r>
-    </w:p>
-    <w:p>
-      <w:pPr>
-        <w:widowControl/>
-        <w:numPr>
-          <w:ilvl w:val="0"/>
-          <w:numId w:val="1015"/>
-        </w:numPr>
-        <w:pStyle w:val="Compact"/>
-      </w:pPr>
-      <w:r>
-        <w:rPr>
-          <w:rFonts w:ascii="Arial" w:hAnsi="Arial" w:eastAsia="Arial Unicode MS" w:cs="Arial"/>
-          <w:lang w:val="zh-CN" w:eastAsia="zh-CN"/>
-        </w:rPr>
-        <w:t xml:space="preserve">不包含权重、语料全文、数据库、索引、秘密、本机路径和无关格式化。</w:t>
+        <w:t xml:space="preserve">杨雨宁 E：从最新全绿</w:t>
+      </w:r>
+      <w:r>
+        <w:rPr>
+          <w:rFonts w:ascii="Arial" w:hAnsi="Arial" w:eastAsia="Arial Unicode MS" w:cs="Arial"/>
+          <w:lang w:val="zh-CN" w:eastAsia="zh-CN"/>
+        </w:rPr>
+        <w:t xml:space="preserve"> </w:t>
+      </w:r>
+      <w:r>
+        <w:rPr>
+          <w:rStyle w:val="VerbatimChar"/>
+          <w:rFonts w:ascii="Arial" w:hAnsi="Arial" w:eastAsia="Arial Unicode MS" w:cs="Arial"/>
+          <w:lang w:val="zh-CN" w:eastAsia="zh-CN"/>
+        </w:rPr>
+        <w:t xml:space="preserve">origin/main</w:t>
+      </w:r>
+      <w:r>
+        <w:rPr>
+          <w:rFonts w:ascii="Arial" w:hAnsi="Arial" w:eastAsia="Arial Unicode MS" w:cs="Arial"/>
+          <w:lang w:val="zh-CN" w:eastAsia="zh-CN"/>
+        </w:rPr>
+        <w:t xml:space="preserve"> </w:t>
+      </w:r>
+      <w:r>
+        <w:rPr>
+          <w:rFonts w:ascii="Arial" w:hAnsi="Arial" w:eastAsia="Arial Unicode MS" w:cs="Arial"/>
+          <w:lang w:val="zh-CN" w:eastAsia="zh-CN"/>
+        </w:rPr>
+        <w:t xml:space="preserve">建独立前端分支；等后端、至少一个真实模型和 RAG 资产可用后，</w:t>
+      </w:r>
+      <w:r>
+        <w:rPr>
+          <w:rFonts w:ascii="Arial" w:hAnsi="Arial" w:eastAsia="Arial Unicode MS" w:cs="Arial"/>
+          <w:lang w:val="zh-CN" w:eastAsia="zh-CN"/>
+        </w:rPr>
+        <w:t xml:space="preserve"> </w:t>
+      </w:r>
+      <w:r>
+        <w:rPr>
+          <w:rFonts w:ascii="Arial" w:hAnsi="Arial" w:eastAsia="Arial Unicode MS" w:cs="Arial"/>
+          <w:lang w:val="zh-CN" w:eastAsia="zh-CN"/>
+        </w:rPr>
+        <w:t xml:space="preserve">执行固定浏览器 E2E，不在前端伪造成功、重算统计或绕过引用。</w:t>
+      </w:r>
+    </w:p>
+    <w:bookmarkEnd w:id="50"/>
+    <w:bookmarkEnd w:id="51"/>
+    <w:bookmarkStart w:id="52" w:name="git评审与完成定义"/>
+    <w:p>
+      <w:pPr>
+        <w:pStyle w:val="Heading1"/>
+        <w:keepNext/>
+        <w:keepLines/>
+        <w:widowControl/>
+      </w:pPr>
+      <w:r>
+        <w:rPr>
+          <w:rFonts w:ascii="Arial" w:hAnsi="Arial" w:eastAsia="Arial Unicode MS" w:cs="Arial"/>
+          <w:lang w:val="zh-CN" w:eastAsia="zh-CN"/>
+        </w:rPr>
+        <w:t xml:space="preserve">11. Git、评审与完成定义</w:t>
       </w:r>
     </w:p>
     <w:p>
@@ -13712,7 +13142,129 @@
           <w:rFonts w:ascii="Arial" w:hAnsi="Arial" w:eastAsia="Arial Unicode MS" w:cs="Arial"/>
           <w:lang w:val="zh-CN" w:eastAsia="zh-CN"/>
         </w:rPr>
-        <w:t xml:space="preserve">全员合并前至少运行：</w:t>
+        <w:t xml:space="preserve">当前仓库只保留</w:t>
+      </w:r>
+      <w:r>
+        <w:rPr>
+          <w:rFonts w:ascii="Arial" w:hAnsi="Arial" w:eastAsia="Arial Unicode MS" w:cs="Arial"/>
+          <w:lang w:val="zh-CN" w:eastAsia="zh-CN"/>
+        </w:rPr>
+        <w:t xml:space="preserve"> </w:t>
+      </w:r>
+      <w:r>
+        <w:rPr>
+          <w:rStyle w:val="VerbatimChar"/>
+          <w:rFonts w:ascii="Arial" w:hAnsi="Arial" w:eastAsia="Arial Unicode MS" w:cs="Arial"/>
+          <w:lang w:val="zh-CN" w:eastAsia="zh-CN"/>
+        </w:rPr>
+        <w:t xml:space="preserve">main</w:t>
+      </w:r>
+      <w:r>
+        <w:rPr>
+          <w:rFonts w:ascii="Arial" w:hAnsi="Arial" w:eastAsia="Arial Unicode MS" w:cs="Arial"/>
+          <w:lang w:val="zh-CN" w:eastAsia="zh-CN"/>
+        </w:rPr>
+        <w:t xml:space="preserve"> </w:t>
+      </w:r>
+      <w:r>
+        <w:rPr>
+          <w:rFonts w:ascii="Arial" w:hAnsi="Arial" w:eastAsia="Arial Unicode MS" w:cs="Arial"/>
+          <w:lang w:val="zh-CN" w:eastAsia="zh-CN"/>
+        </w:rPr>
+        <w:t xml:space="preserve">作为长期分支。后续开发者创建短期功能分支时，必须从最新全绿</w:t>
+      </w:r>
+      <w:r>
+        <w:rPr>
+          <w:rFonts w:ascii="Arial" w:hAnsi="Arial" w:eastAsia="Arial Unicode MS" w:cs="Arial"/>
+          <w:lang w:val="zh-CN" w:eastAsia="zh-CN"/>
+        </w:rPr>
+        <w:t xml:space="preserve"> </w:t>
+      </w:r>
+      <w:r>
+        <w:rPr>
+          <w:rStyle w:val="VerbatimChar"/>
+          <w:rFonts w:ascii="Arial" w:hAnsi="Arial" w:eastAsia="Arial Unicode MS" w:cs="Arial"/>
+          <w:lang w:val="zh-CN" w:eastAsia="zh-CN"/>
+        </w:rPr>
+        <w:t xml:space="preserve">origin/main</w:t>
+      </w:r>
+      <w:r>
+        <w:rPr>
+          <w:rFonts w:ascii="Arial" w:hAnsi="Arial" w:eastAsia="Arial Unicode MS" w:cs="Arial"/>
+          <w:lang w:val="zh-CN" w:eastAsia="zh-CN"/>
+        </w:rPr>
+        <w:t xml:space="preserve"> </w:t>
+      </w:r>
+      <w:r>
+        <w:rPr>
+          <w:rFonts w:ascii="Arial" w:hAnsi="Arial" w:eastAsia="Arial Unicode MS" w:cs="Arial"/>
+          <w:lang w:val="zh-CN" w:eastAsia="zh-CN"/>
+        </w:rPr>
+        <w:t xml:space="preserve">创建并通过 PR 合回</w:t>
+      </w:r>
+      <w:r>
+        <w:rPr>
+          <w:rFonts w:ascii="Arial" w:hAnsi="Arial" w:eastAsia="Arial Unicode MS" w:cs="Arial"/>
+          <w:lang w:val="zh-CN" w:eastAsia="zh-CN"/>
+        </w:rPr>
+        <w:t xml:space="preserve"> </w:t>
+      </w:r>
+      <w:r>
+        <w:rPr>
+          <w:rStyle w:val="VerbatimChar"/>
+          <w:rFonts w:ascii="Arial" w:hAnsi="Arial" w:eastAsia="Arial Unicode MS" w:cs="Arial"/>
+          <w:lang w:val="zh-CN" w:eastAsia="zh-CN"/>
+        </w:rPr>
+        <w:t xml:space="preserve">main</w:t>
+      </w:r>
+      <w:r>
+        <w:rPr>
+          <w:rFonts w:ascii="Arial" w:hAnsi="Arial" w:eastAsia="Arial Unicode MS" w:cs="Arial"/>
+          <w:lang w:val="zh-CN" w:eastAsia="zh-CN"/>
+        </w:rPr>
+        <w:t xml:space="preserve">；不直接在</w:t>
+      </w:r>
+      <w:r>
+        <w:rPr>
+          <w:rFonts w:ascii="Arial" w:hAnsi="Arial" w:eastAsia="Arial Unicode MS" w:cs="Arial"/>
+          <w:lang w:val="zh-CN" w:eastAsia="zh-CN"/>
+        </w:rPr>
+        <w:t xml:space="preserve"> </w:t>
+      </w:r>
+      <w:r>
+        <w:rPr>
+          <w:rStyle w:val="VerbatimChar"/>
+          <w:rFonts w:ascii="Arial" w:hAnsi="Arial" w:eastAsia="Arial Unicode MS" w:cs="Arial"/>
+          <w:lang w:val="zh-CN" w:eastAsia="zh-CN"/>
+        </w:rPr>
+        <w:t xml:space="preserve">main</w:t>
+      </w:r>
+      <w:r>
+        <w:rPr>
+          <w:rFonts w:ascii="Arial" w:hAnsi="Arial" w:eastAsia="Arial Unicode MS" w:cs="Arial"/>
+          <w:lang w:val="zh-CN" w:eastAsia="zh-CN"/>
+        </w:rPr>
+        <w:t xml:space="preserve"> </w:t>
+      </w:r>
+      <w:r>
+        <w:rPr>
+          <w:rFonts w:ascii="Arial" w:hAnsi="Arial" w:eastAsia="Arial Unicode MS" w:cs="Arial"/>
+          <w:lang w:val="zh-CN" w:eastAsia="zh-CN"/>
+        </w:rPr>
+        <w:t xml:space="preserve">上开发或推送，合并后删除短期分支。</w:t>
+      </w:r>
+    </w:p>
+    <w:p>
+      <w:pPr>
+        <w:pStyle w:val="BodyText"/>
+        <w:widowControl/>
+      </w:pPr>
+      <w:r>
+        <w:rPr>
+          <w:rFonts w:ascii="Arial" w:hAnsi="Arial" w:eastAsia="Arial Unicode MS" w:cs="Arial"/>
+          <w:lang w:val="zh-CN" w:eastAsia="zh-CN"/>
+        </w:rPr>
+        <w:t xml:space="preserve">建议分支名：</w:t>
       </w:r>
     </w:p>
     <w:p>
@@ -13723,21 +13275,12 @@
       </w:pPr>
       <w:r>
         <w:rPr>
-          <w:rStyle w:val="FunctionTok"/>
-          <w:rFonts w:ascii="Menlo" w:hAnsi="Menlo" w:eastAsia="Arial Unicode MS" w:cs="Menlo"/>
-          <w:sz w:val="16"/>
-          <w:lang w:val="zh-CN" w:eastAsia="zh-CN"/>
-        </w:rPr>
-        <w:t xml:space="preserve">make</w:t>
-      </w:r>
-      <w:r>
-        <w:rPr>
-          <w:rStyle w:val="NormalTok"/>
-          <w:rFonts w:ascii="Menlo" w:hAnsi="Menlo" w:eastAsia="Arial Unicode MS" w:cs="Menlo"/>
-          <w:sz w:val="16"/>
-          <w:lang w:val="zh-CN" w:eastAsia="zh-CN"/>
-        </w:rPr>
-        <w:t xml:space="preserve"> check</w:t>
+          <w:rStyle w:val="VerbatimChar"/>
+          <w:rFonts w:ascii="Menlo" w:hAnsi="Menlo" w:eastAsia="Arial Unicode MS" w:cs="Menlo"/>
+          <w:sz w:val="16"/>
+          <w:lang w:val="zh-CN" w:eastAsia="zh-CN"/>
+        </w:rPr>
+        <w:t xml:space="preserve">feat/d-rag-real-embedding</w:t>
       </w:r>
       <w:r>
         <w:rPr>
@@ -13749,30 +13292,12 @@
       </w:r>
       <w:r>
         <w:rPr>
-          <w:rStyle w:val="ExtensionTok"/>
-          <w:rFonts w:ascii="Menlo" w:hAnsi="Menlo" w:eastAsia="Arial Unicode MS" w:cs="Menlo"/>
-          <w:sz w:val="16"/>
-          <w:lang w:val="zh-CN" w:eastAsia="zh-CN"/>
-        </w:rPr>
-        <w:t xml:space="preserve">docker</w:t>
-      </w:r>
-      <w:r>
-        <w:rPr>
-          <w:rStyle w:val="NormalTok"/>
-          <w:rFonts w:ascii="Menlo" w:hAnsi="Menlo" w:eastAsia="Arial Unicode MS" w:cs="Menlo"/>
-          <w:sz w:val="16"/>
-          <w:lang w:val="zh-CN" w:eastAsia="zh-CN"/>
-        </w:rPr>
-        <w:t xml:space="preserve"> compose config </w:t>
-      </w:r>
-      <w:r>
-        <w:rPr>
-          <w:rStyle w:val="AttributeTok"/>
-          <w:rFonts w:ascii="Menlo" w:hAnsi="Menlo" w:eastAsia="Arial Unicode MS" w:cs="Menlo"/>
-          <w:sz w:val="16"/>
-          <w:lang w:val="zh-CN" w:eastAsia="zh-CN"/>
-        </w:rPr>
-        <w:t xml:space="preserve">--quiet</w:t>
+          <w:rStyle w:val="VerbatimChar"/>
+          <w:rFonts w:ascii="Menlo" w:hAnsi="Menlo" w:eastAsia="Arial Unicode MS" w:cs="Menlo"/>
+          <w:sz w:val="16"/>
+          <w:lang w:val="zh-CN" w:eastAsia="zh-CN"/>
+        </w:rPr>
+        <w:t xml:space="preserve">test/f-rag-asset-validation</w:t>
       </w:r>
       <w:r>
         <w:rPr>
@@ -13784,30 +13309,12 @@
       </w:r>
       <w:r>
         <w:rPr>
-          <w:rStyle w:val="FunctionTok"/>
-          <w:rFonts w:ascii="Menlo" w:hAnsi="Menlo" w:eastAsia="Arial Unicode MS" w:cs="Menlo"/>
-          <w:sz w:val="16"/>
-          <w:lang w:val="zh-CN" w:eastAsia="zh-CN"/>
-        </w:rPr>
-        <w:t xml:space="preserve">git</w:t>
-      </w:r>
-      <w:r>
-        <w:rPr>
-          <w:rStyle w:val="NormalTok"/>
-          <w:rFonts w:ascii="Menlo" w:hAnsi="Menlo" w:eastAsia="Arial Unicode MS" w:cs="Menlo"/>
-          <w:sz w:val="16"/>
-          <w:lang w:val="zh-CN" w:eastAsia="zh-CN"/>
-        </w:rPr>
-        <w:t xml:space="preserve"> diff </w:t>
-      </w:r>
-      <w:r>
-        <w:rPr>
-          <w:rStyle w:val="AttributeTok"/>
-          <w:rFonts w:ascii="Menlo" w:hAnsi="Menlo" w:eastAsia="Arial Unicode MS" w:cs="Menlo"/>
-          <w:sz w:val="16"/>
-          <w:lang w:val="zh-CN" w:eastAsia="zh-CN"/>
-        </w:rPr>
-        <w:t xml:space="preserve">--check</w:t>
+          <w:rStyle w:val="VerbatimChar"/>
+          <w:rFonts w:ascii="Menlo" w:hAnsi="Menlo" w:eastAsia="Arial Unicode MS" w:cs="Menlo"/>
+          <w:sz w:val="16"/>
+          <w:lang w:val="zh-CN" w:eastAsia="zh-CN"/>
+        </w:rPr>
+        <w:t xml:space="preserve">data/yao-rag-eval-seed</w:t>
       </w:r>
       <w:r>
         <w:rPr>
@@ -13819,30 +13326,12 @@
       </w:r>
       <w:r>
         <w:rPr>
-          <w:rStyle w:val="FunctionTok"/>
-          <w:rFonts w:ascii="Menlo" w:hAnsi="Menlo" w:eastAsia="Arial Unicode MS" w:cs="Menlo"/>
-          <w:sz w:val="16"/>
-          <w:lang w:val="zh-CN" w:eastAsia="zh-CN"/>
-        </w:rPr>
-        <w:t xml:space="preserve">git</w:t>
-      </w:r>
-      <w:r>
-        <w:rPr>
-          <w:rStyle w:val="NormalTok"/>
-          <w:rFonts w:ascii="Menlo" w:hAnsi="Menlo" w:eastAsia="Arial Unicode MS" w:cs="Menlo"/>
-          <w:sz w:val="16"/>
-          <w:lang w:val="zh-CN" w:eastAsia="zh-CN"/>
-        </w:rPr>
-        <w:t xml:space="preserve"> status </w:t>
-      </w:r>
-      <w:r>
-        <w:rPr>
-          <w:rStyle w:val="AttributeTok"/>
-          <w:rFonts w:ascii="Menlo" w:hAnsi="Menlo" w:eastAsia="Arial Unicode MS" w:cs="Menlo"/>
-          <w:sz w:val="16"/>
-          <w:lang w:val="zh-CN" w:eastAsia="zh-CN"/>
-        </w:rPr>
-        <w:t xml:space="preserve">--short</w:t>
+          <w:rStyle w:val="VerbatimChar"/>
+          <w:rFonts w:ascii="Menlo" w:hAnsi="Menlo" w:eastAsia="Arial Unicode MS" w:cs="Menlo"/>
+          <w:sz w:val="16"/>
+          <w:lang w:val="zh-CN" w:eastAsia="zh-CN"/>
+        </w:rPr>
+        <w:t xml:space="preserve">feat/e-frontend-status-states</w:t>
       </w:r>
     </w:p>
     <w:p>
@@ -13855,7 +13344,7 @@
           <w:rFonts w:ascii="Arial" w:hAnsi="Arial" w:eastAsia="Arial Unicode MS" w:cs="Arial"/>
           <w:lang w:val="zh-CN" w:eastAsia="zh-CN"/>
         </w:rPr>
-        <w:t xml:space="preserve">只有下列条件同时满足，才能把 FR-09 从 partial 上调：</w:t>
+        <w:t xml:space="preserve">每个 PR 只做一个行为切片，并包含：</w:t>
       </w:r>
     </w:p>
     <w:p>
@@ -13872,7 +13361,7 @@
           <w:rFonts w:ascii="Arial" w:hAnsi="Arial" w:eastAsia="Arial Unicode MS" w:cs="Arial"/>
           <w:lang w:val="zh-CN" w:eastAsia="zh-CN"/>
         </w:rPr>
-        <w:t xml:space="preserve">固定真实 embedding 的许可证、commit、目录树 SHA 和运行环境可复现。</w:t>
+        <w:t xml:space="preserve">基线 commit、变更范围和明确非目标；</w:t>
       </w:r>
     </w:p>
     <w:p>
@@ -13889,7 +13378,7 @@
           <w:rFonts w:ascii="Arial" w:hAnsi="Arial" w:eastAsia="Arial Unicode MS" w:cs="Arial"/>
           <w:lang w:val="zh-CN" w:eastAsia="zh-CN"/>
         </w:rPr>
-        <w:t xml:space="preserve">正式许可语料 manifest 完整，页码/引文/材料别名经过双人审核。</w:t>
+        <w:t xml:space="preserve">可复制的窄测试与结果；</w:t>
       </w:r>
     </w:p>
     <w:p>
@@ -13906,7 +13395,7 @@
           <w:rFonts w:ascii="Arial" w:hAnsi="Arial" w:eastAsia="Arial Unicode MS" w:cs="Arial"/>
           <w:lang w:val="zh-CN" w:eastAsia="zh-CN"/>
         </w:rPr>
-        <w:t xml:space="preserve">keyword、vector、hybrid 和故障降级的真实评测可复现。</w:t>
+        <w:t xml:space="preserve">新增/变化的资产身份、许可证和外部依赖；</w:t>
       </w:r>
     </w:p>
     <w:p>
@@ -13923,7 +13412,7 @@
           <w:rFonts w:ascii="Arial" w:hAnsi="Arial" w:eastAsia="Arial Unicode MS" w:cs="Arial"/>
           <w:lang w:val="zh-CN" w:eastAsia="zh-CN"/>
         </w:rPr>
-        <w:t xml:space="preserve">错材料泄漏率和 unsupported-answer rate 均为 0。</w:t>
+        <w:t xml:space="preserve">失败/降级行为；</w:t>
       </w:r>
     </w:p>
     <w:p>
@@ -13940,7 +13429,7 @@
           <w:rFonts w:ascii="Arial" w:hAnsi="Arial" w:eastAsia="Arial Unicode MS" w:cs="Arial"/>
           <w:lang w:val="zh-CN" w:eastAsia="zh-CN"/>
         </w:rPr>
-        <w:t xml:space="preserve">重启不重新 embedding；所有 manifest/index/DB 失配都拒绝旧向量。</w:t>
+        <w:t xml:space="preserve">是否改变公共 DTO、数据库、OpenAPI、Compose 或秘密边界；</w:t>
       </w:r>
     </w:p>
     <w:p>
@@ -13957,87 +13446,150 @@
           <w:rFonts w:ascii="Arial" w:hAnsi="Arial" w:eastAsia="Arial Unicode MS" w:cs="Arial"/>
           <w:lang w:val="zh-CN" w:eastAsia="zh-CN"/>
         </w:rPr>
-        <w:t xml:space="preserve">引用能回到准确原文页码和 chunk；无证据明确拒答。</w:t>
-      </w:r>
-    </w:p>
-    <w:p>
-      <w:pPr>
-        <w:widowControl/>
-        <w:numPr>
-          <w:ilvl w:val="0"/>
-          <w:numId w:val="1016"/>
-        </w:numPr>
-        <w:pStyle w:val="Compact"/>
-      </w:pPr>
-      <w:r>
-        <w:rPr>
-          <w:rFonts w:ascii="Arial" w:hAnsi="Arial" w:eastAsia="Arial Unicode MS" w:cs="Arial"/>
-          <w:lang w:val="zh-CN" w:eastAsia="zh-CN"/>
-        </w:rPr>
-        <w:t xml:space="preserve">普通 CI、真实资产 slow smoke 和最终</w:t>
-      </w:r>
-      <w:r>
-        <w:rPr>
-          <w:rFonts w:ascii="Arial" w:hAnsi="Arial" w:eastAsia="Arial Unicode MS" w:cs="Arial"/>
-          <w:lang w:val="zh-CN" w:eastAsia="zh-CN"/>
-        </w:rPr>
-        <w:t xml:space="preserve"> </w:t>
-      </w:r>
-      <w:r>
-        <w:rPr>
-          <w:rStyle w:val="VerbatimChar"/>
-          <w:rFonts w:ascii="Arial" w:hAnsi="Arial" w:eastAsia="Arial Unicode MS" w:cs="Arial"/>
-          <w:lang w:val="zh-CN" w:eastAsia="zh-CN"/>
-        </w:rPr>
-        <w:t xml:space="preserve">make check</w:t>
-      </w:r>
-      <w:r>
-        <w:rPr>
-          <w:rFonts w:ascii="Arial" w:hAnsi="Arial" w:eastAsia="Arial Unicode MS" w:cs="Arial"/>
-          <w:lang w:val="zh-CN" w:eastAsia="zh-CN"/>
-        </w:rPr>
-        <w:t xml:space="preserve"> </w:t>
-      </w:r>
-      <w:r>
-        <w:rPr>
-          <w:rFonts w:ascii="Arial" w:hAnsi="Arial" w:eastAsia="Arial Unicode MS" w:cs="Arial"/>
-          <w:lang w:val="zh-CN" w:eastAsia="zh-CN"/>
-        </w:rPr>
-        <w:t xml:space="preserve">均通过。</w:t>
-      </w:r>
-    </w:p>
-    <w:p>
-      <w:pPr>
-        <w:widowControl/>
-        <w:numPr>
-          <w:ilvl w:val="0"/>
-          <w:numId w:val="1016"/>
-        </w:numPr>
-        <w:pStyle w:val="Compact"/>
-      </w:pPr>
-      <w:r>
-        <w:rPr>
-          <w:rFonts w:ascii="Arial" w:hAnsi="Arial" w:eastAsia="Arial Unicode MS" w:cs="Arial"/>
-          <w:lang w:val="zh-CN" w:eastAsia="zh-CN"/>
-        </w:rPr>
-        <w:t xml:space="preserve">若对外使用 principal，知识 tenant ownership 和授权已经单独完成；否则只能声明受控本机兼容演示。</w:t>
-      </w:r>
-    </w:p>
-    <w:bookmarkEnd w:id="51"/>
-    <w:bookmarkStart w:id="62" w:name="官方资料与进一步阅读"/>
-    <w:p>
-      <w:pPr>
-        <w:pStyle w:val="Heading1"/>
-        <w:keepNext/>
+        <w:t xml:space="preserve">不包含权重、语料全文、数据库、索引、秘密、本机路径和无关格式化。</w:t>
+      </w:r>
+    </w:p>
+    <w:p>
+      <w:pPr>
+        <w:pStyle w:val="FirstParagraph"/>
+        <w:widowControl/>
+      </w:pPr>
+      <w:r>
+        <w:rPr>
+          <w:rFonts w:ascii="Arial" w:hAnsi="Arial" w:eastAsia="Arial Unicode MS" w:cs="Arial"/>
+          <w:lang w:val="zh-CN" w:eastAsia="zh-CN"/>
+        </w:rPr>
+        <w:t xml:space="preserve">全员合并前至少运行：</w:t>
+      </w:r>
+    </w:p>
+    <w:p>
+      <w:pPr>
+        <w:pStyle w:val="SourceCode"/>
         <w:keepLines/>
         <w:widowControl/>
       </w:pPr>
       <w:r>
         <w:rPr>
-          <w:rFonts w:ascii="Arial" w:hAnsi="Arial" w:eastAsia="Arial Unicode MS" w:cs="Arial"/>
-          <w:lang w:val="zh-CN" w:eastAsia="zh-CN"/>
-        </w:rPr>
-        <w:t xml:space="preserve">12. 官方资料与进一步阅读</w:t>
+          <w:rStyle w:val="FunctionTok"/>
+          <w:rFonts w:ascii="Menlo" w:hAnsi="Menlo" w:eastAsia="Arial Unicode MS" w:cs="Menlo"/>
+          <w:sz w:val="16"/>
+          <w:lang w:val="zh-CN" w:eastAsia="zh-CN"/>
+        </w:rPr>
+        <w:t xml:space="preserve">make</w:t>
+      </w:r>
+      <w:r>
+        <w:rPr>
+          <w:rStyle w:val="NormalTok"/>
+          <w:rFonts w:ascii="Menlo" w:hAnsi="Menlo" w:eastAsia="Arial Unicode MS" w:cs="Menlo"/>
+          <w:sz w:val="16"/>
+          <w:lang w:val="zh-CN" w:eastAsia="zh-CN"/>
+        </w:rPr>
+        <w:t xml:space="preserve"> check</w:t>
+      </w:r>
+      <w:r>
+        <w:rPr>
+          <w:rFonts w:ascii="Menlo" w:hAnsi="Menlo" w:eastAsia="Arial Unicode MS" w:cs="Menlo"/>
+          <w:sz w:val="16"/>
+          <w:lang w:val="zh-CN" w:eastAsia="zh-CN"/>
+        </w:rPr>
+        <w:br/>
+      </w:r>
+      <w:r>
+        <w:rPr>
+          <w:rStyle w:val="ExtensionTok"/>
+          <w:rFonts w:ascii="Menlo" w:hAnsi="Menlo" w:eastAsia="Arial Unicode MS" w:cs="Menlo"/>
+          <w:sz w:val="16"/>
+          <w:lang w:val="zh-CN" w:eastAsia="zh-CN"/>
+        </w:rPr>
+        <w:t xml:space="preserve">docker</w:t>
+      </w:r>
+      <w:r>
+        <w:rPr>
+          <w:rStyle w:val="NormalTok"/>
+          <w:rFonts w:ascii="Menlo" w:hAnsi="Menlo" w:eastAsia="Arial Unicode MS" w:cs="Menlo"/>
+          <w:sz w:val="16"/>
+          <w:lang w:val="zh-CN" w:eastAsia="zh-CN"/>
+        </w:rPr>
+        <w:t xml:space="preserve"> compose config </w:t>
+      </w:r>
+      <w:r>
+        <w:rPr>
+          <w:rStyle w:val="AttributeTok"/>
+          <w:rFonts w:ascii="Menlo" w:hAnsi="Menlo" w:eastAsia="Arial Unicode MS" w:cs="Menlo"/>
+          <w:sz w:val="16"/>
+          <w:lang w:val="zh-CN" w:eastAsia="zh-CN"/>
+        </w:rPr>
+        <w:t xml:space="preserve">--quiet</w:t>
+      </w:r>
+      <w:r>
+        <w:rPr>
+          <w:rFonts w:ascii="Menlo" w:hAnsi="Menlo" w:eastAsia="Arial Unicode MS" w:cs="Menlo"/>
+          <w:sz w:val="16"/>
+          <w:lang w:val="zh-CN" w:eastAsia="zh-CN"/>
+        </w:rPr>
+        <w:br/>
+      </w:r>
+      <w:r>
+        <w:rPr>
+          <w:rStyle w:val="FunctionTok"/>
+          <w:rFonts w:ascii="Menlo" w:hAnsi="Menlo" w:eastAsia="Arial Unicode MS" w:cs="Menlo"/>
+          <w:sz w:val="16"/>
+          <w:lang w:val="zh-CN" w:eastAsia="zh-CN"/>
+        </w:rPr>
+        <w:t xml:space="preserve">git</w:t>
+      </w:r>
+      <w:r>
+        <w:rPr>
+          <w:rStyle w:val="NormalTok"/>
+          <w:rFonts w:ascii="Menlo" w:hAnsi="Menlo" w:eastAsia="Arial Unicode MS" w:cs="Menlo"/>
+          <w:sz w:val="16"/>
+          <w:lang w:val="zh-CN" w:eastAsia="zh-CN"/>
+        </w:rPr>
+        <w:t xml:space="preserve"> diff </w:t>
+      </w:r>
+      <w:r>
+        <w:rPr>
+          <w:rStyle w:val="AttributeTok"/>
+          <w:rFonts w:ascii="Menlo" w:hAnsi="Menlo" w:eastAsia="Arial Unicode MS" w:cs="Menlo"/>
+          <w:sz w:val="16"/>
+          <w:lang w:val="zh-CN" w:eastAsia="zh-CN"/>
+        </w:rPr>
+        <w:t xml:space="preserve">--check</w:t>
+      </w:r>
+      <w:r>
+        <w:rPr>
+          <w:rFonts w:ascii="Menlo" w:hAnsi="Menlo" w:eastAsia="Arial Unicode MS" w:cs="Menlo"/>
+          <w:sz w:val="16"/>
+          <w:lang w:val="zh-CN" w:eastAsia="zh-CN"/>
+        </w:rPr>
+        <w:br/>
+      </w:r>
+      <w:r>
+        <w:rPr>
+          <w:rStyle w:val="FunctionTok"/>
+          <w:rFonts w:ascii="Menlo" w:hAnsi="Menlo" w:eastAsia="Arial Unicode MS" w:cs="Menlo"/>
+          <w:sz w:val="16"/>
+          <w:lang w:val="zh-CN" w:eastAsia="zh-CN"/>
+        </w:rPr>
+        <w:t xml:space="preserve">git</w:t>
+      </w:r>
+      <w:r>
+        <w:rPr>
+          <w:rStyle w:val="NormalTok"/>
+          <w:rFonts w:ascii="Menlo" w:hAnsi="Menlo" w:eastAsia="Arial Unicode MS" w:cs="Menlo"/>
+          <w:sz w:val="16"/>
+          <w:lang w:val="zh-CN" w:eastAsia="zh-CN"/>
+        </w:rPr>
+        <w:t xml:space="preserve"> status </w:t>
+      </w:r>
+      <w:r>
+        <w:rPr>
+          <w:rStyle w:val="AttributeTok"/>
+          <w:rFonts w:ascii="Menlo" w:hAnsi="Menlo" w:eastAsia="Arial Unicode MS" w:cs="Menlo"/>
+          <w:sz w:val="16"/>
+          <w:lang w:val="zh-CN" w:eastAsia="zh-CN"/>
+        </w:rPr>
+        <w:t xml:space="preserve">--short</w:t>
       </w:r>
     </w:p>
     <w:p>
@@ -14050,7 +13602,7 @@
           <w:rFonts w:ascii="Arial" w:hAnsi="Arial" w:eastAsia="Arial Unicode MS" w:cs="Arial"/>
           <w:lang w:val="zh-CN" w:eastAsia="zh-CN"/>
         </w:rPr>
-        <w:t xml:space="preserve">以下资料用于模型、索引、语料和服务决策；开发记录应引用具体版本/访问日期，而不是只贴首页：</w:t>
+        <w:t xml:space="preserve">只有下列条件同时满足，才能把 FR-09 从 partial 上调：</w:t>
       </w:r>
     </w:p>
     <w:p>
@@ -14067,9 +13619,204 @@
           <w:rFonts w:ascii="Arial" w:hAnsi="Arial" w:eastAsia="Arial Unicode MS" w:cs="Arial"/>
           <w:lang w:val="zh-CN" w:eastAsia="zh-CN"/>
         </w:rPr>
+        <w:t xml:space="preserve">固定真实 embedding 的许可证、commit、目录树 SHA 和运行环境可复现。</w:t>
+      </w:r>
+    </w:p>
+    <w:p>
+      <w:pPr>
+        <w:widowControl/>
+        <w:numPr>
+          <w:ilvl w:val="0"/>
+          <w:numId w:val="1017"/>
+        </w:numPr>
+        <w:pStyle w:val="Compact"/>
+      </w:pPr>
+      <w:r>
+        <w:rPr>
+          <w:rFonts w:ascii="Arial" w:hAnsi="Arial" w:eastAsia="Arial Unicode MS" w:cs="Arial"/>
+          <w:lang w:val="zh-CN" w:eastAsia="zh-CN"/>
+        </w:rPr>
+        <w:t xml:space="preserve">正式许可语料 manifest 完整，页码/引文/材料别名经过双人审核。</w:t>
+      </w:r>
+    </w:p>
+    <w:p>
+      <w:pPr>
+        <w:widowControl/>
+        <w:numPr>
+          <w:ilvl w:val="0"/>
+          <w:numId w:val="1017"/>
+        </w:numPr>
+        <w:pStyle w:val="Compact"/>
+      </w:pPr>
+      <w:r>
+        <w:rPr>
+          <w:rFonts w:ascii="Arial" w:hAnsi="Arial" w:eastAsia="Arial Unicode MS" w:cs="Arial"/>
+          <w:lang w:val="zh-CN" w:eastAsia="zh-CN"/>
+        </w:rPr>
+        <w:t xml:space="preserve">keyword、vector、hybrid 和故障降级的真实评测可复现。</w:t>
+      </w:r>
+    </w:p>
+    <w:p>
+      <w:pPr>
+        <w:widowControl/>
+        <w:numPr>
+          <w:ilvl w:val="0"/>
+          <w:numId w:val="1017"/>
+        </w:numPr>
+        <w:pStyle w:val="Compact"/>
+      </w:pPr>
+      <w:r>
+        <w:rPr>
+          <w:rFonts w:ascii="Arial" w:hAnsi="Arial" w:eastAsia="Arial Unicode MS" w:cs="Arial"/>
+          <w:lang w:val="zh-CN" w:eastAsia="zh-CN"/>
+        </w:rPr>
+        <w:t xml:space="preserve">错材料泄漏率和 unsupported-answer rate 均为 0。</w:t>
+      </w:r>
+    </w:p>
+    <w:p>
+      <w:pPr>
+        <w:widowControl/>
+        <w:numPr>
+          <w:ilvl w:val="0"/>
+          <w:numId w:val="1017"/>
+        </w:numPr>
+        <w:pStyle w:val="Compact"/>
+      </w:pPr>
+      <w:r>
+        <w:rPr>
+          <w:rFonts w:ascii="Arial" w:hAnsi="Arial" w:eastAsia="Arial Unicode MS" w:cs="Arial"/>
+          <w:lang w:val="zh-CN" w:eastAsia="zh-CN"/>
+        </w:rPr>
+        <w:t xml:space="preserve">重启不重新 embedding；所有 manifest/index/DB 失配都拒绝旧向量。</w:t>
+      </w:r>
+    </w:p>
+    <w:p>
+      <w:pPr>
+        <w:widowControl/>
+        <w:numPr>
+          <w:ilvl w:val="0"/>
+          <w:numId w:val="1017"/>
+        </w:numPr>
+        <w:pStyle w:val="Compact"/>
+      </w:pPr>
+      <w:r>
+        <w:rPr>
+          <w:rFonts w:ascii="Arial" w:hAnsi="Arial" w:eastAsia="Arial Unicode MS" w:cs="Arial"/>
+          <w:lang w:val="zh-CN" w:eastAsia="zh-CN"/>
+        </w:rPr>
+        <w:t xml:space="preserve">引用能回到准确原文页码和 chunk；无证据明确拒答。</w:t>
+      </w:r>
+    </w:p>
+    <w:p>
+      <w:pPr>
+        <w:widowControl/>
+        <w:numPr>
+          <w:ilvl w:val="0"/>
+          <w:numId w:val="1017"/>
+        </w:numPr>
+        <w:pStyle w:val="Compact"/>
+      </w:pPr>
+      <w:r>
+        <w:rPr>
+          <w:rFonts w:ascii="Arial" w:hAnsi="Arial" w:eastAsia="Arial Unicode MS" w:cs="Arial"/>
+          <w:lang w:val="zh-CN" w:eastAsia="zh-CN"/>
+        </w:rPr>
+        <w:t xml:space="preserve">普通 CI、真实资产 slow smoke 和最终</w:t>
+      </w:r>
+      <w:r>
+        <w:rPr>
+          <w:rFonts w:ascii="Arial" w:hAnsi="Arial" w:eastAsia="Arial Unicode MS" w:cs="Arial"/>
+          <w:lang w:val="zh-CN" w:eastAsia="zh-CN"/>
+        </w:rPr>
+        <w:t xml:space="preserve"> </w:t>
+      </w:r>
+      <w:r>
+        <w:rPr>
+          <w:rStyle w:val="VerbatimChar"/>
+          <w:rFonts w:ascii="Arial" w:hAnsi="Arial" w:eastAsia="Arial Unicode MS" w:cs="Arial"/>
+          <w:lang w:val="zh-CN" w:eastAsia="zh-CN"/>
+        </w:rPr>
+        <w:t xml:space="preserve">make check</w:t>
+      </w:r>
+      <w:r>
+        <w:rPr>
+          <w:rFonts w:ascii="Arial" w:hAnsi="Arial" w:eastAsia="Arial Unicode MS" w:cs="Arial"/>
+          <w:lang w:val="zh-CN" w:eastAsia="zh-CN"/>
+        </w:rPr>
+        <w:t xml:space="preserve"> </w:t>
+      </w:r>
+      <w:r>
+        <w:rPr>
+          <w:rFonts w:ascii="Arial" w:hAnsi="Arial" w:eastAsia="Arial Unicode MS" w:cs="Arial"/>
+          <w:lang w:val="zh-CN" w:eastAsia="zh-CN"/>
+        </w:rPr>
+        <w:t xml:space="preserve">均通过。</w:t>
+      </w:r>
+    </w:p>
+    <w:p>
+      <w:pPr>
+        <w:widowControl/>
+        <w:numPr>
+          <w:ilvl w:val="0"/>
+          <w:numId w:val="1017"/>
+        </w:numPr>
+        <w:pStyle w:val="Compact"/>
+      </w:pPr>
+      <w:r>
+        <w:rPr>
+          <w:rFonts w:ascii="Arial" w:hAnsi="Arial" w:eastAsia="Arial Unicode MS" w:cs="Arial"/>
+          <w:lang w:val="zh-CN" w:eastAsia="zh-CN"/>
+        </w:rPr>
+        <w:t xml:space="preserve">若对外使用 principal，知识 tenant ownership 和授权已经单独完成；否则只能声明受控本机兼容演示。</w:t>
+      </w:r>
+    </w:p>
+    <w:bookmarkEnd w:id="52"/>
+    <w:bookmarkStart w:id="65" w:name="官方资料与进一步阅读"/>
+    <w:p>
+      <w:pPr>
+        <w:pStyle w:val="Heading1"/>
+        <w:keepNext/>
+        <w:keepLines/>
+        <w:widowControl/>
+      </w:pPr>
+      <w:r>
+        <w:rPr>
+          <w:rFonts w:ascii="Arial" w:hAnsi="Arial" w:eastAsia="Arial Unicode MS" w:cs="Arial"/>
+          <w:lang w:val="zh-CN" w:eastAsia="zh-CN"/>
+        </w:rPr>
+        <w:t xml:space="preserve">12. 官方资料与进一步阅读</w:t>
+      </w:r>
+    </w:p>
+    <w:p>
+      <w:pPr>
+        <w:pStyle w:val="FirstParagraph"/>
+        <w:widowControl/>
+      </w:pPr>
+      <w:r>
+        <w:rPr>
+          <w:rFonts w:ascii="Arial" w:hAnsi="Arial" w:eastAsia="Arial Unicode MS" w:cs="Arial"/>
+          <w:lang w:val="zh-CN" w:eastAsia="zh-CN"/>
+        </w:rPr>
+        <w:t xml:space="preserve">以下资料用于模型、索引、语料和服务决策；开发记录应引用具体版本/访问日期，而不是只贴首页：</w:t>
+      </w:r>
+    </w:p>
+    <w:p>
+      <w:pPr>
+        <w:widowControl/>
+        <w:numPr>
+          <w:ilvl w:val="0"/>
+          <w:numId w:val="1018"/>
+        </w:numPr>
+        <w:pStyle w:val="Compact"/>
+      </w:pPr>
+      <w:r>
+        <w:rPr>
+          <w:rFonts w:ascii="Arial" w:hAnsi="Arial" w:eastAsia="Arial Unicode MS" w:cs="Arial"/>
+          <w:lang w:val="zh-CN" w:eastAsia="zh-CN"/>
+        </w:rPr>
         <w:t xml:space="preserve">SentenceTransformers 官方语义相似度与检索文档：</w:t>
       </w:r>
-      <w:hyperlink r:id="rId52">
+      <w:hyperlink r:id="rId53">
         <w:r>
           <w:rPr>
             <w:rStyle w:val="Hyperlink"/>
@@ -14083,7 +13830,7 @@
         <w:widowControl/>
         <w:numPr>
           <w:ilvl w:val="0"/>
-          <w:numId w:val="1017"/>
+          <w:numId w:val="1018"/>
         </w:numPr>
         <w:pStyle w:val="Compact"/>
       </w:pPr>
@@ -14123,7 +13870,7 @@
         </w:rPr>
         <w:t xml:space="preserve">官方模型卡（许可证、query instruction、归一化与 reranker 建议）：</w:t>
       </w:r>
-      <w:hyperlink r:id="rId53">
+      <w:hyperlink r:id="rId54">
         <w:r>
           <w:rPr>
             <w:rStyle w:val="Hyperlink"/>
@@ -14137,7 +13884,7 @@
         <w:widowControl/>
         <w:numPr>
           <w:ilvl w:val="0"/>
-          <w:numId w:val="1017"/>
+          <w:numId w:val="1018"/>
         </w:numPr>
         <w:pStyle w:val="Compact"/>
       </w:pPr>
@@ -14148,7 +13895,7 @@
         </w:rPr>
         <w:t xml:space="preserve">Hugging Face Hub 下载指南（固定 revision、CLI/本地缓存）：</w:t>
       </w:r>
-      <w:hyperlink r:id="rId54">
+      <w:hyperlink r:id="rId55">
         <w:r>
           <w:rPr>
             <w:rStyle w:val="Hyperlink"/>
@@ -14162,7 +13909,7 @@
         <w:widowControl/>
         <w:numPr>
           <w:ilvl w:val="0"/>
-          <w:numId w:val="1017"/>
+          <w:numId w:val="1018"/>
         </w:numPr>
         <w:pStyle w:val="Compact"/>
       </w:pPr>
@@ -14173,7 +13920,7 @@
         </w:rPr>
         <w:t xml:space="preserve">FAISS 官方 Getting started（固定维度、add/search、float32）：</w:t>
       </w:r>
-      <w:hyperlink r:id="rId55">
+      <w:hyperlink r:id="rId56">
         <w:r>
           <w:rPr>
             <w:rStyle w:val="Hyperlink"/>
@@ -14187,7 +13934,7 @@
         <w:widowControl/>
         <w:numPr>
           <w:ilvl w:val="0"/>
-          <w:numId w:val="1017"/>
+          <w:numId w:val="1018"/>
         </w:numPr>
         <w:pStyle w:val="Compact"/>
       </w:pPr>
@@ -14198,7 +13945,7 @@
         </w:rPr>
         <w:t xml:space="preserve">SQLite FTS5 官方文档（全文检索与 BM25）：</w:t>
       </w:r>
-      <w:hyperlink r:id="rId56">
+      <w:hyperlink r:id="rId57">
         <w:r>
           <w:rPr>
             <w:rStyle w:val="Hyperlink"/>
@@ -14212,7 +13959,7 @@
         <w:widowControl/>
         <w:numPr>
           <w:ilvl w:val="0"/>
-          <w:numId w:val="1017"/>
+          <w:numId w:val="1018"/>
         </w:numPr>
         <w:pStyle w:val="Compact"/>
       </w:pPr>
@@ -14223,7 +13970,7 @@
         </w:rPr>
         <w:t xml:space="preserve">Crossref REST 官方文档（题录/许可元数据与 polite pool）：</w:t>
       </w:r>
-      <w:hyperlink r:id="rId57">
+      <w:hyperlink r:id="rId58">
         <w:r>
           <w:rPr>
             <w:rStyle w:val="Hyperlink"/>
@@ -14237,7 +13984,7 @@
         <w:widowControl/>
         <w:numPr>
           <w:ilvl w:val="0"/>
-          <w:numId w:val="1017"/>
+          <w:numId w:val="1018"/>
         </w:numPr>
         <w:pStyle w:val="Compact"/>
       </w:pPr>
@@ -14248,7 +13995,7 @@
         </w:rPr>
         <w:t xml:space="preserve">arXiv API 官方手册与服务条款入口：</w:t>
       </w:r>
-      <w:hyperlink r:id="rId58">
+      <w:hyperlink r:id="rId59">
         <w:r>
           <w:rPr>
             <w:rStyle w:val="Hyperlink"/>
@@ -14262,7 +14009,7 @@
         <w:widowControl/>
         <w:numPr>
           <w:ilvl w:val="0"/>
-          <w:numId w:val="1017"/>
+          <w:numId w:val="1018"/>
         </w:numPr>
         <w:pStyle w:val="Compact"/>
       </w:pPr>
@@ -14273,7 +14020,7 @@
         </w:rPr>
         <w:t xml:space="preserve">Unpaywall 官方 API 入口（开放获取定位，不替代文章许可审核）：</w:t>
       </w:r>
-      <w:hyperlink r:id="rId59">
+      <w:hyperlink r:id="rId60">
         <w:r>
           <w:rPr>
             <w:rStyle w:val="Hyperlink"/>
@@ -14287,7 +14034,7 @@
         <w:widowControl/>
         <w:numPr>
           <w:ilvl w:val="0"/>
-          <w:numId w:val="1017"/>
+          <w:numId w:val="1018"/>
         </w:numPr>
         <w:pStyle w:val="Compact"/>
       </w:pPr>
@@ -14298,7 +14045,7 @@
         </w:rPr>
         <w:t xml:space="preserve">vLLM OpenAI-compatible server 官方文档（仅 P3 候选）：</w:t>
       </w:r>
-      <w:hyperlink r:id="rId60">
+      <w:hyperlink r:id="rId61">
         <w:r>
           <w:rPr>
             <w:rStyle w:val="Hyperlink"/>
@@ -14444,7 +14191,7 @@
           <w:rFonts w:ascii="Arial" w:hAnsi="Arial" w:eastAsia="Arial Unicode MS" w:cs="Arial"/>
           <w:lang w:val="zh-CN" w:eastAsia="zh-CN"/>
         </w:rPr>
-        <w:t xml:space="preserve">yukun</w:t>
+        <w:t xml:space="preserve">main</w:t>
       </w:r>
       <w:r>
         <w:rPr>
@@ -14461,7 +14208,7 @@
         <w:t xml:space="preserve">代码事实为准，并在 PR 中修正文档。</w:t>
       </w:r>
     </w:p>
-    <w:bookmarkStart w:id="61" w:name="今晚会后立即执行"/>
+    <w:bookmarkStart w:id="62" w:name="原始首周执行表历史计划"/>
     <w:p>
       <w:pPr>
         <w:pStyle w:val="Heading2"/>
@@ -14474,7 +14221,7 @@
           <w:rFonts w:ascii="Arial" w:hAnsi="Arial" w:eastAsia="Arial Unicode MS" w:cs="Arial"/>
           <w:lang w:val="zh-CN" w:eastAsia="zh-CN"/>
         </w:rPr>
-        <w:t xml:space="preserve">12.1 今晚会后立即执行</w:t>
+        <w:t xml:space="preserve">12.1 原始首周执行表（历史计划）</w:t>
       </w:r>
     </w:p>
     <w:tbl>
@@ -14972,8 +14719,1156 @@
         </w:tc>
       </w:tr>
     </w:tbl>
-    <w:bookmarkEnd w:id="61"/>
     <w:bookmarkEnd w:id="62"/>
+    <w:bookmarkStart w:id="64" w:name="当前主线操作2026-07-23-起"/>
+    <w:p>
+      <w:pPr>
+        <w:pStyle w:val="Heading2"/>
+        <w:keepNext/>
+        <w:keepLines/>
+        <w:pageBreakBefore/>
+        <w:widowControl/>
+      </w:pPr>
+      <w:r>
+        <w:rPr>
+          <w:rFonts w:ascii="Arial" w:hAnsi="Arial" w:eastAsia="Arial Unicode MS" w:cs="Arial"/>
+          <w:lang w:val="zh-CN" w:eastAsia="zh-CN"/>
+        </w:rPr>
+        <w:t xml:space="preserve">12.2 当前主线操作（2026-07-23 起）</w:t>
+      </w:r>
+    </w:p>
+    <w:p>
+      <w:pPr>
+        <w:pStyle w:val="FirstParagraph"/>
+        <w:widowControl/>
+      </w:pPr>
+      <w:r>
+        <w:rPr>
+          <w:rFonts w:ascii="Arial" w:hAnsi="Arial" w:eastAsia="Arial Unicode MS" w:cs="Arial"/>
+          <w:lang w:val="zh-CN" w:eastAsia="zh-CN"/>
+        </w:rPr>
+        <w:t xml:space="preserve">所有人只从最新全绿</w:t>
+      </w:r>
+      <w:r>
+        <w:rPr>
+          <w:rFonts w:ascii="Arial" w:hAnsi="Arial" w:eastAsia="Arial Unicode MS" w:cs="Arial"/>
+          <w:lang w:val="zh-CN" w:eastAsia="zh-CN"/>
+        </w:rPr>
+        <w:t xml:space="preserve"> </w:t>
+      </w:r>
+      <w:r>
+        <w:rPr>
+          <w:rStyle w:val="VerbatimChar"/>
+          <w:rFonts w:ascii="Arial" w:hAnsi="Arial" w:eastAsia="Arial Unicode MS" w:cs="Arial"/>
+          <w:lang w:val="zh-CN" w:eastAsia="zh-CN"/>
+        </w:rPr>
+        <w:t xml:space="preserve">main</w:t>
+      </w:r>
+      <w:r>
+        <w:rPr>
+          <w:rFonts w:ascii="Arial" w:hAnsi="Arial" w:eastAsia="Arial Unicode MS" w:cs="Arial"/>
+          <w:lang w:val="zh-CN" w:eastAsia="zh-CN"/>
+        </w:rPr>
+        <w:t xml:space="preserve"> </w:t>
+      </w:r>
+      <w:r>
+        <w:rPr>
+          <w:rFonts w:ascii="Arial" w:hAnsi="Arial" w:eastAsia="Arial Unicode MS" w:cs="Arial"/>
+          <w:lang w:val="zh-CN" w:eastAsia="zh-CN"/>
+        </w:rPr>
+        <w:t xml:space="preserve">建短期功能分支，不再从旧集成分支或已合并的个人分支继续叠加：</w:t>
+      </w:r>
+    </w:p>
+    <w:p>
+      <w:pPr>
+        <w:pStyle w:val="SourceCode"/>
+        <w:keepLines/>
+        <w:widowControl/>
+      </w:pPr>
+      <w:r>
+        <w:rPr>
+          <w:rStyle w:val="FunctionTok"/>
+          <w:rFonts w:ascii="Menlo" w:hAnsi="Menlo" w:eastAsia="Arial Unicode MS" w:cs="Menlo"/>
+          <w:sz w:val="16"/>
+          <w:lang w:val="zh-CN" w:eastAsia="zh-CN"/>
+        </w:rPr>
+        <w:t xml:space="preserve">git</w:t>
+      </w:r>
+      <w:r>
+        <w:rPr>
+          <w:rStyle w:val="NormalTok"/>
+          <w:rFonts w:ascii="Menlo" w:hAnsi="Menlo" w:eastAsia="Arial Unicode MS" w:cs="Menlo"/>
+          <w:sz w:val="16"/>
+          <w:lang w:val="zh-CN" w:eastAsia="zh-CN"/>
+        </w:rPr>
+        <w:t xml:space="preserve"> fetch origin </w:t>
+      </w:r>
+      <w:r>
+        <w:rPr>
+          <w:rStyle w:val="AttributeTok"/>
+          <w:rFonts w:ascii="Menlo" w:hAnsi="Menlo" w:eastAsia="Arial Unicode MS" w:cs="Menlo"/>
+          <w:sz w:val="16"/>
+          <w:lang w:val="zh-CN" w:eastAsia="zh-CN"/>
+        </w:rPr>
+        <w:t xml:space="preserve">--prune</w:t>
+      </w:r>
+      <w:r>
+        <w:rPr>
+          <w:rFonts w:ascii="Menlo" w:hAnsi="Menlo" w:eastAsia="Arial Unicode MS" w:cs="Menlo"/>
+          <w:sz w:val="16"/>
+          <w:lang w:val="zh-CN" w:eastAsia="zh-CN"/>
+        </w:rPr>
+        <w:br/>
+      </w:r>
+      <w:r>
+        <w:rPr>
+          <w:rStyle w:val="FunctionTok"/>
+          <w:rFonts w:ascii="Menlo" w:hAnsi="Menlo" w:eastAsia="Arial Unicode MS" w:cs="Menlo"/>
+          <w:sz w:val="16"/>
+          <w:lang w:val="zh-CN" w:eastAsia="zh-CN"/>
+        </w:rPr>
+        <w:t xml:space="preserve">git</w:t>
+      </w:r>
+      <w:r>
+        <w:rPr>
+          <w:rStyle w:val="NormalTok"/>
+          <w:rFonts w:ascii="Menlo" w:hAnsi="Menlo" w:eastAsia="Arial Unicode MS" w:cs="Menlo"/>
+          <w:sz w:val="16"/>
+          <w:lang w:val="zh-CN" w:eastAsia="zh-CN"/>
+        </w:rPr>
+        <w:t xml:space="preserve"> switch main</w:t>
+      </w:r>
+      <w:r>
+        <w:rPr>
+          <w:rFonts w:ascii="Menlo" w:hAnsi="Menlo" w:eastAsia="Arial Unicode MS" w:cs="Menlo"/>
+          <w:sz w:val="16"/>
+          <w:lang w:val="zh-CN" w:eastAsia="zh-CN"/>
+        </w:rPr>
+        <w:br/>
+      </w:r>
+      <w:r>
+        <w:rPr>
+          <w:rStyle w:val="FunctionTok"/>
+          <w:rFonts w:ascii="Menlo" w:hAnsi="Menlo" w:eastAsia="Arial Unicode MS" w:cs="Menlo"/>
+          <w:sz w:val="16"/>
+          <w:lang w:val="zh-CN" w:eastAsia="zh-CN"/>
+        </w:rPr>
+        <w:t xml:space="preserve">git</w:t>
+      </w:r>
+      <w:r>
+        <w:rPr>
+          <w:rStyle w:val="NormalTok"/>
+          <w:rFonts w:ascii="Menlo" w:hAnsi="Menlo" w:eastAsia="Arial Unicode MS" w:cs="Menlo"/>
+          <w:sz w:val="16"/>
+          <w:lang w:val="zh-CN" w:eastAsia="zh-CN"/>
+        </w:rPr>
+        <w:t xml:space="preserve"> pull </w:t>
+      </w:r>
+      <w:r>
+        <w:rPr>
+          <w:rStyle w:val="AttributeTok"/>
+          <w:rFonts w:ascii="Menlo" w:hAnsi="Menlo" w:eastAsia="Arial Unicode MS" w:cs="Menlo"/>
+          <w:sz w:val="16"/>
+          <w:lang w:val="zh-CN" w:eastAsia="zh-CN"/>
+        </w:rPr>
+        <w:t xml:space="preserve">--ff-only</w:t>
+      </w:r>
+      <w:r>
+        <w:rPr>
+          <w:rStyle w:val="NormalTok"/>
+          <w:rFonts w:ascii="Menlo" w:hAnsi="Menlo" w:eastAsia="Arial Unicode MS" w:cs="Menlo"/>
+          <w:sz w:val="16"/>
+          <w:lang w:val="zh-CN" w:eastAsia="zh-CN"/>
+        </w:rPr>
+        <w:t xml:space="preserve"> origin main</w:t>
+      </w:r>
+      <w:r>
+        <w:rPr>
+          <w:rFonts w:ascii="Menlo" w:hAnsi="Menlo" w:eastAsia="Arial Unicode MS" w:cs="Menlo"/>
+          <w:sz w:val="16"/>
+          <w:lang w:val="zh-CN" w:eastAsia="zh-CN"/>
+        </w:rPr>
+        <w:br/>
+      </w:r>
+      <w:r>
+        <w:rPr>
+          <w:rStyle w:val="FunctionTok"/>
+          <w:rFonts w:ascii="Menlo" w:hAnsi="Menlo" w:eastAsia="Arial Unicode MS" w:cs="Menlo"/>
+          <w:sz w:val="16"/>
+          <w:lang w:val="zh-CN" w:eastAsia="zh-CN"/>
+        </w:rPr>
+        <w:t xml:space="preserve">git</w:t>
+      </w:r>
+      <w:r>
+        <w:rPr>
+          <w:rStyle w:val="NormalTok"/>
+          <w:rFonts w:ascii="Menlo" w:hAnsi="Menlo" w:eastAsia="Arial Unicode MS" w:cs="Menlo"/>
+          <w:sz w:val="16"/>
+          <w:lang w:val="zh-CN" w:eastAsia="zh-CN"/>
+        </w:rPr>
+        <w:t xml:space="preserve"> switch </w:t>
+      </w:r>
+      <w:r>
+        <w:rPr>
+          <w:rStyle w:val="AttributeTok"/>
+          <w:rFonts w:ascii="Menlo" w:hAnsi="Menlo" w:eastAsia="Arial Unicode MS" w:cs="Menlo"/>
+          <w:sz w:val="16"/>
+          <w:lang w:val="zh-CN" w:eastAsia="zh-CN"/>
+        </w:rPr>
+        <w:t xml:space="preserve">-c</w:t>
+      </w:r>
+      <w:r>
+        <w:rPr>
+          <w:rStyle w:val="NormalTok"/>
+          <w:rFonts w:ascii="Menlo" w:hAnsi="Menlo" w:eastAsia="Arial Unicode MS" w:cs="Menlo"/>
+          <w:sz w:val="16"/>
+          <w:lang w:val="zh-CN" w:eastAsia="zh-CN"/>
+        </w:rPr>
+        <w:t xml:space="preserve"> feat/</w:t>
+      </w:r>
+      <w:r>
+        <w:rPr>
+          <w:rStyle w:val="OperatorTok"/>
+          <w:rFonts w:ascii="Menlo" w:hAnsi="Menlo" w:eastAsia="Arial Unicode MS" w:cs="Menlo"/>
+          <w:sz w:val="16"/>
+          <w:lang w:val="zh-CN" w:eastAsia="zh-CN"/>
+        </w:rPr>
+        <w:t xml:space="preserve">&lt;</w:t>
+      </w:r>
+      <w:r>
+        <w:rPr>
+          <w:rStyle w:val="NormalTok"/>
+          <w:rFonts w:ascii="Menlo" w:hAnsi="Menlo" w:eastAsia="Arial Unicode MS" w:cs="Menlo"/>
+          <w:sz w:val="16"/>
+          <w:lang w:val="zh-CN" w:eastAsia="zh-CN"/>
+        </w:rPr>
+        <w:t xml:space="preserve">role</w:t>
+      </w:r>
+      <w:r>
+        <w:rPr>
+          <w:rStyle w:val="OperatorTok"/>
+          <w:rFonts w:ascii="Menlo" w:hAnsi="Menlo" w:eastAsia="Arial Unicode MS" w:cs="Menlo"/>
+          <w:sz w:val="16"/>
+          <w:lang w:val="zh-CN" w:eastAsia="zh-CN"/>
+        </w:rPr>
+        <w:t xml:space="preserve">&gt;</w:t>
+      </w:r>
+      <w:r>
+        <w:rPr>
+          <w:rStyle w:val="NormalTok"/>
+          <w:rFonts w:ascii="Menlo" w:hAnsi="Menlo" w:eastAsia="Arial Unicode MS" w:cs="Menlo"/>
+          <w:sz w:val="16"/>
+          <w:lang w:val="zh-CN" w:eastAsia="zh-CN"/>
+        </w:rPr>
+        <w:t xml:space="preserve">-</w:t>
+      </w:r>
+      <w:r>
+        <w:rPr>
+          <w:rStyle w:val="OperatorTok"/>
+          <w:rFonts w:ascii="Menlo" w:hAnsi="Menlo" w:eastAsia="Arial Unicode MS" w:cs="Menlo"/>
+          <w:sz w:val="16"/>
+          <w:lang w:val="zh-CN" w:eastAsia="zh-CN"/>
+        </w:rPr>
+        <w:t xml:space="preserve">&lt;</w:t>
+      </w:r>
+      <w:r>
+        <w:rPr>
+          <w:rStyle w:val="NormalTok"/>
+          <w:rFonts w:ascii="Menlo" w:hAnsi="Menlo" w:eastAsia="Arial Unicode MS" w:cs="Menlo"/>
+          <w:sz w:val="16"/>
+          <w:lang w:val="zh-CN" w:eastAsia="zh-CN"/>
+        </w:rPr>
+        <w:t xml:space="preserve">single-slice</w:t>
+      </w:r>
+      <w:r>
+        <w:rPr>
+          <w:rStyle w:val="OperatorTok"/>
+          <w:rFonts w:ascii="Menlo" w:hAnsi="Menlo" w:eastAsia="Arial Unicode MS" w:cs="Menlo"/>
+          <w:sz w:val="16"/>
+          <w:lang w:val="zh-CN" w:eastAsia="zh-CN"/>
+        </w:rPr>
+        <w:t xml:space="preserve">&gt;</w:t>
+      </w:r>
+    </w:p>
+    <w:p>
+      <w:pPr>
+        <w:pStyle w:val="FirstParagraph"/>
+        <w:widowControl/>
+      </w:pPr>
+      <w:r>
+        <w:rPr>
+          <w:rFonts w:ascii="Arial" w:hAnsi="Arial" w:eastAsia="Arial Unicode MS" w:cs="Arial"/>
+          <w:lang w:val="zh-CN" w:eastAsia="zh-CN"/>
+        </w:rPr>
+        <w:t xml:space="preserve">完成后把该功能分支推送到自己的远端，并创建以</w:t>
+      </w:r>
+      <w:r>
+        <w:rPr>
+          <w:rFonts w:ascii="Arial" w:hAnsi="Arial" w:eastAsia="Arial Unicode MS" w:cs="Arial"/>
+          <w:lang w:val="zh-CN" w:eastAsia="zh-CN"/>
+        </w:rPr>
+        <w:t xml:space="preserve"> </w:t>
+      </w:r>
+      <w:r>
+        <w:rPr>
+          <w:rStyle w:val="VerbatimChar"/>
+          <w:rFonts w:ascii="Arial" w:hAnsi="Arial" w:eastAsia="Arial Unicode MS" w:cs="Arial"/>
+          <w:lang w:val="zh-CN" w:eastAsia="zh-CN"/>
+        </w:rPr>
+        <w:t xml:space="preserve">main</w:t>
+      </w:r>
+      <w:r>
+        <w:rPr>
+          <w:rFonts w:ascii="Arial" w:hAnsi="Arial" w:eastAsia="Arial Unicode MS" w:cs="Arial"/>
+          <w:lang w:val="zh-CN" w:eastAsia="zh-CN"/>
+        </w:rPr>
+        <w:t xml:space="preserve"> </w:t>
+      </w:r>
+      <w:r>
+        <w:rPr>
+          <w:rFonts w:ascii="Arial" w:hAnsi="Arial" w:eastAsia="Arial Unicode MS" w:cs="Arial"/>
+          <w:lang w:val="zh-CN" w:eastAsia="zh-CN"/>
+        </w:rPr>
+        <w:t xml:space="preserve">为 base 的 Pull Request。不得直接向</w:t>
+      </w:r>
+      <w:r>
+        <w:rPr>
+          <w:rFonts w:ascii="Arial" w:hAnsi="Arial" w:eastAsia="Arial Unicode MS" w:cs="Arial"/>
+          <w:lang w:val="zh-CN" w:eastAsia="zh-CN"/>
+        </w:rPr>
+        <w:t xml:space="preserve"> </w:t>
+      </w:r>
+      <w:r>
+        <w:rPr>
+          <w:rStyle w:val="VerbatimChar"/>
+          <w:rFonts w:ascii="Arial" w:hAnsi="Arial" w:eastAsia="Arial Unicode MS" w:cs="Arial"/>
+          <w:lang w:val="zh-CN" w:eastAsia="zh-CN"/>
+        </w:rPr>
+        <w:t xml:space="preserve">main</w:t>
+      </w:r>
+      <w:r>
+        <w:rPr>
+          <w:rFonts w:ascii="Arial" w:hAnsi="Arial" w:eastAsia="Arial Unicode MS" w:cs="Arial"/>
+          <w:lang w:val="zh-CN" w:eastAsia="zh-CN"/>
+        </w:rPr>
+        <w:t xml:space="preserve"> </w:t>
+      </w:r>
+      <w:r>
+        <w:rPr>
+          <w:rFonts w:ascii="Arial" w:hAnsi="Arial" w:eastAsia="Arial Unicode MS" w:cs="Arial"/>
+          <w:lang w:val="zh-CN" w:eastAsia="zh-CN"/>
+        </w:rPr>
+        <w:t xml:space="preserve">推送；合并后删除短期分支。历史日志和资产 ledger 中的旧分支名只用于复现实验与 PR，不是当前命令。</w:t>
+      </w:r>
+    </w:p>
+    <w:bookmarkStart w:id="63" w:name="开发者开工回执"/>
+    <w:p>
+      <w:pPr>
+        <w:pStyle w:val="Heading3"/>
+        <w:keepNext/>
+        <w:keepLines/>
+        <w:widowControl/>
+      </w:pPr>
+      <w:r>
+        <w:rPr>
+          <w:rFonts w:ascii="Arial" w:hAnsi="Arial" w:eastAsia="Arial Unicode MS" w:cs="Arial"/>
+          <w:lang w:val="zh-CN" w:eastAsia="zh-CN"/>
+        </w:rPr>
+        <w:t xml:space="preserve">12.3 开发者开工回执</w:t>
+      </w:r>
+    </w:p>
+    <w:p>
+      <w:pPr>
+        <w:pStyle w:val="FirstParagraph"/>
+        <w:widowControl/>
+      </w:pPr>
+      <w:r>
+        <w:rPr>
+          <w:rFonts w:ascii="Arial" w:hAnsi="Arial" w:eastAsia="Arial Unicode MS" w:cs="Arial"/>
+          <w:lang w:val="zh-CN" w:eastAsia="zh-CN"/>
+        </w:rPr>
+        <w:t xml:space="preserve">每次把仓库和本文交给开发者或编程 AI 时，先填写下表并贴进 PR 描述，避免再次基于旧分支开发：</w:t>
+      </w:r>
+    </w:p>
+    <w:tbl>
+      <w:tblPr>
+        <w:tblStyle w:val="Table"/>
+        <w:tblW w:type="dxa" w:w="9360"/>
+        <w:jc w:val="left"/>
+        <w:tblLayout w:type="fixed"/>
+        <w:tblLook w:firstRow="1" w:lastRow="0" w:firstColumn="0" w:lastColumn="0" w:noHBand="0" w:noVBand="0" w:val="0020"/>
+        <w:tblInd w:w="120" w:type="dxa"/>
+        <w:tblBorders>
+          <w:top w:val="single" w:sz="4" w:space="0" w:color="B8C4D1"/>
+          <w:left w:val="single" w:sz="4" w:space="0" w:color="B8C4D1"/>
+          <w:bottom w:val="single" w:sz="4" w:space="0" w:color="B8C4D1"/>
+          <w:right w:val="single" w:sz="4" w:space="0" w:color="B8C4D1"/>
+          <w:insideH w:val="single" w:sz="4" w:space="0" w:color="B8C4D1"/>
+          <w:insideV w:val="single" w:sz="4" w:space="0" w:color="B8C4D1"/>
+        </w:tblBorders>
+      </w:tblPr>
+      <w:tblGrid>
+        <w:gridCol w:w="2000"/>
+        <w:gridCol w:w="7360"/>
+      </w:tblGrid>
+      <w:tr>
+        <w:trPr>
+          <w:tblHeader w:val="true"/>
+          <w:cantSplit w:val="true"/>
+        </w:trPr>
+        <w:tc>
+          <w:tcPr>
+            <w:tcW w:w="2000" w:type="dxa"/>
+            <w:vAlign w:val="center"/>
+            <w:tcMar>
+              <w:top w:w="80" w:type="dxa"/>
+              <w:start w:w="120" w:type="dxa"/>
+              <w:bottom w:w="80" w:type="dxa"/>
+              <w:end w:w="120" w:type="dxa"/>
+            </w:tcMar>
+            <w:shd w:val="clear" w:color="auto" w:fill="E8EEF5"/>
+          </w:tcPr>
+          <w:p>
+            <w:pPr>
+              <w:pStyle w:val="NanoLoopTableHeader"/>
+              <w:keepNext w:val="0"/>
+              <w:keepLines w:val="0"/>
+              <w:jc w:val="left"/>
+            </w:pPr>
+            <w:r>
+              <w:rPr>
+                <w:rFonts w:ascii="Arial" w:hAnsi="Arial" w:eastAsia="Arial Unicode MS" w:cs="Arial"/>
+                <w:b/>
+                <w:color w:val="0B2545"/>
+                <w:sz w:val="17"/>
+                <w:lang w:val="zh-CN" w:eastAsia="zh-CN"/>
+              </w:rPr>
+              <w:t xml:space="preserve">字段</w:t>
+            </w:r>
+          </w:p>
+        </w:tc>
+        <w:tc>
+          <w:tcPr>
+            <w:tcW w:w="7360" w:type="dxa"/>
+            <w:vAlign w:val="center"/>
+            <w:tcMar>
+              <w:top w:w="80" w:type="dxa"/>
+              <w:start w:w="120" w:type="dxa"/>
+              <w:bottom w:w="80" w:type="dxa"/>
+              <w:end w:w="120" w:type="dxa"/>
+            </w:tcMar>
+            <w:shd w:val="clear" w:color="auto" w:fill="E8EEF5"/>
+          </w:tcPr>
+          <w:p>
+            <w:pPr>
+              <w:pStyle w:val="NanoLoopTableHeader"/>
+              <w:keepNext w:val="0"/>
+              <w:keepLines w:val="0"/>
+              <w:jc w:val="left"/>
+            </w:pPr>
+            <w:r>
+              <w:rPr>
+                <w:rFonts w:ascii="Arial" w:hAnsi="Arial" w:eastAsia="Arial Unicode MS" w:cs="Arial"/>
+                <w:b/>
+                <w:color w:val="0B2545"/>
+                <w:sz w:val="17"/>
+                <w:lang w:val="zh-CN" w:eastAsia="zh-CN"/>
+              </w:rPr>
+              <w:t xml:space="preserve">必填内容</w:t>
+            </w:r>
+          </w:p>
+        </w:tc>
+      </w:tr>
+      <w:tr>
+        <w:trPr>
+          <w:cantSplit w:val="true"/>
+        </w:trPr>
+        <w:tc>
+          <w:tcPr>
+            <w:tcW w:w="2000" w:type="dxa"/>
+            <w:vAlign w:val="center"/>
+            <w:tcMar>
+              <w:top w:w="80" w:type="dxa"/>
+              <w:start w:w="120" w:type="dxa"/>
+              <w:bottom w:w="80" w:type="dxa"/>
+              <w:end w:w="120" w:type="dxa"/>
+            </w:tcMar>
+          </w:tcPr>
+          <w:p>
+            <w:pPr>
+              <w:pStyle w:val="NanoLoopTable"/>
+              <w:keepNext w:val="0"/>
+              <w:keepLines w:val="0"/>
+              <w:jc w:val="left"/>
+            </w:pPr>
+            <w:r>
+              <w:rPr>
+                <w:rFonts w:ascii="Arial" w:hAnsi="Arial" w:eastAsia="Arial Unicode MS" w:cs="Arial"/>
+                <w:sz w:val="17"/>
+                <w:lang w:val="zh-CN" w:eastAsia="zh-CN"/>
+              </w:rPr>
+              <w:t xml:space="preserve">姓名 / 角色</w:t>
+            </w:r>
+          </w:p>
+        </w:tc>
+        <w:tc>
+          <w:tcPr>
+            <w:tcW w:w="7360" w:type="dxa"/>
+            <w:vAlign w:val="center"/>
+            <w:tcMar>
+              <w:top w:w="80" w:type="dxa"/>
+              <w:start w:w="120" w:type="dxa"/>
+              <w:bottom w:w="80" w:type="dxa"/>
+              <w:end w:w="120" w:type="dxa"/>
+            </w:tcMar>
+          </w:tcPr>
+          <w:p>
+            <w:pPr>
+              <w:pStyle w:val="NanoLoopTable"/>
+              <w:keepNext w:val="0"/>
+              <w:keepLines w:val="0"/>
+              <w:jc w:val="left"/>
+            </w:pPr>
+            <w:r>
+              <w:rPr>
+                <w:rFonts w:ascii="Arial" w:hAnsi="Arial" w:eastAsia="Arial Unicode MS" w:cs="Arial"/>
+                <w:sz w:val="17"/>
+                <w:lang w:val="zh-CN" w:eastAsia="zh-CN"/>
+              </w:rPr>
+              <w:t xml:space="preserve">开发者姓名及 A～F 职责</w:t>
+            </w:r>
+          </w:p>
+        </w:tc>
+      </w:tr>
+      <w:tr>
+        <w:trPr>
+          <w:cantSplit w:val="true"/>
+        </w:trPr>
+        <w:tc>
+          <w:tcPr>
+            <w:tcW w:w="2000" w:type="dxa"/>
+            <w:vAlign w:val="center"/>
+            <w:tcMar>
+              <w:top w:w="80" w:type="dxa"/>
+              <w:start w:w="120" w:type="dxa"/>
+              <w:bottom w:w="80" w:type="dxa"/>
+              <w:end w:w="120" w:type="dxa"/>
+            </w:tcMar>
+          </w:tcPr>
+          <w:p>
+            <w:pPr>
+              <w:pStyle w:val="NanoLoopTable"/>
+              <w:keepNext w:val="0"/>
+              <w:keepLines w:val="0"/>
+              <w:jc w:val="left"/>
+            </w:pPr>
+            <w:r>
+              <w:rPr>
+                <w:rStyle w:val="VerbatimChar"/>
+                <w:rFonts w:ascii="Arial" w:hAnsi="Arial" w:eastAsia="Arial Unicode MS" w:cs="Arial"/>
+                <w:sz w:val="17"/>
+                <w:lang w:val="zh-CN" w:eastAsia="zh-CN"/>
+              </w:rPr>
+              <w:t xml:space="preserve">main</w:t>
+            </w:r>
+            <w:r>
+              <w:rPr>
+                <w:rFonts w:ascii="Arial" w:hAnsi="Arial" w:eastAsia="Arial Unicode MS" w:cs="Arial"/>
+                <w:sz w:val="17"/>
+                <w:lang w:val="zh-CN" w:eastAsia="zh-CN"/>
+              </w:rPr>
+              <w:t xml:space="preserve"> </w:t>
+            </w:r>
+            <w:r>
+              <w:rPr>
+                <w:rFonts w:ascii="Arial" w:hAnsi="Arial" w:eastAsia="Arial Unicode MS" w:cs="Arial"/>
+                <w:sz w:val="17"/>
+                <w:lang w:val="zh-CN" w:eastAsia="zh-CN"/>
+              </w:rPr>
+              <w:t xml:space="preserve">基线</w:t>
+            </w:r>
+          </w:p>
+        </w:tc>
+        <w:tc>
+          <w:tcPr>
+            <w:tcW w:w="7360" w:type="dxa"/>
+            <w:vAlign w:val="center"/>
+            <w:tcMar>
+              <w:top w:w="80" w:type="dxa"/>
+              <w:start w:w="120" w:type="dxa"/>
+              <w:bottom w:w="80" w:type="dxa"/>
+              <w:end w:w="120" w:type="dxa"/>
+            </w:tcMar>
+          </w:tcPr>
+          <w:p>
+            <w:pPr>
+              <w:pStyle w:val="NanoLoopTable"/>
+              <w:keepNext w:val="0"/>
+              <w:keepLines w:val="0"/>
+              <w:jc w:val="left"/>
+            </w:pPr>
+            <w:r>
+              <w:rPr>
+                <w:rStyle w:val="VerbatimChar"/>
+                <w:rFonts w:ascii="Arial" w:hAnsi="Arial" w:eastAsia="Arial Unicode MS" w:cs="Arial"/>
+                <w:sz w:val="17"/>
+                <w:lang w:val="zh-CN" w:eastAsia="zh-CN"/>
+              </w:rPr>
+              <w:t xml:space="preserve">git rev-parse origin/main</w:t>
+            </w:r>
+            <w:r>
+              <w:rPr>
+                <w:rFonts w:ascii="Arial" w:hAnsi="Arial" w:eastAsia="Arial Unicode MS" w:cs="Arial"/>
+                <w:sz w:val="17"/>
+                <w:lang w:val="zh-CN" w:eastAsia="zh-CN"/>
+              </w:rPr>
+              <w:t xml:space="preserve"> </w:t>
+            </w:r>
+            <w:r>
+              <w:rPr>
+                <w:rFonts w:ascii="Arial" w:hAnsi="Arial" w:eastAsia="Arial Unicode MS" w:cs="Arial"/>
+                <w:sz w:val="17"/>
+                <w:lang w:val="zh-CN" w:eastAsia="zh-CN"/>
+              </w:rPr>
+              <w:t xml:space="preserve">的完整 commit</w:t>
+            </w:r>
+          </w:p>
+        </w:tc>
+      </w:tr>
+      <w:tr>
+        <w:trPr>
+          <w:cantSplit w:val="true"/>
+        </w:trPr>
+        <w:tc>
+          <w:tcPr>
+            <w:tcW w:w="2000" w:type="dxa"/>
+            <w:vAlign w:val="center"/>
+            <w:tcMar>
+              <w:top w:w="80" w:type="dxa"/>
+              <w:start w:w="120" w:type="dxa"/>
+              <w:bottom w:w="80" w:type="dxa"/>
+              <w:end w:w="120" w:type="dxa"/>
+            </w:tcMar>
+          </w:tcPr>
+          <w:p>
+            <w:pPr>
+              <w:pStyle w:val="NanoLoopTable"/>
+              <w:keepNext w:val="0"/>
+              <w:keepLines w:val="0"/>
+              <w:jc w:val="left"/>
+            </w:pPr>
+            <w:r>
+              <w:rPr>
+                <w:rFonts w:ascii="Arial" w:hAnsi="Arial" w:eastAsia="Arial Unicode MS" w:cs="Arial"/>
+                <w:sz w:val="17"/>
+                <w:lang w:val="zh-CN" w:eastAsia="zh-CN"/>
+              </w:rPr>
+              <w:t xml:space="preserve">工作分支</w:t>
+            </w:r>
+          </w:p>
+        </w:tc>
+        <w:tc>
+          <w:tcPr>
+            <w:tcW w:w="7360" w:type="dxa"/>
+            <w:vAlign w:val="center"/>
+            <w:tcMar>
+              <w:top w:w="80" w:type="dxa"/>
+              <w:start w:w="120" w:type="dxa"/>
+              <w:bottom w:w="80" w:type="dxa"/>
+              <w:end w:w="120" w:type="dxa"/>
+            </w:tcMar>
+          </w:tcPr>
+          <w:p>
+            <w:pPr>
+              <w:pStyle w:val="NanoLoopTable"/>
+              <w:keepNext w:val="0"/>
+              <w:keepLines w:val="0"/>
+              <w:jc w:val="left"/>
+            </w:pPr>
+            <w:r>
+              <w:rPr>
+                <w:rFonts w:ascii="Arial" w:hAnsi="Arial" w:eastAsia="Arial Unicode MS" w:cs="Arial"/>
+                <w:sz w:val="17"/>
+                <w:lang w:val="zh-CN" w:eastAsia="zh-CN"/>
+              </w:rPr>
+              <w:t xml:space="preserve">本次新建的短期</w:t>
+            </w:r>
+            <w:r>
+              <w:rPr>
+                <w:rFonts w:ascii="Arial" w:hAnsi="Arial" w:eastAsia="Arial Unicode MS" w:cs="Arial"/>
+                <w:sz w:val="17"/>
+                <w:lang w:val="zh-CN" w:eastAsia="zh-CN"/>
+              </w:rPr>
+              <w:t xml:space="preserve"> </w:t>
+            </w:r>
+            <w:r>
+              <w:rPr>
+                <w:rStyle w:val="VerbatimChar"/>
+                <w:rFonts w:ascii="Arial" w:hAnsi="Arial" w:eastAsia="Arial Unicode MS" w:cs="Arial"/>
+                <w:sz w:val="17"/>
+                <w:lang w:val="zh-CN" w:eastAsia="zh-CN"/>
+              </w:rPr>
+              <w:t xml:space="preserve">feat/*</w:t>
+            </w:r>
+            <w:r>
+              <w:rPr>
+                <w:rFonts w:ascii="Arial" w:hAnsi="Arial" w:eastAsia="Arial Unicode MS" w:cs="Arial"/>
+                <w:sz w:val="17"/>
+                <w:lang w:val="zh-CN" w:eastAsia="zh-CN"/>
+              </w:rPr>
+              <w:t xml:space="preserve">、</w:t>
+            </w:r>
+            <w:r>
+              <w:rPr>
+                <w:rStyle w:val="VerbatimChar"/>
+                <w:rFonts w:ascii="Arial" w:hAnsi="Arial" w:eastAsia="Arial Unicode MS" w:cs="Arial"/>
+                <w:sz w:val="17"/>
+                <w:lang w:val="zh-CN" w:eastAsia="zh-CN"/>
+              </w:rPr>
+              <w:t xml:space="preserve">fix/*</w:t>
+            </w:r>
+            <w:r>
+              <w:rPr>
+                <w:rFonts w:ascii="Arial" w:hAnsi="Arial" w:eastAsia="Arial Unicode MS" w:cs="Arial"/>
+                <w:sz w:val="17"/>
+                <w:lang w:val="zh-CN" w:eastAsia="zh-CN"/>
+              </w:rPr>
+              <w:t xml:space="preserve">、</w:t>
+            </w:r>
+            <w:r>
+              <w:rPr>
+                <w:rStyle w:val="VerbatimChar"/>
+                <w:rFonts w:ascii="Arial" w:hAnsi="Arial" w:eastAsia="Arial Unicode MS" w:cs="Arial"/>
+                <w:sz w:val="17"/>
+                <w:lang w:val="zh-CN" w:eastAsia="zh-CN"/>
+              </w:rPr>
+              <w:t xml:space="preserve">docs/*</w:t>
+            </w:r>
+            <w:r>
+              <w:rPr>
+                <w:rFonts w:ascii="Arial" w:hAnsi="Arial" w:eastAsia="Arial Unicode MS" w:cs="Arial"/>
+                <w:sz w:val="17"/>
+                <w:lang w:val="zh-CN" w:eastAsia="zh-CN"/>
+              </w:rPr>
+              <w:t xml:space="preserve"> </w:t>
+            </w:r>
+            <w:r>
+              <w:rPr>
+                <w:rFonts w:ascii="Arial" w:hAnsi="Arial" w:eastAsia="Arial Unicode MS" w:cs="Arial"/>
+                <w:sz w:val="17"/>
+                <w:lang w:val="zh-CN" w:eastAsia="zh-CN"/>
+              </w:rPr>
+              <w:t xml:space="preserve">或</w:t>
+            </w:r>
+            <w:r>
+              <w:rPr>
+                <w:rFonts w:ascii="Arial" w:hAnsi="Arial" w:eastAsia="Arial Unicode MS" w:cs="Arial"/>
+                <w:sz w:val="17"/>
+                <w:lang w:val="zh-CN" w:eastAsia="zh-CN"/>
+              </w:rPr>
+              <w:t xml:space="preserve"> </w:t>
+            </w:r>
+            <w:r>
+              <w:rPr>
+                <w:rStyle w:val="VerbatimChar"/>
+                <w:rFonts w:ascii="Arial" w:hAnsi="Arial" w:eastAsia="Arial Unicode MS" w:cs="Arial"/>
+                <w:sz w:val="17"/>
+                <w:lang w:val="zh-CN" w:eastAsia="zh-CN"/>
+              </w:rPr>
+              <w:t xml:space="preserve">chore/*</w:t>
+            </w:r>
+          </w:p>
+        </w:tc>
+      </w:tr>
+      <w:tr>
+        <w:trPr>
+          <w:cantSplit w:val="true"/>
+        </w:trPr>
+        <w:tc>
+          <w:tcPr>
+            <w:tcW w:w="2000" w:type="dxa"/>
+            <w:vAlign w:val="center"/>
+            <w:tcMar>
+              <w:top w:w="80" w:type="dxa"/>
+              <w:start w:w="120" w:type="dxa"/>
+              <w:bottom w:w="80" w:type="dxa"/>
+              <w:end w:w="120" w:type="dxa"/>
+            </w:tcMar>
+          </w:tcPr>
+          <w:p>
+            <w:pPr>
+              <w:pStyle w:val="NanoLoopTable"/>
+              <w:keepNext w:val="0"/>
+              <w:keepLines w:val="0"/>
+              <w:jc w:val="left"/>
+            </w:pPr>
+            <w:r>
+              <w:rPr>
+                <w:rFonts w:ascii="Arial" w:hAnsi="Arial" w:eastAsia="Arial Unicode MS" w:cs="Arial"/>
+                <w:sz w:val="17"/>
+                <w:lang w:val="zh-CN" w:eastAsia="zh-CN"/>
+              </w:rPr>
+              <w:t xml:space="preserve">单一任务</w:t>
+            </w:r>
+          </w:p>
+        </w:tc>
+        <w:tc>
+          <w:tcPr>
+            <w:tcW w:w="7360" w:type="dxa"/>
+            <w:vAlign w:val="center"/>
+            <w:tcMar>
+              <w:top w:w="80" w:type="dxa"/>
+              <w:start w:w="120" w:type="dxa"/>
+              <w:bottom w:w="80" w:type="dxa"/>
+              <w:end w:w="120" w:type="dxa"/>
+            </w:tcMar>
+          </w:tcPr>
+          <w:p>
+            <w:pPr>
+              <w:pStyle w:val="NanoLoopTable"/>
+              <w:keepNext w:val="0"/>
+              <w:keepLines w:val="0"/>
+              <w:jc w:val="left"/>
+            </w:pPr>
+            <w:r>
+              <w:rPr>
+                <w:rFonts w:ascii="Arial" w:hAnsi="Arial" w:eastAsia="Arial Unicode MS" w:cs="Arial"/>
+                <w:sz w:val="17"/>
+                <w:lang w:val="zh-CN" w:eastAsia="zh-CN"/>
+              </w:rPr>
+              <w:t xml:space="preserve">本 PR 唯一要完成的行为切片、允许修改路径和明确非目标</w:t>
+            </w:r>
+          </w:p>
+        </w:tc>
+      </w:tr>
+      <w:tr>
+        <w:trPr>
+          <w:cantSplit w:val="true"/>
+        </w:trPr>
+        <w:tc>
+          <w:tcPr>
+            <w:tcW w:w="2000" w:type="dxa"/>
+            <w:vAlign w:val="center"/>
+            <w:tcMar>
+              <w:top w:w="80" w:type="dxa"/>
+              <w:start w:w="120" w:type="dxa"/>
+              <w:bottom w:w="80" w:type="dxa"/>
+              <w:end w:w="120" w:type="dxa"/>
+            </w:tcMar>
+          </w:tcPr>
+          <w:p>
+            <w:pPr>
+              <w:pStyle w:val="NanoLoopTable"/>
+              <w:keepNext w:val="0"/>
+              <w:keepLines w:val="0"/>
+              <w:jc w:val="left"/>
+            </w:pPr>
+            <w:r>
+              <w:rPr>
+                <w:rFonts w:ascii="Arial" w:hAnsi="Arial" w:eastAsia="Arial Unicode MS" w:cs="Arial"/>
+                <w:sz w:val="17"/>
+                <w:lang w:val="zh-CN" w:eastAsia="zh-CN"/>
+              </w:rPr>
+              <w:t xml:space="preserve">外部资产</w:t>
+            </w:r>
+          </w:p>
+        </w:tc>
+        <w:tc>
+          <w:tcPr>
+            <w:tcW w:w="7360" w:type="dxa"/>
+            <w:vAlign w:val="center"/>
+            <w:tcMar>
+              <w:top w:w="80" w:type="dxa"/>
+              <w:start w:w="120" w:type="dxa"/>
+              <w:bottom w:w="80" w:type="dxa"/>
+              <w:end w:w="120" w:type="dxa"/>
+            </w:tcMar>
+          </w:tcPr>
+          <w:p>
+            <w:pPr>
+              <w:pStyle w:val="NanoLoopTable"/>
+              <w:keepNext w:val="0"/>
+              <w:keepLines w:val="0"/>
+              <w:jc w:val="left"/>
+            </w:pPr>
+            <w:r>
+              <w:rPr>
+                <w:rFonts w:ascii="Arial" w:hAnsi="Arial" w:eastAsia="Arial Unicode MS" w:cs="Arial"/>
+                <w:sz w:val="17"/>
+                <w:lang w:val="zh-CN" w:eastAsia="zh-CN"/>
+              </w:rPr>
+              <w:t xml:space="preserve">受控位置、版本、SHA-256、许可与当前</w:t>
+            </w:r>
+            <w:r>
+              <w:rPr>
+                <w:rFonts w:ascii="Arial" w:hAnsi="Arial" w:eastAsia="Arial Unicode MS" w:cs="Arial"/>
+                <w:sz w:val="17"/>
+                <w:lang w:val="zh-CN" w:eastAsia="zh-CN"/>
+              </w:rPr>
+              <w:t xml:space="preserve"> </w:t>
+            </w:r>
+            <w:r>
+              <w:rPr>
+                <w:rStyle w:val="VerbatimChar"/>
+                <w:rFonts w:ascii="Arial" w:hAnsi="Arial" w:eastAsia="Arial Unicode MS" w:cs="Arial"/>
+                <w:sz w:val="17"/>
+                <w:lang w:val="zh-CN" w:eastAsia="zh-CN"/>
+              </w:rPr>
+              <w:t xml:space="preserve">ready/partial/unavailable</w:t>
+            </w:r>
+            <w:r>
+              <w:rPr>
+                <w:rFonts w:ascii="Arial" w:hAnsi="Arial" w:eastAsia="Arial Unicode MS" w:cs="Arial"/>
+                <w:sz w:val="17"/>
+                <w:lang w:val="zh-CN" w:eastAsia="zh-CN"/>
+              </w:rPr>
+              <w:t xml:space="preserve">；没有则写</w:t>
+            </w:r>
+            <w:r>
+              <w:rPr>
+                <w:rFonts w:ascii="Arial" w:hAnsi="Arial" w:eastAsia="Arial Unicode MS" w:cs="Arial"/>
+                <w:sz w:val="17"/>
+                <w:lang w:val="zh-CN" w:eastAsia="zh-CN"/>
+              </w:rPr>
+              <w:t xml:space="preserve">“</w:t>
+            </w:r>
+            <w:r>
+              <w:rPr>
+                <w:rFonts w:ascii="Arial" w:hAnsi="Arial" w:eastAsia="Arial Unicode MS" w:cs="Arial"/>
+                <w:sz w:val="17"/>
+                <w:lang w:val="zh-CN" w:eastAsia="zh-CN"/>
+              </w:rPr>
+              <w:t xml:space="preserve">无</w:t>
+            </w:r>
+            <w:r>
+              <w:rPr>
+                <w:rFonts w:ascii="Arial" w:hAnsi="Arial" w:eastAsia="Arial Unicode MS" w:cs="Arial"/>
+                <w:sz w:val="17"/>
+                <w:lang w:val="zh-CN" w:eastAsia="zh-CN"/>
+              </w:rPr>
+              <w:t xml:space="preserve">”</w:t>
+            </w:r>
+          </w:p>
+        </w:tc>
+      </w:tr>
+      <w:tr>
+        <w:trPr>
+          <w:cantSplit w:val="true"/>
+        </w:trPr>
+        <w:tc>
+          <w:tcPr>
+            <w:tcW w:w="2000" w:type="dxa"/>
+            <w:vAlign w:val="center"/>
+            <w:tcMar>
+              <w:top w:w="80" w:type="dxa"/>
+              <w:start w:w="120" w:type="dxa"/>
+              <w:bottom w:w="80" w:type="dxa"/>
+              <w:end w:w="120" w:type="dxa"/>
+            </w:tcMar>
+          </w:tcPr>
+          <w:p>
+            <w:pPr>
+              <w:pStyle w:val="NanoLoopTable"/>
+              <w:keepNext w:val="0"/>
+              <w:keepLines w:val="0"/>
+              <w:jc w:val="left"/>
+            </w:pPr>
+            <w:r>
+              <w:rPr>
+                <w:rFonts w:ascii="Arial" w:hAnsi="Arial" w:eastAsia="Arial Unicode MS" w:cs="Arial"/>
+                <w:sz w:val="17"/>
+                <w:lang w:val="zh-CN" w:eastAsia="zh-CN"/>
+              </w:rPr>
+              <w:t xml:space="preserve">验证计划</w:t>
+            </w:r>
+          </w:p>
+        </w:tc>
+        <w:tc>
+          <w:tcPr>
+            <w:tcW w:w="7360" w:type="dxa"/>
+            <w:vAlign w:val="center"/>
+            <w:tcMar>
+              <w:top w:w="80" w:type="dxa"/>
+              <w:start w:w="120" w:type="dxa"/>
+              <w:bottom w:w="80" w:type="dxa"/>
+              <w:end w:w="120" w:type="dxa"/>
+            </w:tcMar>
+          </w:tcPr>
+          <w:p>
+            <w:pPr>
+              <w:pStyle w:val="NanoLoopTable"/>
+              <w:keepNext w:val="0"/>
+              <w:keepLines w:val="0"/>
+              <w:jc w:val="left"/>
+            </w:pPr>
+            <w:r>
+              <w:rPr>
+                <w:rFonts w:ascii="Arial" w:hAnsi="Arial" w:eastAsia="Arial Unicode MS" w:cs="Arial"/>
+                <w:sz w:val="17"/>
+                <w:lang w:val="zh-CN" w:eastAsia="zh-CN"/>
+              </w:rPr>
+              <w:t xml:space="preserve">相关窄测试、</w:t>
+            </w:r>
+            <w:r>
+              <w:rPr>
+                <w:rStyle w:val="VerbatimChar"/>
+                <w:rFonts w:ascii="Arial" w:hAnsi="Arial" w:eastAsia="Arial Unicode MS" w:cs="Arial"/>
+                <w:sz w:val="17"/>
+                <w:lang w:val="zh-CN" w:eastAsia="zh-CN"/>
+              </w:rPr>
+              <w:t xml:space="preserve">make check</w:t>
+            </w:r>
+            <w:r>
+              <w:rPr>
+                <w:rFonts w:ascii="Arial" w:hAnsi="Arial" w:eastAsia="Arial Unicode MS" w:cs="Arial"/>
+                <w:sz w:val="17"/>
+                <w:lang w:val="zh-CN" w:eastAsia="zh-CN"/>
+              </w:rPr>
+              <w:t xml:space="preserve">、真实资产 slow smoke 及尚未验证的项目</w:t>
+            </w:r>
+          </w:p>
+        </w:tc>
+      </w:tr>
+    </w:tbl>
+    <w:p>
+      <w:pPr>
+        <w:pStyle w:val="BodyText"/>
+        <w:widowControl/>
+      </w:pPr>
+      <w:r>
+        <w:rPr>
+          <w:rFonts w:ascii="Arial" w:hAnsi="Arial" w:eastAsia="Arial Unicode MS" w:cs="Arial"/>
+          <w:lang w:val="zh-CN" w:eastAsia="zh-CN"/>
+        </w:rPr>
+        <w:t xml:space="preserve">开发者回执中若基线不是最新</w:t>
+      </w:r>
+      <w:r>
+        <w:rPr>
+          <w:rFonts w:ascii="Arial" w:hAnsi="Arial" w:eastAsia="Arial Unicode MS" w:cs="Arial"/>
+          <w:lang w:val="zh-CN" w:eastAsia="zh-CN"/>
+        </w:rPr>
+        <w:t xml:space="preserve"> </w:t>
+      </w:r>
+      <w:r>
+        <w:rPr>
+          <w:rStyle w:val="VerbatimChar"/>
+          <w:rFonts w:ascii="Arial" w:hAnsi="Arial" w:eastAsia="Arial Unicode MS" w:cs="Arial"/>
+          <w:lang w:val="zh-CN" w:eastAsia="zh-CN"/>
+        </w:rPr>
+        <w:t xml:space="preserve">origin/main</w:t>
+      </w:r>
+      <w:r>
+        <w:rPr>
+          <w:rFonts w:ascii="Arial" w:hAnsi="Arial" w:eastAsia="Arial Unicode MS" w:cs="Arial"/>
+          <w:lang w:val="zh-CN" w:eastAsia="zh-CN"/>
+        </w:rPr>
+        <w:t xml:space="preserve">、工作分支直接是</w:t>
+      </w:r>
+      <w:r>
+        <w:rPr>
+          <w:rFonts w:ascii="Arial" w:hAnsi="Arial" w:eastAsia="Arial Unicode MS" w:cs="Arial"/>
+          <w:lang w:val="zh-CN" w:eastAsia="zh-CN"/>
+        </w:rPr>
+        <w:t xml:space="preserve"> </w:t>
+      </w:r>
+      <w:r>
+        <w:rPr>
+          <w:rStyle w:val="VerbatimChar"/>
+          <w:rFonts w:ascii="Arial" w:hAnsi="Arial" w:eastAsia="Arial Unicode MS" w:cs="Arial"/>
+          <w:lang w:val="zh-CN" w:eastAsia="zh-CN"/>
+        </w:rPr>
+        <w:t xml:space="preserve">main</w:t>
+      </w:r>
+      <w:r>
+        <w:rPr>
+          <w:rFonts w:ascii="Arial" w:hAnsi="Arial" w:eastAsia="Arial Unicode MS" w:cs="Arial"/>
+          <w:lang w:val="zh-CN" w:eastAsia="zh-CN"/>
+        </w:rPr>
+        <w:t xml:space="preserve">，或把权重、语料、索引、密钥写进</w:t>
+      </w:r>
+      <w:r>
+        <w:rPr>
+          <w:rFonts w:ascii="Arial" w:hAnsi="Arial" w:eastAsia="Arial Unicode MS" w:cs="Arial"/>
+          <w:lang w:val="zh-CN" w:eastAsia="zh-CN"/>
+        </w:rPr>
+        <w:t xml:space="preserve"> </w:t>
+      </w:r>
+      <w:r>
+        <w:rPr>
+          <w:rFonts w:ascii="Arial" w:hAnsi="Arial" w:eastAsia="Arial Unicode MS" w:cs="Arial"/>
+          <w:lang w:val="zh-CN" w:eastAsia="zh-CN"/>
+        </w:rPr>
+        <w:t xml:space="preserve">公开 Git，应停止编码并先修正工作区。分支规则统一不改变 RAG 的验收门槛：没有真实全文、固定</w:t>
+      </w:r>
+      <w:r>
+        <w:rPr>
+          <w:rFonts w:ascii="Arial" w:hAnsi="Arial" w:eastAsia="Arial Unicode MS" w:cs="Arial"/>
+          <w:lang w:val="zh-CN" w:eastAsia="zh-CN"/>
+        </w:rPr>
+        <w:t xml:space="preserve"> </w:t>
+      </w:r>
+      <w:r>
+        <w:rPr>
+          <w:rFonts w:ascii="Arial" w:hAnsi="Arial" w:eastAsia="Arial Unicode MS" w:cs="Arial"/>
+          <w:lang w:val="zh-CN" w:eastAsia="zh-CN"/>
+        </w:rPr>
+        <w:t xml:space="preserve">embedding、索引重启和可核验引用证据时，状态仍只能是</w:t>
+      </w:r>
+      <w:r>
+        <w:rPr>
+          <w:rFonts w:ascii="Arial" w:hAnsi="Arial" w:eastAsia="Arial Unicode MS" w:cs="Arial"/>
+          <w:lang w:val="zh-CN" w:eastAsia="zh-CN"/>
+        </w:rPr>
+        <w:t xml:space="preserve"> </w:t>
+      </w:r>
+      <w:r>
+        <w:rPr>
+          <w:rStyle w:val="VerbatimChar"/>
+          <w:rFonts w:ascii="Arial" w:hAnsi="Arial" w:eastAsia="Arial Unicode MS" w:cs="Arial"/>
+          <w:lang w:val="zh-CN" w:eastAsia="zh-CN"/>
+        </w:rPr>
+        <w:t xml:space="preserve">partial</w:t>
+      </w:r>
+      <w:r>
+        <w:rPr>
+          <w:rFonts w:ascii="Arial" w:hAnsi="Arial" w:eastAsia="Arial Unicode MS" w:cs="Arial"/>
+          <w:lang w:val="zh-CN" w:eastAsia="zh-CN"/>
+        </w:rPr>
+        <w:t xml:space="preserve"> </w:t>
+      </w:r>
+      <w:r>
+        <w:rPr>
+          <w:rFonts w:ascii="Arial" w:hAnsi="Arial" w:eastAsia="Arial Unicode MS" w:cs="Arial"/>
+          <w:lang w:val="zh-CN" w:eastAsia="zh-CN"/>
+        </w:rPr>
+        <w:t xml:space="preserve">或</w:t>
+      </w:r>
+      <w:r>
+        <w:rPr>
+          <w:rFonts w:ascii="Arial" w:hAnsi="Arial" w:eastAsia="Arial Unicode MS" w:cs="Arial"/>
+          <w:lang w:val="zh-CN" w:eastAsia="zh-CN"/>
+        </w:rPr>
+        <w:t xml:space="preserve"> </w:t>
+      </w:r>
+      <w:r>
+        <w:rPr>
+          <w:rStyle w:val="VerbatimChar"/>
+          <w:rFonts w:ascii="Arial" w:hAnsi="Arial" w:eastAsia="Arial Unicode MS" w:cs="Arial"/>
+          <w:lang w:val="zh-CN" w:eastAsia="zh-CN"/>
+        </w:rPr>
+        <w:t xml:space="preserve">unavailable</w:t>
+      </w:r>
+      <w:r>
+        <w:rPr>
+          <w:rFonts w:ascii="Arial" w:hAnsi="Arial" w:eastAsia="Arial Unicode MS" w:cs="Arial"/>
+          <w:lang w:val="zh-CN" w:eastAsia="zh-CN"/>
+        </w:rPr>
+        <w:t xml:space="preserve">。</w:t>
+      </w:r>
+    </w:p>
+    <w:bookmarkEnd w:id="63"/>
+    <w:bookmarkEnd w:id="64"/>
+    <w:bookmarkEnd w:id="65"/>
     <w:sectPr>
       <w:headerReference w:type="default" r:id="rId9"/>
       <w:footerReference w:type="default" r:id="rId10"/>
@@ -15100,7 +15995,7 @@
         <w:lang w:val="zh-CN" w:eastAsia="zh-CN"/>
       </w:rPr>
       <w:tab/>
-      <w:t>v1.0 · 2026-07-18</w:t>
+      <w:t>v1.0 · updated 2026-07-23</w:t>
     </w:r>
   </w:p>
 </w:hdr>
@@ -15845,6 +16740,9 @@
     <w:abstractNumId w:val="991"/>
   </w:num>
   <w:num w:numId="1016">
+    <w:abstractNumId w:val="991"/>
+  </w:num>
+  <w:num w:numId="1017">
     <w:abstractNumId w:val="99411"/>
     <w:lvlOverride w:ilvl="0">
       <w:startOverride w:val="1"/>
@@ -15874,7 +16772,7 @@
       <w:startOverride w:val="1"/>
     </w:lvlOverride>
   </w:num>
-  <w:num w:numId="1017">
+  <w:num w:numId="1018">
     <w:abstractNumId w:val="991"/>
   </w:num>
 </w:numbering>

</xml_diff>